<commit_message>
User guide: about the program in general, the waterfall file as the worked example
The cover and the general chapters no longer single out forecast
waterfalls: "only the newest versions" is described as a feature for any
workbook with a version column. A new chapter 7 walks through a synthetic
waterfall workbook end to end: what the converter does (header, cell
check, statistics, splitting, version column), excerpts of the real index
and data file, how the version column is recognised, and what to hand
Claude for different questions with measured token counts. PDF tables
now use the same column proportions as the .docx.

Co-Authored-By: Claude Opus 5.5 <noreply@anthropic.com>
Claude-Session: https://claude.ai/code/session_01KhQt6DAWzFQD8wwDFofesM
</commit_message>
<xml_diff>
--- a/docs/MarkItDown-Guide-zh-TW.docx
+++ b/docs/MarkItDown-Guide-zh-TW.docx
@@ -134,7 +134,7 @@
         <w:rPr>
           <w:rFonts w:ascii="Segoe UI" w:cs="Segoe UI" w:eastAsia="Microsoft JhengHei" w:hAnsi="Segoe UI"/>
         </w:rPr>
-        <w:t xml:space="preserve">3. 省 token 靠的是「少上傳」：先給索引，需要明細時 Claude 會告訴你要哪個檔；預測瀑布表按「只轉最新一版」。</w:t>
+        <w:t xml:space="preserve">3. 省 token 靠的是「少上傳」：先給索引，需要明細時 Claude 會告訴你要哪個檔。</w:t>
       </w:r>
     </w:p>
     <w:p>
@@ -298,7 +298,7 @@
         <w:rPr>
           <w:rFonts w:ascii="Segoe UI" w:cs="Segoe UI" w:eastAsia="Microsoft JhengHei" w:hAnsi="Segoe UI"/>
         </w:rPr>
-        <w:t xml:space="preserve">把大檔案「全部」上傳，花的 token 跟直接丟 Excel 差不多，因為數字本身就佔 token，換什麼格式都壓不小。真正省 token 的方法是「少上傳」：先給索引、只給需要的工作表、用關鍵字或「只轉最新一版」篩選。第 4 章有完整做法。</w:t>
+        <w:t xml:space="preserve">把大檔案「全部」上傳，花的 token 跟直接丟 Excel 差不多，因為數字本身就佔 token，換什麼格式都壓不小。真正省 token 的方法是「少上傳」：先給索引、只給需要的工作表、用關鍵字篩選，或只轉最新的版本。第 4 章有完整做法，第 7 章有一個從頭到尾的實際例子。</w:t>
       </w:r>
     </w:p>
     <w:p>
@@ -680,7 +680,7 @@
           <wp:inline distT="0" distB="0" distL="0" distR="0">
             <wp:extent cx="2667000" cy="4267200"/>
             <wp:effectExtent t="0" r="0" b="0" l="0"/>
-            <wp:docPr id="1" name="panel_results.png" descr="圖 2　轉換結果：上面是大檔案的索引卡片，下面是小檔案的卡片" title="圖 2　轉換結果：上面是大檔案的索引卡片，下面是小檔案的卡片"/>
+            <wp:docPr id="1" name="panel_results.png" descr="圖 2　轉換結果（範例檔）：上面是大檔案的索引卡片，下面是小檔案的卡片" title="圖 2　轉換結果（範例檔）：上面是大檔案的索引卡片，下面是小檔案的卡片"/>
             <wp:cNvGraphicFramePr>
               <a:graphicFrameLocks xmlns:a="http://schemas.openxmlformats.org/drawingml/2006/main" noChangeAspect="1"/>
             </wp:cNvGraphicFramePr>
@@ -728,7 +728,7 @@
           <w:sz w:val="18"/>
           <w:szCs w:val="18"/>
         </w:rPr>
-        <w:t xml:space="preserve">圖 2　轉換結果：上面是大檔案的索引卡片，下面是小檔案的卡片</w:t>
+        <w:t xml:space="preserve">圖 2　轉換結果（範例檔）：上面是大檔案的索引卡片，下面是小檔案的卡片</w:t>
       </w:r>
     </w:p>
     <w:p>
@@ -1316,7 +1316,7 @@
                 <w:sz w:val="20"/>
                 <w:szCs w:val="20"/>
               </w:rPr>
-              <w:t xml:space="preserve">預測瀑布表這類檔案才會出現（見 3.5）。按一下產生只有最新版本的小檔。</w:t>
+              <w:t xml:space="preserve">檔案有「版本欄」時才會出現（見 3.5）。按一下產生只有最新版本的小檔。</w:t>
             </w:r>
           </w:p>
         </w:tc>
@@ -1401,7 +1401,7 @@
         <w:rPr>
           <w:rFonts w:ascii="Segoe UI" w:cs="Segoe UI" w:eastAsia="Microsoft JhengHei" w:hAnsi="Segoe UI"/>
         </w:rPr>
-        <w:t xml:space="preserve">3.5 只轉最新一版（預測瀑布表）</w:t>
+        <w:t xml:space="preserve">3.5 只轉最新版本（有版本欄的檔案）</w:t>
       </w:r>
     </w:p>
     <w:p>
@@ -1412,7 +1412,7 @@
         <w:rPr>
           <w:rFonts w:ascii="Segoe UI" w:cs="Segoe UI" w:eastAsia="Microsoft JhengHei" w:hAnsi="Segoe UI"/>
         </w:rPr>
-        <w:t xml:space="preserve">有些 Excel 每週會累積一個新版本，例如預測瀑布表：同一個料號在每一版都有一列。程式會自動找出這種「版本欄」，在卡片上提供「只轉最新一版」、「只轉最新 2 版」的連結，並寫出大約多少 token。</w:t>
+        <w:t xml:space="preserve">有些 Excel 會一期一期累積資料，例如每週的預測快照、每月的庫存快照：同一個項目在每一期都有一列，並用一欄日期標示是哪一期。程式會自動找出這種「版本欄」。</w:t>
       </w:r>
     </w:p>
     <w:p>
@@ -1423,7 +1423,3179 @@
         <w:rPr>
           <w:rFonts w:ascii="Segoe UI" w:cs="Segoe UI" w:eastAsia="Microsoft JhengHei" w:hAnsi="Segoe UI"/>
         </w:rPr>
-        <w:t xml:space="preserve">按一下連結，就會另外產生一個小檔（檔名後面加「_最新1版」），原本的完整版不會被覆蓋。只想問「這週的預測」或「這週和上週差多少」時，用這個小檔就夠了。</w:t>
+        <w:t xml:space="preserve">如果檔案很大（全部超過約 3 萬 token），卡片上會出現「只轉最新一版」、「只轉最新 2 版」的連結，並寫出大約多少 token。按一下就會另外產生一個小檔（檔名後面加「_最新1版」），原本的完整版不會被覆蓋。只需要最新一期，或想比較最近兩期時，用這個小檔就夠了。</w:t>
+      </w:r>
+    </w:p>
+    <w:p>
+      <w:pPr>
+        <w:spacing w:after="120" w:line="300"/>
+      </w:pPr>
+      <w:r>
+        <w:rPr>
+          <w:rFonts w:ascii="Segoe UI" w:cs="Segoe UI" w:eastAsia="Microsoft JhengHei" w:hAnsi="Segoe UI"/>
+        </w:rPr>
+        <w:t xml:space="preserve">訂單日期、出貨日期這類每天筆數不一樣的日期欄，不會被當成版本欄；沒有版本欄的檔案也不會出現這兩個連結。實際例子請看第 7 章。</w:t>
+      </w:r>
+    </w:p>
+    <w:p>
+      <w:pPr>
+        <w:pStyle w:val="Heading2"/>
+        <w:spacing w:after="120" w:before="240"/>
+      </w:pPr>
+      <w:r>
+        <w:rPr>
+          <w:rFonts w:ascii="Segoe UI" w:cs="Segoe UI" w:eastAsia="Microsoft JhengHei" w:hAnsi="Segoe UI"/>
+        </w:rPr>
+        <w:t xml:space="preserve">3.6 面板底部</w:t>
+      </w:r>
+    </w:p>
+    <w:p>
+      <w:pPr>
+        <w:pStyle w:val="ListParagraph"/>
+        <w:numPr>
+          <w:ilvl w:val="0"/>
+          <w:numId w:val="2"/>
+        </w:numPr>
+        <w:spacing w:after="80" w:line="300"/>
+      </w:pPr>
+      <w:r>
+        <w:rPr>
+          <w:rFonts w:ascii="Segoe UI" w:cs="Segoe UI" w:eastAsia="Microsoft JhengHei" w:hAnsi="Segoe UI"/>
+          <w:b/>
+          <w:bCs/>
+        </w:rPr>
+        <w:t xml:space="preserve">設定說明</w:t>
+      </w:r>
+      <w:r>
+        <w:rPr>
+          <w:rFonts w:ascii="Segoe UI" w:cs="Segoe UI" w:eastAsia="Microsoft JhengHei" w:hAnsi="Segoe UI"/>
+        </w:rPr>
+        <w:t xml:space="preserve">：目前的 Excel 輸出方式和儲存位置。</w:t>
+      </w:r>
+    </w:p>
+    <w:p>
+      <w:pPr>
+        <w:pStyle w:val="ListParagraph"/>
+        <w:numPr>
+          <w:ilvl w:val="0"/>
+          <w:numId w:val="2"/>
+        </w:numPr>
+        <w:spacing w:after="80" w:line="300"/>
+      </w:pPr>
+      <w:r>
+        <w:rPr>
+          <w:rFonts w:ascii="Segoe UI" w:cs="Segoe UI" w:eastAsia="Microsoft JhengHei" w:hAnsi="Segoe UI"/>
+          <w:b/>
+          <w:bCs/>
+        </w:rPr>
+        <w:t xml:space="preserve">浮在其他視窗上方</w:t>
+      </w:r>
+      <w:r>
+        <w:rPr>
+          <w:rFonts w:ascii="Segoe UI" w:cs="Segoe UI" w:eastAsia="Microsoft JhengHei" w:hAnsi="Segoe UI"/>
+        </w:rPr>
+        <w:t xml:space="preserve">：預設開啟，方便把卡片拖到 Claude；不需要時可以關掉。</w:t>
+      </w:r>
+    </w:p>
+    <w:p>
+      <w:pPr>
+        <w:pStyle w:val="ListParagraph"/>
+        <w:numPr>
+          <w:ilvl w:val="0"/>
+          <w:numId w:val="2"/>
+        </w:numPr>
+        <w:spacing w:after="80" w:line="300"/>
+      </w:pPr>
+      <w:r>
+        <w:rPr>
+          <w:rFonts w:ascii="Segoe UI" w:cs="Segoe UI" w:eastAsia="Microsoft JhengHei" w:hAnsi="Segoe UI"/>
+          <w:b/>
+          <w:bCs/>
+        </w:rPr>
+        <w:t xml:space="preserve">更多</w:t>
+      </w:r>
+      <w:r>
+        <w:rPr>
+          <w:rFonts w:ascii="Segoe UI" w:cs="Segoe UI" w:eastAsia="Microsoft JhengHei" w:hAnsi="Segoe UI"/>
+        </w:rPr>
+        <w:t xml:space="preserve">：「轉換選項…」會打開主視窗調整選項；「複製 Claude 專案指示」見第 5 章。</w:t>
+      </w:r>
+    </w:p>
+    <w:p>
+      <w:pPr>
+        <w:pStyle w:val="Heading1"/>
+        <w:spacing w:after="160" w:before="360"/>
+      </w:pPr>
+      <w:r>
+        <w:rPr>
+          <w:rFonts w:ascii="Segoe UI" w:cs="Segoe UI" w:eastAsia="Microsoft JhengHei" w:hAnsi="Segoe UI"/>
+        </w:rPr>
+        <w:t xml:space="preserve">4. 怎麼上傳給 Claude 最省 token</w:t>
+      </w:r>
+    </w:p>
+    <w:tbl>
+      <w:tblPr>
+        <w:tblW w:type="dxa" w:w="9026"/>
+        <w:tblBorders>
+          <w:top w:val="single" w:color="auto" w:sz="4"/>
+          <w:left w:val="single" w:color="auto" w:sz="4"/>
+          <w:bottom w:val="single" w:color="auto" w:sz="4"/>
+          <w:right w:val="single" w:color="auto" w:sz="4"/>
+          <w:insideH w:val="single" w:color="auto" w:sz="4"/>
+          <w:insideV w:val="single" w:color="auto" w:sz="4"/>
+        </w:tblBorders>
+      </w:tblPr>
+      <w:tblGrid>
+        <w:gridCol w:w="3000"/>
+        <w:gridCol w:w="3626"/>
+        <w:gridCol w:w="2400"/>
+      </w:tblGrid>
+      <w:tr>
+        <w:trPr>
+          <w:cantSplit/>
+          <w:tblHeader/>
+        </w:trPr>
+        <w:tc>
+          <w:tcPr>
+            <w:tcW w:type="dxa" w:w="3000"/>
+            <w:tcBorders>
+              <w:top w:val="single" w:color="D0D0D0" w:sz="4"/>
+              <w:left w:val="single" w:color="D0D0D0" w:sz="4"/>
+              <w:bottom w:val="single" w:color="D0D0D0" w:sz="4"/>
+              <w:right w:val="single" w:color="D0D0D0" w:sz="4"/>
+            </w:tcBorders>
+            <w:shd w:fill="EEF3F9" w:color="auto" w:val="clear"/>
+            <w:tcMar>
+              <w:top w:type="dxa" w:w="80"/>
+              <w:left w:type="dxa" w:w="120"/>
+              <w:bottom w:type="dxa" w:w="80"/>
+              <w:right w:type="dxa" w:w="120"/>
+            </w:tcMar>
+          </w:tcPr>
+          <w:p>
+            <w:pPr>
+              <w:spacing w:after="0" w:line="280"/>
+            </w:pPr>
+            <w:r>
+              <w:rPr>
+                <w:rFonts w:ascii="Segoe UI" w:cs="Segoe UI" w:eastAsia="Microsoft JhengHei" w:hAnsi="Segoe UI"/>
+                <w:b/>
+                <w:bCs/>
+                <w:sz w:val="20"/>
+                <w:szCs w:val="20"/>
+              </w:rPr>
+              <w:t xml:space="preserve">你的狀況</w:t>
+            </w:r>
+          </w:p>
+        </w:tc>
+        <w:tc>
+          <w:tcPr>
+            <w:tcW w:type="dxa" w:w="3626"/>
+            <w:tcBorders>
+              <w:top w:val="single" w:color="D0D0D0" w:sz="4"/>
+              <w:left w:val="single" w:color="D0D0D0" w:sz="4"/>
+              <w:bottom w:val="single" w:color="D0D0D0" w:sz="4"/>
+              <w:right w:val="single" w:color="D0D0D0" w:sz="4"/>
+            </w:tcBorders>
+            <w:shd w:fill="EEF3F9" w:color="auto" w:val="clear"/>
+            <w:tcMar>
+              <w:top w:type="dxa" w:w="80"/>
+              <w:left w:type="dxa" w:w="120"/>
+              <w:bottom w:type="dxa" w:w="80"/>
+              <w:right w:type="dxa" w:w="120"/>
+            </w:tcMar>
+          </w:tcPr>
+          <w:p>
+            <w:pPr>
+              <w:spacing w:after="0" w:line="280"/>
+            </w:pPr>
+            <w:r>
+              <w:rPr>
+                <w:rFonts w:ascii="Segoe UI" w:cs="Segoe UI" w:eastAsia="Microsoft JhengHei" w:hAnsi="Segoe UI"/>
+                <w:b/>
+                <w:bCs/>
+                <w:sz w:val="20"/>
+                <w:szCs w:val="20"/>
+              </w:rPr>
+              <w:t xml:space="preserve">怎麼做</w:t>
+            </w:r>
+          </w:p>
+        </w:tc>
+        <w:tc>
+          <w:tcPr>
+            <w:tcW w:type="dxa" w:w="2400"/>
+            <w:tcBorders>
+              <w:top w:val="single" w:color="D0D0D0" w:sz="4"/>
+              <w:left w:val="single" w:color="D0D0D0" w:sz="4"/>
+              <w:bottom w:val="single" w:color="D0D0D0" w:sz="4"/>
+              <w:right w:val="single" w:color="D0D0D0" w:sz="4"/>
+            </w:tcBorders>
+            <w:shd w:fill="EEF3F9" w:color="auto" w:val="clear"/>
+            <w:tcMar>
+              <w:top w:type="dxa" w:w="80"/>
+              <w:left w:type="dxa" w:w="120"/>
+              <w:bottom w:type="dxa" w:w="80"/>
+              <w:right w:type="dxa" w:w="120"/>
+            </w:tcMar>
+          </w:tcPr>
+          <w:p>
+            <w:pPr>
+              <w:spacing w:after="0" w:line="280"/>
+            </w:pPr>
+            <w:r>
+              <w:rPr>
+                <w:rFonts w:ascii="Segoe UI" w:cs="Segoe UI" w:eastAsia="Microsoft JhengHei" w:hAnsi="Segoe UI"/>
+                <w:b/>
+                <w:bCs/>
+                <w:sz w:val="20"/>
+                <w:szCs w:val="20"/>
+              </w:rPr>
+              <w:t xml:space="preserve">大約上傳量</w:t>
+            </w:r>
+          </w:p>
+        </w:tc>
+      </w:tr>
+      <w:tr>
+        <w:trPr>
+          <w:cantSplit/>
+          <w:tblHeader w:val="false"/>
+        </w:trPr>
+        <w:tc>
+          <w:tcPr>
+            <w:tcW w:type="dxa" w:w="3000"/>
+            <w:tcBorders>
+              <w:top w:val="single" w:color="D0D0D0" w:sz="4"/>
+              <w:left w:val="single" w:color="D0D0D0" w:sz="4"/>
+              <w:bottom w:val="single" w:color="D0D0D0" w:sz="4"/>
+              <w:right w:val="single" w:color="D0D0D0" w:sz="4"/>
+            </w:tcBorders>
+            <w:tcMar>
+              <w:top w:type="dxa" w:w="80"/>
+              <w:left w:type="dxa" w:w="120"/>
+              <w:bottom w:type="dxa" w:w="80"/>
+              <w:right w:type="dxa" w:w="120"/>
+            </w:tcMar>
+          </w:tcPr>
+          <w:p>
+            <w:pPr>
+              <w:spacing w:after="0" w:line="280"/>
+            </w:pPr>
+            <w:r>
+              <w:rPr>
+                <w:rFonts w:ascii="Segoe UI" w:cs="Segoe UI" w:eastAsia="Microsoft JhengHei" w:hAnsi="Segoe UI"/>
+                <w:b w:val="false"/>
+                <w:bCs w:val="false"/>
+                <w:sz w:val="20"/>
+                <w:szCs w:val="20"/>
+              </w:rPr>
+              <w:t xml:space="preserve">小檔案（卡片上沒有「先拖這張就好」）</w:t>
+            </w:r>
+          </w:p>
+        </w:tc>
+        <w:tc>
+          <w:tcPr>
+            <w:tcW w:type="dxa" w:w="3626"/>
+            <w:tcBorders>
+              <w:top w:val="single" w:color="D0D0D0" w:sz="4"/>
+              <w:left w:val="single" w:color="D0D0D0" w:sz="4"/>
+              <w:bottom w:val="single" w:color="D0D0D0" w:sz="4"/>
+              <w:right w:val="single" w:color="D0D0D0" w:sz="4"/>
+            </w:tcBorders>
+            <w:tcMar>
+              <w:top w:type="dxa" w:w="80"/>
+              <w:left w:type="dxa" w:w="120"/>
+              <w:bottom w:type="dxa" w:w="80"/>
+              <w:right w:type="dxa" w:w="120"/>
+            </w:tcMar>
+          </w:tcPr>
+          <w:p>
+            <w:pPr>
+              <w:spacing w:after="0" w:line="280"/>
+            </w:pPr>
+            <w:r>
+              <w:rPr>
+                <w:rFonts w:ascii="Segoe UI" w:cs="Segoe UI" w:eastAsia="Microsoft JhengHei" w:hAnsi="Segoe UI"/>
+                <w:b w:val="false"/>
+                <w:bCs w:val="false"/>
+                <w:sz w:val="20"/>
+                <w:szCs w:val="20"/>
+              </w:rPr>
+              <w:t xml:space="preserve">直接拖卡片進 Claude</w:t>
+            </w:r>
+          </w:p>
+        </w:tc>
+        <w:tc>
+          <w:tcPr>
+            <w:tcW w:type="dxa" w:w="2400"/>
+            <w:tcBorders>
+              <w:top w:val="single" w:color="D0D0D0" w:sz="4"/>
+              <w:left w:val="single" w:color="D0D0D0" w:sz="4"/>
+              <w:bottom w:val="single" w:color="D0D0D0" w:sz="4"/>
+              <w:right w:val="single" w:color="D0D0D0" w:sz="4"/>
+            </w:tcBorders>
+            <w:tcMar>
+              <w:top w:type="dxa" w:w="80"/>
+              <w:left w:type="dxa" w:w="120"/>
+              <w:bottom w:type="dxa" w:w="80"/>
+              <w:right w:type="dxa" w:w="120"/>
+            </w:tcMar>
+          </w:tcPr>
+          <w:p>
+            <w:pPr>
+              <w:spacing w:after="0" w:line="280"/>
+            </w:pPr>
+            <w:r>
+              <w:rPr>
+                <w:rFonts w:ascii="Segoe UI" w:cs="Segoe UI" w:eastAsia="Microsoft JhengHei" w:hAnsi="Segoe UI"/>
+                <w:b w:val="false"/>
+                <w:bCs w:val="false"/>
+                <w:sz w:val="20"/>
+                <w:szCs w:val="20"/>
+              </w:rPr>
+              <w:t xml:space="preserve">就是卡片上的 token 數</w:t>
+            </w:r>
+          </w:p>
+        </w:tc>
+      </w:tr>
+      <w:tr>
+        <w:trPr>
+          <w:cantSplit/>
+          <w:tblHeader w:val="false"/>
+        </w:trPr>
+        <w:tc>
+          <w:tcPr>
+            <w:tcW w:type="dxa" w:w="3000"/>
+            <w:tcBorders>
+              <w:top w:val="single" w:color="D0D0D0" w:sz="4"/>
+              <w:left w:val="single" w:color="D0D0D0" w:sz="4"/>
+              <w:bottom w:val="single" w:color="D0D0D0" w:sz="4"/>
+              <w:right w:val="single" w:color="D0D0D0" w:sz="4"/>
+            </w:tcBorders>
+            <w:tcMar>
+              <w:top w:type="dxa" w:w="80"/>
+              <w:left w:type="dxa" w:w="120"/>
+              <w:bottom w:type="dxa" w:w="80"/>
+              <w:right w:type="dxa" w:w="120"/>
+            </w:tcMar>
+          </w:tcPr>
+          <w:p>
+            <w:pPr>
+              <w:spacing w:after="0" w:line="280"/>
+            </w:pPr>
+            <w:r>
+              <w:rPr>
+                <w:rFonts w:ascii="Segoe UI" w:cs="Segoe UI" w:eastAsia="Microsoft JhengHei" w:hAnsi="Segoe UI"/>
+                <w:b w:val="false"/>
+                <w:bCs w:val="false"/>
+                <w:sz w:val="20"/>
+                <w:szCs w:val="20"/>
+              </w:rPr>
+              <w:t xml:space="preserve">大檔案，問整體狀況、合計、有哪些欄位</w:t>
+            </w:r>
+          </w:p>
+        </w:tc>
+        <w:tc>
+          <w:tcPr>
+            <w:tcW w:type="dxa" w:w="3626"/>
+            <w:tcBorders>
+              <w:top w:val="single" w:color="D0D0D0" w:sz="4"/>
+              <w:left w:val="single" w:color="D0D0D0" w:sz="4"/>
+              <w:bottom w:val="single" w:color="D0D0D0" w:sz="4"/>
+              <w:right w:val="single" w:color="D0D0D0" w:sz="4"/>
+            </w:tcBorders>
+            <w:tcMar>
+              <w:top w:type="dxa" w:w="80"/>
+              <w:left w:type="dxa" w:w="120"/>
+              <w:bottom w:type="dxa" w:w="80"/>
+              <w:right w:type="dxa" w:w="120"/>
+            </w:tcMar>
+          </w:tcPr>
+          <w:p>
+            <w:pPr>
+              <w:spacing w:after="0" w:line="280"/>
+            </w:pPr>
+            <w:r>
+              <w:rPr>
+                <w:rFonts w:ascii="Segoe UI" w:cs="Segoe UI" w:eastAsia="Microsoft JhengHei" w:hAnsi="Segoe UI"/>
+                <w:b w:val="false"/>
+                <w:bCs w:val="false"/>
+                <w:sz w:val="20"/>
+                <w:szCs w:val="20"/>
+              </w:rPr>
+              <w:t xml:space="preserve">只拖索引卡片</w:t>
+            </w:r>
+          </w:p>
+        </w:tc>
+        <w:tc>
+          <w:tcPr>
+            <w:tcW w:type="dxa" w:w="2400"/>
+            <w:tcBorders>
+              <w:top w:val="single" w:color="D0D0D0" w:sz="4"/>
+              <w:left w:val="single" w:color="D0D0D0" w:sz="4"/>
+              <w:bottom w:val="single" w:color="D0D0D0" w:sz="4"/>
+              <w:right w:val="single" w:color="D0D0D0" w:sz="4"/>
+            </w:tcBorders>
+            <w:tcMar>
+              <w:top w:type="dxa" w:w="80"/>
+              <w:left w:type="dxa" w:w="120"/>
+              <w:bottom w:type="dxa" w:w="80"/>
+              <w:right w:type="dxa" w:w="120"/>
+            </w:tcMar>
+          </w:tcPr>
+          <w:p>
+            <w:pPr>
+              <w:spacing w:after="0" w:line="280"/>
+            </w:pPr>
+            <w:r>
+              <w:rPr>
+                <w:rFonts w:ascii="Segoe UI" w:cs="Segoe UI" w:eastAsia="Microsoft JhengHei" w:hAnsi="Segoe UI"/>
+                <w:b w:val="false"/>
+                <w:bCs w:val="false"/>
+                <w:sz w:val="20"/>
+                <w:szCs w:val="20"/>
+              </w:rPr>
+              <w:t xml:space="preserve">幾千 token</w:t>
+            </w:r>
+          </w:p>
+        </w:tc>
+      </w:tr>
+      <w:tr>
+        <w:trPr>
+          <w:cantSplit/>
+          <w:tblHeader w:val="false"/>
+        </w:trPr>
+        <w:tc>
+          <w:tcPr>
+            <w:tcW w:type="dxa" w:w="3000"/>
+            <w:tcBorders>
+              <w:top w:val="single" w:color="D0D0D0" w:sz="4"/>
+              <w:left w:val="single" w:color="D0D0D0" w:sz="4"/>
+              <w:bottom w:val="single" w:color="D0D0D0" w:sz="4"/>
+              <w:right w:val="single" w:color="D0D0D0" w:sz="4"/>
+            </w:tcBorders>
+            <w:tcMar>
+              <w:top w:type="dxa" w:w="80"/>
+              <w:left w:type="dxa" w:w="120"/>
+              <w:bottom w:type="dxa" w:w="80"/>
+              <w:right w:type="dxa" w:w="120"/>
+            </w:tcMar>
+          </w:tcPr>
+          <w:p>
+            <w:pPr>
+              <w:spacing w:after="0" w:line="280"/>
+            </w:pPr>
+            <w:r>
+              <w:rPr>
+                <w:rFonts w:ascii="Segoe UI" w:cs="Segoe UI" w:eastAsia="Microsoft JhengHei" w:hAnsi="Segoe UI"/>
+                <w:b w:val="false"/>
+                <w:bCs w:val="false"/>
+                <w:sz w:val="20"/>
+                <w:szCs w:val="20"/>
+              </w:rPr>
+              <w:t xml:space="preserve">大檔案，需要某張工作表的明細</w:t>
+            </w:r>
+          </w:p>
+        </w:tc>
+        <w:tc>
+          <w:tcPr>
+            <w:tcW w:type="dxa" w:w="3626"/>
+            <w:tcBorders>
+              <w:top w:val="single" w:color="D0D0D0" w:sz="4"/>
+              <w:left w:val="single" w:color="D0D0D0" w:sz="4"/>
+              <w:bottom w:val="single" w:color="D0D0D0" w:sz="4"/>
+              <w:right w:val="single" w:color="D0D0D0" w:sz="4"/>
+            </w:tcBorders>
+            <w:tcMar>
+              <w:top w:type="dxa" w:w="80"/>
+              <w:left w:type="dxa" w:w="120"/>
+              <w:bottom w:type="dxa" w:w="80"/>
+              <w:right w:type="dxa" w:w="120"/>
+            </w:tcMar>
+          </w:tcPr>
+          <w:p>
+            <w:pPr>
+              <w:spacing w:after="0" w:line="280"/>
+            </w:pPr>
+            <w:r>
+              <w:rPr>
+                <w:rFonts w:ascii="Segoe UI" w:cs="Segoe UI" w:eastAsia="Microsoft JhengHei" w:hAnsi="Segoe UI"/>
+                <w:b w:val="false"/>
+                <w:bCs w:val="false"/>
+                <w:sz w:val="20"/>
+                <w:szCs w:val="20"/>
+              </w:rPr>
+              <w:t xml:space="preserve">先給索引；Claude 說要哪個檔，再從 _md 資料夾上傳那一個</w:t>
+            </w:r>
+          </w:p>
+        </w:tc>
+        <w:tc>
+          <w:tcPr>
+            <w:tcW w:type="dxa" w:w="2400"/>
+            <w:tcBorders>
+              <w:top w:val="single" w:color="D0D0D0" w:sz="4"/>
+              <w:left w:val="single" w:color="D0D0D0" w:sz="4"/>
+              <w:bottom w:val="single" w:color="D0D0D0" w:sz="4"/>
+              <w:right w:val="single" w:color="D0D0D0" w:sz="4"/>
+            </w:tcBorders>
+            <w:tcMar>
+              <w:top w:type="dxa" w:w="80"/>
+              <w:left w:type="dxa" w:w="120"/>
+              <w:bottom w:type="dxa" w:w="80"/>
+              <w:right w:type="dxa" w:w="120"/>
+            </w:tcMar>
+          </w:tcPr>
+          <w:p>
+            <w:pPr>
+              <w:spacing w:after="0" w:line="280"/>
+            </w:pPr>
+            <w:r>
+              <w:rPr>
+                <w:rFonts w:ascii="Segoe UI" w:cs="Segoe UI" w:eastAsia="Microsoft JhengHei" w:hAnsi="Segoe UI"/>
+                <w:b w:val="false"/>
+                <w:bCs w:val="false"/>
+                <w:sz w:val="20"/>
+                <w:szCs w:val="20"/>
+              </w:rPr>
+              <w:t xml:space="preserve">每個資料檔最多約 10 萬</w:t>
+            </w:r>
+          </w:p>
+        </w:tc>
+      </w:tr>
+      <w:tr>
+        <w:trPr>
+          <w:cantSplit/>
+          <w:tblHeader w:val="false"/>
+        </w:trPr>
+        <w:tc>
+          <w:tcPr>
+            <w:tcW w:type="dxa" w:w="3000"/>
+            <w:tcBorders>
+              <w:top w:val="single" w:color="D0D0D0" w:sz="4"/>
+              <w:left w:val="single" w:color="D0D0D0" w:sz="4"/>
+              <w:bottom w:val="single" w:color="D0D0D0" w:sz="4"/>
+              <w:right w:val="single" w:color="D0D0D0" w:sz="4"/>
+            </w:tcBorders>
+            <w:tcMar>
+              <w:top w:type="dxa" w:w="80"/>
+              <w:left w:type="dxa" w:w="120"/>
+              <w:bottom w:type="dxa" w:w="80"/>
+              <w:right w:type="dxa" w:w="120"/>
+            </w:tcMar>
+          </w:tcPr>
+          <w:p>
+            <w:pPr>
+              <w:spacing w:after="0" w:line="280"/>
+            </w:pPr>
+            <w:r>
+              <w:rPr>
+                <w:rFonts w:ascii="Segoe UI" w:cs="Segoe UI" w:eastAsia="Microsoft JhengHei" w:hAnsi="Segoe UI"/>
+                <w:b w:val="false"/>
+                <w:bCs w:val="false"/>
+                <w:sz w:val="20"/>
+                <w:szCs w:val="20"/>
+              </w:rPr>
+              <w:t xml:space="preserve">檔案有版本欄，只需要最新一期或最近兩期</w:t>
+            </w:r>
+          </w:p>
+        </w:tc>
+        <w:tc>
+          <w:tcPr>
+            <w:tcW w:type="dxa" w:w="3626"/>
+            <w:tcBorders>
+              <w:top w:val="single" w:color="D0D0D0" w:sz="4"/>
+              <w:left w:val="single" w:color="D0D0D0" w:sz="4"/>
+              <w:bottom w:val="single" w:color="D0D0D0" w:sz="4"/>
+              <w:right w:val="single" w:color="D0D0D0" w:sz="4"/>
+            </w:tcBorders>
+            <w:tcMar>
+              <w:top w:type="dxa" w:w="80"/>
+              <w:left w:type="dxa" w:w="120"/>
+              <w:bottom w:type="dxa" w:w="80"/>
+              <w:right w:type="dxa" w:w="120"/>
+            </w:tcMar>
+          </w:tcPr>
+          <w:p>
+            <w:pPr>
+              <w:spacing w:after="0" w:line="280"/>
+            </w:pPr>
+            <w:r>
+              <w:rPr>
+                <w:rFonts w:ascii="Segoe UI" w:cs="Segoe UI" w:eastAsia="Microsoft JhengHei" w:hAnsi="Segoe UI"/>
+                <w:b w:val="false"/>
+                <w:bCs w:val="false"/>
+                <w:sz w:val="20"/>
+                <w:szCs w:val="20"/>
+              </w:rPr>
+              <w:t xml:space="preserve">按卡片上的「只轉最新一版」或「只轉最新 2 版」</w:t>
+            </w:r>
+          </w:p>
+        </w:tc>
+        <w:tc>
+          <w:tcPr>
+            <w:tcW w:type="dxa" w:w="2400"/>
+            <w:tcBorders>
+              <w:top w:val="single" w:color="D0D0D0" w:sz="4"/>
+              <w:left w:val="single" w:color="D0D0D0" w:sz="4"/>
+              <w:bottom w:val="single" w:color="D0D0D0" w:sz="4"/>
+              <w:right w:val="single" w:color="D0D0D0" w:sz="4"/>
+            </w:tcBorders>
+            <w:tcMar>
+              <w:top w:type="dxa" w:w="80"/>
+              <w:left w:type="dxa" w:w="120"/>
+              <w:bottom w:type="dxa" w:w="80"/>
+              <w:right w:type="dxa" w:w="120"/>
+            </w:tcMar>
+          </w:tcPr>
+          <w:p>
+            <w:pPr>
+              <w:spacing w:after="0" w:line="280"/>
+            </w:pPr>
+            <w:r>
+              <w:rPr>
+                <w:rFonts w:ascii="Segoe UI" w:cs="Segoe UI" w:eastAsia="Microsoft JhengHei" w:hAnsi="Segoe UI"/>
+                <w:b w:val="false"/>
+                <w:bCs w:val="false"/>
+                <w:sz w:val="20"/>
+                <w:szCs w:val="20"/>
+              </w:rPr>
+              <w:t xml:space="preserve">只剩最近幾期的量</w:t>
+            </w:r>
+          </w:p>
+        </w:tc>
+      </w:tr>
+      <w:tr>
+        <w:trPr>
+          <w:cantSplit/>
+          <w:tblHeader w:val="false"/>
+        </w:trPr>
+        <w:tc>
+          <w:tcPr>
+            <w:tcW w:type="dxa" w:w="3000"/>
+            <w:tcBorders>
+              <w:top w:val="single" w:color="D0D0D0" w:sz="4"/>
+              <w:left w:val="single" w:color="D0D0D0" w:sz="4"/>
+              <w:bottom w:val="single" w:color="D0D0D0" w:sz="4"/>
+              <w:right w:val="single" w:color="D0D0D0" w:sz="4"/>
+            </w:tcBorders>
+            <w:tcMar>
+              <w:top w:type="dxa" w:w="80"/>
+              <w:left w:type="dxa" w:w="120"/>
+              <w:bottom w:type="dxa" w:w="80"/>
+              <w:right w:type="dxa" w:w="120"/>
+            </w:tcMar>
+          </w:tcPr>
+          <w:p>
+            <w:pPr>
+              <w:spacing w:after="0" w:line="280"/>
+            </w:pPr>
+            <w:r>
+              <w:rPr>
+                <w:rFonts w:ascii="Segoe UI" w:cs="Segoe UI" w:eastAsia="Microsoft JhengHei" w:hAnsi="Segoe UI"/>
+                <w:b w:val="false"/>
+                <w:bCs w:val="false"/>
+                <w:sz w:val="20"/>
+                <w:szCs w:val="20"/>
+              </w:rPr>
+              <w:t xml:space="preserve">只問某個料號或客戶</w:t>
+            </w:r>
+          </w:p>
+        </w:tc>
+        <w:tc>
+          <w:tcPr>
+            <w:tcW w:type="dxa" w:w="3626"/>
+            <w:tcBorders>
+              <w:top w:val="single" w:color="D0D0D0" w:sz="4"/>
+              <w:left w:val="single" w:color="D0D0D0" w:sz="4"/>
+              <w:bottom w:val="single" w:color="D0D0D0" w:sz="4"/>
+              <w:right w:val="single" w:color="D0D0D0" w:sz="4"/>
+            </w:tcBorders>
+            <w:tcMar>
+              <w:top w:type="dxa" w:w="80"/>
+              <w:left w:type="dxa" w:w="120"/>
+              <w:bottom w:type="dxa" w:w="80"/>
+              <w:right w:type="dxa" w:w="120"/>
+            </w:tcMar>
+          </w:tcPr>
+          <w:p>
+            <w:pPr>
+              <w:spacing w:after="0" w:line="280"/>
+            </w:pPr>
+            <w:r>
+              <w:rPr>
+                <w:rFonts w:ascii="Segoe UI" w:cs="Segoe UI" w:eastAsia="Microsoft JhengHei" w:hAnsi="Segoe UI"/>
+                <w:b w:val="false"/>
+                <w:bCs w:val="false"/>
+                <w:sz w:val="20"/>
+                <w:szCs w:val="20"/>
+              </w:rPr>
+              <w:t xml:space="preserve">在「轉換選項…」設定關鍵字篩選後重新轉</w:t>
+            </w:r>
+          </w:p>
+        </w:tc>
+        <w:tc>
+          <w:tcPr>
+            <w:tcW w:type="dxa" w:w="2400"/>
+            <w:tcBorders>
+              <w:top w:val="single" w:color="D0D0D0" w:sz="4"/>
+              <w:left w:val="single" w:color="D0D0D0" w:sz="4"/>
+              <w:bottom w:val="single" w:color="D0D0D0" w:sz="4"/>
+              <w:right w:val="single" w:color="D0D0D0" w:sz="4"/>
+            </w:tcBorders>
+            <w:tcMar>
+              <w:top w:type="dxa" w:w="80"/>
+              <w:left w:type="dxa" w:w="120"/>
+              <w:bottom w:type="dxa" w:w="80"/>
+              <w:right w:type="dxa" w:w="120"/>
+            </w:tcMar>
+          </w:tcPr>
+          <w:p>
+            <w:pPr>
+              <w:spacing w:after="0" w:line="280"/>
+            </w:pPr>
+            <w:r>
+              <w:rPr>
+                <w:rFonts w:ascii="Segoe UI" w:cs="Segoe UI" w:eastAsia="Microsoft JhengHei" w:hAnsi="Segoe UI"/>
+                <w:b w:val="false"/>
+                <w:bCs w:val="false"/>
+                <w:sz w:val="20"/>
+                <w:szCs w:val="20"/>
+              </w:rPr>
+              <w:t xml:space="preserve">通常幾千到幾萬</w:t>
+            </w:r>
+          </w:p>
+        </w:tc>
+      </w:tr>
+    </w:tbl>
+    <w:p>
+      <w:pPr>
+        <w:spacing w:after="160"/>
+      </w:pPr>
+      <w:r>
+        <w:rPr>
+          <w:rFonts w:ascii="Segoe UI" w:cs="Segoe UI" w:eastAsia="Microsoft JhengHei" w:hAnsi="Segoe UI"/>
+        </w:rPr>
+        <w:t xml:space="preserve"/>
+      </w:r>
+    </w:p>
+    <w:p>
+      <w:pPr>
+        <w:spacing w:after="120" w:line="300"/>
+      </w:pPr>
+      <w:r>
+        <w:rPr>
+          <w:rFonts w:ascii="Segoe UI" w:cs="Segoe UI" w:eastAsia="Microsoft JhengHei" w:hAnsi="Segoe UI"/>
+          <w:b/>
+          <w:bCs/>
+        </w:rPr>
+        <w:t xml:space="preserve">五個原則</w:t>
+      </w:r>
+    </w:p>
+    <w:p>
+      <w:pPr>
+        <w:pStyle w:val="ListParagraph"/>
+        <w:numPr>
+          <w:ilvl w:val="0"/>
+          <w:numId w:val="4"/>
+        </w:numPr>
+        <w:spacing w:after="80" w:line="300"/>
+      </w:pPr>
+      <w:r>
+        <w:rPr>
+          <w:rFonts w:ascii="Segoe UI" w:cs="Segoe UI" w:eastAsia="Microsoft JhengHei" w:hAnsi="Segoe UI"/>
+          <w:b/>
+          <w:bCs/>
+        </w:rPr>
+        <w:t xml:space="preserve">不要把整個資料夾打包上傳。</w:t>
+      </w:r>
+      <w:r>
+        <w:rPr>
+          <w:rFonts w:ascii="Segoe UI" w:cs="Segoe UI" w:eastAsia="Microsoft JhengHei" w:hAnsi="Segoe UI"/>
+        </w:rPr>
+        <w:t xml:space="preserve">這樣花的 token 跟直接丟 Excel 差不多。</w:t>
+      </w:r>
+    </w:p>
+    <w:p>
+      <w:pPr>
+        <w:pStyle w:val="ListParagraph"/>
+        <w:numPr>
+          <w:ilvl w:val="0"/>
+          <w:numId w:val="4"/>
+        </w:numPr>
+        <w:spacing w:after="80" w:line="300"/>
+      </w:pPr>
+      <w:r>
+        <w:rPr>
+          <w:rFonts w:ascii="Segoe UI" w:cs="Segoe UI" w:eastAsia="Microsoft JhengHei" w:hAnsi="Segoe UI"/>
+          <w:b/>
+          <w:bCs/>
+        </w:rPr>
+        <w:t xml:space="preserve">不要叫 Claude「全部讀完再回答」。</w:t>
+      </w:r>
+      <w:r>
+        <w:rPr>
+          <w:rFonts w:ascii="Segoe UI" w:cs="Segoe UI" w:eastAsia="Microsoft JhengHei" w:hAnsi="Segoe UI"/>
+        </w:rPr>
+        <w:t xml:space="preserve">請它先看索引。</w:t>
+      </w:r>
+    </w:p>
+    <w:p>
+      <w:pPr>
+        <w:pStyle w:val="ListParagraph"/>
+        <w:numPr>
+          <w:ilvl w:val="0"/>
+          <w:numId w:val="4"/>
+        </w:numPr>
+        <w:spacing w:after="80" w:line="300"/>
+      </w:pPr>
+      <w:r>
+        <w:rPr>
+          <w:rFonts w:ascii="Segoe UI" w:cs="Segoe UI" w:eastAsia="Microsoft JhengHei" w:hAnsi="Segoe UI"/>
+          <w:b/>
+          <w:bCs/>
+        </w:rPr>
+        <w:t xml:space="preserve">先給索引，需要時再補檔。</w:t>
+      </w:r>
+      <w:r>
+        <w:rPr>
+          <w:rFonts w:ascii="Segoe UI" w:cs="Segoe UI" w:eastAsia="Microsoft JhengHei" w:hAnsi="Segoe UI"/>
+        </w:rPr>
+        <w:t xml:space="preserve">索引最後的「資料檔」表列出每個檔大約多少 token。</w:t>
+      </w:r>
+    </w:p>
+    <w:p>
+      <w:pPr>
+        <w:pStyle w:val="ListParagraph"/>
+        <w:numPr>
+          <w:ilvl w:val="0"/>
+          <w:numId w:val="4"/>
+        </w:numPr>
+        <w:spacing w:after="80" w:line="300"/>
+      </w:pPr>
+      <w:r>
+        <w:rPr>
+          <w:rFonts w:ascii="Segoe UI" w:cs="Segoe UI" w:eastAsia="Microsoft JhengHei" w:hAnsi="Segoe UI"/>
+          <w:b/>
+          <w:bCs/>
+        </w:rPr>
+        <w:t xml:space="preserve">能篩選就先篩選。</w:t>
+      </w:r>
+      <w:r>
+        <w:rPr>
+          <w:rFonts w:ascii="Segoe UI" w:cs="Segoe UI" w:eastAsia="Microsoft JhengHei" w:hAnsi="Segoe UI"/>
+        </w:rPr>
+        <w:t xml:space="preserve">只轉最新版本、只保留含關鍵字的列。</w:t>
+      </w:r>
+    </w:p>
+    <w:p>
+      <w:pPr>
+        <w:pStyle w:val="ListParagraph"/>
+        <w:numPr>
+          <w:ilvl w:val="0"/>
+          <w:numId w:val="4"/>
+        </w:numPr>
+        <w:spacing w:after="80" w:line="300"/>
+      </w:pPr>
+      <w:r>
+        <w:rPr>
+          <w:rFonts w:ascii="Segoe UI" w:cs="Segoe UI" w:eastAsia="Microsoft JhengHei" w:hAnsi="Segoe UI"/>
+          <w:b/>
+          <w:bCs/>
+        </w:rPr>
+        <w:t xml:space="preserve">換主題就開新對話。</w:t>
+      </w:r>
+      <w:r>
+        <w:rPr>
+          <w:rFonts w:ascii="Segoe UI" w:cs="Segoe UI" w:eastAsia="Microsoft JhengHei" w:hAnsi="Segoe UI"/>
+        </w:rPr>
+        <w:t xml:space="preserve">同一個對話每問一次，前面的檔案都會重新算 token。</w:t>
+      </w:r>
+    </w:p>
+    <w:p>
+      <w:pPr>
+        <w:spacing w:after="80" w:before="200"/>
+      </w:pPr>
+      <w:r>
+        <w:rPr>
+          <w:rFonts w:ascii="Segoe UI" w:cs="Segoe UI" w:eastAsia="Microsoft JhengHei" w:hAnsi="Segoe UI"/>
+          <w:b/>
+          <w:bCs/>
+        </w:rPr>
+        <w:t xml:space="preserve">可以直接貼給 Claude 的開頭</w:t>
+      </w:r>
+    </w:p>
+    <w:p>
+      <w:pPr>
+        <w:pBdr>
+          <w:left w:val="single" w:color="005FB8" w:sz="18" w:space="8"/>
+        </w:pBdr>
+        <w:shd w:fill="F4F7FB" w:color="auto" w:val="clear"/>
+        <w:spacing w:after="0" w:line="300"/>
+        <w:ind w:left="160" w:right="160"/>
+      </w:pPr>
+      <w:r>
+        <w:rPr>
+          <w:rFonts w:ascii="Segoe UI" w:cs="Segoe UI" w:eastAsia="Microsoft JhengHei" w:hAnsi="Segoe UI"/>
+        </w:rPr>
+        <w:t xml:space="preserve">附件是 Excel 轉出的索引（00_索引與邏輯.md）。請先只根據索引回答；索引裡的合計和最大最小值是程式精確算好的，可以直接引用。如果需要明細，請告訴我要上傳哪一個資料檔（檔名和大約 token 數在索引最後），不要猜。</w:t>
+      </w:r>
+    </w:p>
+    <w:p>
+      <w:pPr>
+        <w:pBdr>
+          <w:left w:val="single" w:color="005FB8" w:sz="18" w:space="8"/>
+        </w:pBdr>
+        <w:shd w:fill="F4F7FB" w:color="auto" w:val="clear"/>
+        <w:spacing w:after="0" w:line="300"/>
+        <w:ind w:left="160" w:right="160"/>
+      </w:pPr>
+      <w:r>
+        <w:rPr>
+          <w:rFonts w:ascii="Segoe UI" w:cs="Segoe UI" w:eastAsia="Microsoft JhengHei" w:hAnsi="Segoe UI"/>
+        </w:rPr>
+        <w:t xml:space="preserve">我的問題是：……</w:t>
+      </w:r>
+    </w:p>
+    <w:p>
+      <w:pPr>
+        <w:spacing w:after="120"/>
+      </w:pPr>
+    </w:p>
+    <w:p>
+      <w:pPr>
+        <w:pStyle w:val="Heading1"/>
+        <w:spacing w:after="160" w:before="360"/>
+      </w:pPr>
+      <w:r>
+        <w:rPr>
+          <w:rFonts w:ascii="Segoe UI" w:cs="Segoe UI" w:eastAsia="Microsoft JhengHei" w:hAnsi="Segoe UI"/>
+        </w:rPr>
+        <w:t xml:space="preserve">5. 設定 Claude 專案指示（做一次就好）</w:t>
+      </w:r>
+    </w:p>
+    <w:p>
+      <w:pPr>
+        <w:spacing w:after="120" w:line="300"/>
+      </w:pPr>
+      <w:r>
+        <w:rPr>
+          <w:rFonts w:ascii="Segoe UI" w:cs="Segoe UI" w:eastAsia="Microsoft JhengHei" w:hAnsi="Segoe UI"/>
+        </w:rPr>
+        <w:t xml:space="preserve">如果你常在同一個 Claude 專案（Project）裡處理 Excel，可以把固定指示貼到專案裡。之後在這個專案的每一次對話，Claude 都會先看索引、需要明細時才開口要檔案，也會提醒你用篩選。</w:t>
+      </w:r>
+    </w:p>
+    <w:p>
+      <w:pPr>
+        <w:pStyle w:val="ListParagraph"/>
+        <w:numPr>
+          <w:ilvl w:val="0"/>
+          <w:numId w:val="5"/>
+        </w:numPr>
+        <w:spacing w:after="80" w:line="300"/>
+      </w:pPr>
+      <w:r>
+        <w:rPr>
+          <w:rFonts w:ascii="Segoe UI" w:cs="Segoe UI" w:eastAsia="Microsoft JhengHei" w:hAnsi="Segoe UI"/>
+        </w:rPr>
+        <w:t xml:space="preserve">在面板按「</w:t>
+      </w:r>
+      <w:r>
+        <w:rPr>
+          <w:rFonts w:ascii="Segoe UI" w:cs="Segoe UI" w:eastAsia="Microsoft JhengHei" w:hAnsi="Segoe UI"/>
+          <w:b/>
+          <w:bCs/>
+        </w:rPr>
+        <w:t xml:space="preserve">更多 › 複製 Claude 專案指示</w:t>
+      </w:r>
+      <w:r>
+        <w:rPr>
+          <w:rFonts w:ascii="Segoe UI" w:cs="Segoe UI" w:eastAsia="Microsoft JhengHei" w:hAnsi="Segoe UI"/>
+        </w:rPr>
+        <w:t xml:space="preserve">」。面板底部會顯示「✓ 已複製」。</w:t>
+      </w:r>
+    </w:p>
+    <w:p>
+      <w:pPr>
+        <w:pStyle w:val="ListParagraph"/>
+        <w:numPr>
+          <w:ilvl w:val="0"/>
+          <w:numId w:val="5"/>
+        </w:numPr>
+        <w:spacing w:after="80" w:line="300"/>
+      </w:pPr>
+      <w:r>
+        <w:rPr>
+          <w:rFonts w:ascii="Segoe UI" w:cs="Segoe UI" w:eastAsia="Microsoft JhengHei" w:hAnsi="Segoe UI"/>
+        </w:rPr>
+        <w:t xml:space="preserve">在 Claude 建立一個專案（或打開現有的專案）。</w:t>
+      </w:r>
+    </w:p>
+    <w:p>
+      <w:pPr>
+        <w:pStyle w:val="ListParagraph"/>
+        <w:numPr>
+          <w:ilvl w:val="0"/>
+          <w:numId w:val="5"/>
+        </w:numPr>
+        <w:spacing w:after="80" w:line="300"/>
+      </w:pPr>
+      <w:r>
+        <w:rPr>
+          <w:rFonts w:ascii="Segoe UI" w:cs="Segoe UI" w:eastAsia="Microsoft JhengHei" w:hAnsi="Segoe UI"/>
+        </w:rPr>
+        <w:t xml:space="preserve">打開專案的「指示」（Instructions）設定，貼上剛剛複製的內容，儲存。</w:t>
+      </w:r>
+    </w:p>
+    <w:p>
+      <w:pPr>
+        <w:pStyle w:val="ListParagraph"/>
+        <w:numPr>
+          <w:ilvl w:val="0"/>
+          <w:numId w:val="5"/>
+        </w:numPr>
+        <w:spacing w:after="80" w:line="300"/>
+      </w:pPr>
+      <w:r>
+        <w:rPr>
+          <w:rFonts w:ascii="Segoe UI" w:cs="Segoe UI" w:eastAsia="Microsoft JhengHei" w:hAnsi="Segoe UI"/>
+        </w:rPr>
+        <w:t xml:space="preserve">之後在這個專案裡開對話，上傳索引卡片即可。</w:t>
+      </w:r>
+    </w:p>
+    <w:p>
+      <w:pPr>
+        <w:spacing w:after="80" w:before="160"/>
+      </w:pPr>
+      <w:r>
+        <w:rPr>
+          <w:rFonts w:ascii="Segoe UI" w:cs="Segoe UI" w:eastAsia="Microsoft JhengHei" w:hAnsi="Segoe UI"/>
+          <w:b/>
+          <w:bCs/>
+        </w:rPr>
+        <w:t xml:space="preserve">複製出來的指示內容如下：</w:t>
+      </w:r>
+    </w:p>
+    <w:p>
+      <w:pPr>
+        <w:pBdr>
+          <w:left w:val="single" w:color="005FB8" w:sz="18" w:space="8"/>
+        </w:pBdr>
+        <w:shd w:fill="F4F7FB" w:color="auto" w:val="clear"/>
+        <w:spacing w:after="0" w:line="300"/>
+        <w:ind w:left="160" w:right="160"/>
+      </w:pPr>
+      <w:r>
+        <w:rPr>
+          <w:rFonts w:ascii="Segoe UI" w:cs="Segoe UI" w:eastAsia="Microsoft JhengHei" w:hAnsi="Segoe UI"/>
+        </w:rPr>
+        <w:t xml:space="preserve">我會上傳用「MarkItDown 轉換器」從 Excel 轉出的檔案。請照這個方式處理：</w:t>
+      </w:r>
+    </w:p>
+    <w:p>
+      <w:pPr>
+        <w:pBdr>
+          <w:left w:val="single" w:color="005FB8" w:sz="18" w:space="8"/>
+        </w:pBdr>
+        <w:shd w:fill="F4F7FB" w:color="auto" w:val="clear"/>
+        <w:spacing w:after="0" w:line="300"/>
+        <w:ind w:left="160" w:right="160"/>
+      </w:pPr>
+      <w:r>
+        <w:rPr>
+          <w:rFonts w:ascii="Segoe UI" w:cs="Segoe UI" w:eastAsia="Microsoft JhengHei" w:hAnsi="Segoe UI"/>
+        </w:rPr>
+        <w:t xml:space="preserve">1. 先只讀「00_索引與邏輯.md」。它列出每張工作表、每一欄的類型，以及程式精確算好的合計、最大值、最小值和公式邏輯；這些數字可以直接引用，不要自己加總大量數字。</w:t>
+      </w:r>
+    </w:p>
+    <w:p>
+      <w:pPr>
+        <w:pBdr>
+          <w:left w:val="single" w:color="005FB8" w:sz="18" w:space="8"/>
+        </w:pBdr>
+        <w:shd w:fill="F4F7FB" w:color="auto" w:val="clear"/>
+        <w:spacing w:after="0" w:line="300"/>
+        <w:ind w:left="160" w:right="160"/>
+      </w:pPr>
+      <w:r>
+        <w:rPr>
+          <w:rFonts w:ascii="Segoe UI" w:cs="Segoe UI" w:eastAsia="Microsoft JhengHei" w:hAnsi="Segoe UI"/>
+        </w:rPr>
+        <w:t xml:space="preserve">2. 能用索引回答就直接回答。需要明細時，告訴我要上傳哪一個資料檔（檔名和大約 token 數在索引最後的「資料檔」表），一次只要需要的那幾個，不要要求整包。</w:t>
+      </w:r>
+    </w:p>
+    <w:p>
+      <w:pPr>
+        <w:pBdr>
+          <w:left w:val="single" w:color="005FB8" w:sz="18" w:space="8"/>
+        </w:pBdr>
+        <w:shd w:fill="F4F7FB" w:color="auto" w:val="clear"/>
+        <w:spacing w:after="0" w:line="300"/>
+        <w:ind w:left="160" w:right="160"/>
+      </w:pPr>
+      <w:r>
+        <w:rPr>
+          <w:rFonts w:ascii="Segoe UI" w:cs="Segoe UI" w:eastAsia="Microsoft JhengHei" w:hAnsi="Segoe UI"/>
+        </w:rPr>
+        <w:t xml:space="preserve">3. 問題只跟某個料號、客戶，或只跟最新的預測版本有關時，提醒我用轉換器的關鍵字篩選或「只轉最新一版」重新轉一次，檔案會小很多。</w:t>
+      </w:r>
+    </w:p>
+    <w:p>
+      <w:pPr>
+        <w:pBdr>
+          <w:left w:val="single" w:color="005FB8" w:sz="18" w:space="8"/>
+        </w:pBdr>
+        <w:shd w:fill="F4F7FB" w:color="auto" w:val="clear"/>
+        <w:spacing w:after="0" w:line="300"/>
+        <w:ind w:left="160" w:right="160"/>
+      </w:pPr>
+      <w:r>
+        <w:rPr>
+          <w:rFonts w:ascii="Segoe UI" w:cs="Segoe UI" w:eastAsia="Microsoft JhengHei" w:hAnsi="Segoe UI"/>
+        </w:rPr>
+        <w:t xml:space="preserve">4. 資料是 Tab 分隔，第一欄是 Excel 列號（後面有 h 表示該列在 Excel 中隱藏），數值是完整精度。引用數字時請註明工作表和儲存格位置（例如 Summary!F12）。</w:t>
+      </w:r>
+    </w:p>
+    <w:p>
+      <w:pPr>
+        <w:spacing w:after="120"/>
+      </w:pPr>
+    </w:p>
+    <w:p>
+      <w:pPr>
+        <w:pStyle w:val="Heading1"/>
+        <w:spacing w:after="160" w:before="360"/>
+      </w:pPr>
+      <w:r>
+        <w:rPr>
+          <w:rFonts w:ascii="Segoe UI" w:cs="Segoe UI" w:eastAsia="Microsoft JhengHei" w:hAnsi="Segoe UI"/>
+        </w:rPr>
+        <w:t xml:space="preserve">6. 看懂轉出來的檔案</w:t>
+      </w:r>
+    </w:p>
+    <w:p>
+      <w:pPr>
+        <w:pStyle w:val="Heading2"/>
+        <w:spacing w:after="120" w:before="240"/>
+      </w:pPr>
+      <w:r>
+        <w:rPr>
+          <w:rFonts w:ascii="Segoe UI" w:cs="Segoe UI" w:eastAsia="Microsoft JhengHei" w:hAnsi="Segoe UI"/>
+        </w:rPr>
+        <w:t xml:space="preserve">6.1 檔案放在哪裡</w:t>
+      </w:r>
+    </w:p>
+    <w:p>
+      <w:pPr>
+        <w:pStyle w:val="ListParagraph"/>
+        <w:numPr>
+          <w:ilvl w:val="0"/>
+          <w:numId w:val="2"/>
+        </w:numPr>
+        <w:spacing w:after="80" w:line="300"/>
+      </w:pPr>
+      <w:r>
+        <w:rPr>
+          <w:rFonts w:ascii="Segoe UI" w:cs="Segoe UI" w:eastAsia="Microsoft JhengHei" w:hAnsi="Segoe UI"/>
+          <w:b/>
+          <w:bCs/>
+        </w:rPr>
+        <w:t xml:space="preserve">小檔案</w:t>
+      </w:r>
+      <w:r>
+        <w:rPr>
+          <w:rFonts w:ascii="Segoe UI" w:cs="Segoe UI" w:eastAsia="Microsoft JhengHei" w:hAnsi="Segoe UI"/>
+        </w:rPr>
+        <w:t xml:space="preserve">：在原始檔旁邊產生一個同名的 .md。</w:t>
+      </w:r>
+    </w:p>
+    <w:p>
+      <w:pPr>
+        <w:pStyle w:val="ListParagraph"/>
+        <w:numPr>
+          <w:ilvl w:val="0"/>
+          <w:numId w:val="2"/>
+        </w:numPr>
+        <w:spacing w:after="80" w:line="300"/>
+      </w:pPr>
+      <w:r>
+        <w:rPr>
+          <w:rFonts w:ascii="Segoe UI" w:cs="Segoe UI" w:eastAsia="Microsoft JhengHei" w:hAnsi="Segoe UI"/>
+          <w:b/>
+          <w:bCs/>
+        </w:rPr>
+        <w:t xml:space="preserve">大檔案</w:t>
+      </w:r>
+      <w:r>
+        <w:rPr>
+          <w:rFonts w:ascii="Segoe UI" w:cs="Segoe UI" w:eastAsia="Microsoft JhengHei" w:hAnsi="Segoe UI"/>
+        </w:rPr>
+        <w:t xml:space="preserve">：在原始檔旁邊產生資料夾「&lt;檔名&gt;_md」，裡面有 00_索引與邏輯.md 和 01_、02_… 開頭的資料檔；太大的工作表會再分成「_第1部分」、「_第2部分」。</w:t>
+      </w:r>
+    </w:p>
+    <w:p>
+      <w:pPr>
+        <w:pStyle w:val="ListParagraph"/>
+        <w:numPr>
+          <w:ilvl w:val="0"/>
+          <w:numId w:val="2"/>
+        </w:numPr>
+        <w:spacing w:after="80" w:line="300"/>
+      </w:pPr>
+      <w:r>
+        <w:rPr>
+          <w:rFonts w:ascii="Segoe UI" w:cs="Segoe UI" w:eastAsia="Microsoft JhengHei" w:hAnsi="Segoe UI"/>
+          <w:b/>
+          <w:bCs/>
+        </w:rPr>
+        <w:t xml:space="preserve">篩選出來的小檔</w:t>
+      </w:r>
+      <w:r>
+        <w:rPr>
+          <w:rFonts w:ascii="Segoe UI" w:cs="Segoe UI" w:eastAsia="Microsoft JhengHei" w:hAnsi="Segoe UI"/>
+        </w:rPr>
+        <w:t xml:space="preserve">：檔名後面加「_最新1版」等，不會覆蓋完整版。</w:t>
+      </w:r>
+    </w:p>
+    <w:p>
+      <w:pPr>
+        <w:pStyle w:val="ListParagraph"/>
+        <w:numPr>
+          <w:ilvl w:val="0"/>
+          <w:numId w:val="2"/>
+        </w:numPr>
+        <w:spacing w:after="80" w:line="300"/>
+      </w:pPr>
+      <w:r>
+        <w:rPr>
+          <w:rFonts w:ascii="Segoe UI" w:cs="Segoe UI" w:eastAsia="Microsoft JhengHei" w:hAnsi="Segoe UI"/>
+        </w:rPr>
+        <w:t xml:space="preserve">重新轉換同一個檔案時會更新原本的輸出；舊的分割檔會自動清掉，資料夾裡你自己放的其他檔案不會被動到。</w:t>
+      </w:r>
+    </w:p>
+    <w:p>
+      <w:pPr>
+        <w:pStyle w:val="Heading2"/>
+        <w:spacing w:after="120" w:before="240"/>
+      </w:pPr>
+      <w:r>
+        <w:rPr>
+          <w:rFonts w:ascii="Segoe UI" w:cs="Segoe UI" w:eastAsia="Microsoft JhengHei" w:hAnsi="Segoe UI"/>
+        </w:rPr>
+        <w:t xml:space="preserve">6.2 索引裡有什麼</w:t>
+      </w:r>
+    </w:p>
+    <w:p>
+      <w:pPr>
+        <w:pStyle w:val="ListParagraph"/>
+        <w:numPr>
+          <w:ilvl w:val="0"/>
+          <w:numId w:val="2"/>
+        </w:numPr>
+        <w:spacing w:after="80" w:line="300"/>
+      </w:pPr>
+      <w:r>
+        <w:rPr>
+          <w:rFonts w:ascii="Segoe UI" w:cs="Segoe UI" w:eastAsia="Microsoft JhengHei" w:hAnsi="Segoe UI"/>
+        </w:rPr>
+        <w:t xml:space="preserve">每張工作表的狀態（顯示／隱藏）、列數、欄數、表頭在第幾列、公式數量、資料大約多少 token。</w:t>
+      </w:r>
+    </w:p>
+    <w:p>
+      <w:pPr>
+        <w:pStyle w:val="ListParagraph"/>
+        <w:numPr>
+          <w:ilvl w:val="0"/>
+          <w:numId w:val="2"/>
+        </w:numPr>
+        <w:spacing w:after="80" w:line="300"/>
+      </w:pPr>
+      <w:r>
+        <w:rPr>
+          <w:rFonts w:ascii="Segoe UI" w:cs="Segoe UI" w:eastAsia="Microsoft JhengHei" w:hAnsi="Segoe UI"/>
+        </w:rPr>
+        <w:t xml:space="preserve">每一欄的名稱、類型、非空格數，以及程式算好的最小值、最大值、合計。有「分類欄」（例如 Demand／ETD／Balance）時，合計會依分類分開算。</w:t>
+      </w:r>
+    </w:p>
+    <w:p>
+      <w:pPr>
+        <w:pStyle w:val="ListParagraph"/>
+        <w:numPr>
+          <w:ilvl w:val="0"/>
+          <w:numId w:val="2"/>
+        </w:numPr>
+        <w:spacing w:after="80" w:line="300"/>
+      </w:pPr>
+      <w:r>
+        <w:rPr>
+          <w:rFonts w:ascii="Segoe UI" w:cs="Segoe UI" w:eastAsia="Microsoft JhengHei" w:hAnsi="Segoe UI"/>
+        </w:rPr>
+        <w:t xml:space="preserve">每一欄的公式寫法、工作表之間的資料流向、自動篩選、隱藏的列和欄、資料驗證、樞紐分析表、版本欄。</w:t>
+      </w:r>
+    </w:p>
+    <w:p>
+      <w:pPr>
+        <w:pStyle w:val="ListParagraph"/>
+        <w:numPr>
+          <w:ilvl w:val="0"/>
+          <w:numId w:val="2"/>
+        </w:numPr>
+        <w:spacing w:after="80" w:line="300"/>
+      </w:pPr>
+      <w:r>
+        <w:rPr>
+          <w:rFonts w:ascii="Segoe UI" w:cs="Segoe UI" w:eastAsia="Microsoft JhengHei" w:hAnsi="Segoe UI"/>
+        </w:rPr>
+        <w:t xml:space="preserve">最後的「資料檔」表：每個資料檔的檔名和大約 token 數。</w:t>
+      </w:r>
+    </w:p>
+    <w:p>
+      <w:pPr>
+        <w:pStyle w:val="Heading2"/>
+        <w:spacing w:after="120" w:before="240"/>
+      </w:pPr>
+      <w:r>
+        <w:rPr>
+          <w:rFonts w:ascii="Segoe UI" w:cs="Segoe UI" w:eastAsia="Microsoft JhengHei" w:hAnsi="Segoe UI"/>
+        </w:rPr>
+        <w:t xml:space="preserve">6.3 資料檔的格式</w:t>
+      </w:r>
+    </w:p>
+    <w:p>
+      <w:pPr>
+        <w:pStyle w:val="ListParagraph"/>
+        <w:numPr>
+          <w:ilvl w:val="0"/>
+          <w:numId w:val="2"/>
+        </w:numPr>
+        <w:spacing w:after="80" w:line="300"/>
+      </w:pPr>
+      <w:r>
+        <w:rPr>
+          <w:rFonts w:ascii="Segoe UI" w:cs="Segoe UI" w:eastAsia="Microsoft JhengHei" w:hAnsi="Segoe UI"/>
+        </w:rPr>
+        <w:t xml:space="preserve">Tab 分隔。第一行是 Excel 欄字母，之後每一行的第一欄是 Excel 列號；列號後面有 h 表示該列在 Excel 中是隱藏的（常見原因是被篩選掉）。</w:t>
+      </w:r>
+    </w:p>
+    <w:p>
+      <w:pPr>
+        <w:pStyle w:val="ListParagraph"/>
+        <w:numPr>
+          <w:ilvl w:val="0"/>
+          <w:numId w:val="2"/>
+        </w:numPr>
+        <w:spacing w:after="80" w:line="300"/>
+      </w:pPr>
+      <w:r>
+        <w:rPr>
+          <w:rFonts w:ascii="Segoe UI" w:cs="Segoe UI" w:eastAsia="Microsoft JhengHei" w:hAnsi="Segoe UI"/>
+        </w:rPr>
+        <w:t xml:space="preserve">數值是完整精度，沒有千分位；百分比用小數表示（0.25 = 25%）；日期寫成 YYYY-MM-DD，格式藏住的時間也會寫出來。</w:t>
+      </w:r>
+    </w:p>
+    <w:p>
+      <w:pPr>
+        <w:pStyle w:val="ListParagraph"/>
+        <w:numPr>
+          <w:ilvl w:val="0"/>
+          <w:numId w:val="2"/>
+        </w:numPr>
+        <w:spacing w:after="80" w:line="300"/>
+      </w:pPr>
+      <w:r>
+        <w:rPr>
+          <w:rFonts w:ascii="Segoe UI" w:cs="Segoe UI" w:eastAsia="Microsoft JhengHei" w:hAnsi="Segoe UI"/>
+        </w:rPr>
+        <w:t xml:space="preserve">儲存格的註解附在該工作表資料的最後面。</w:t>
+      </w:r>
+    </w:p>
+    <w:p>
+      <w:pPr>
+        <w:pStyle w:val="Heading1"/>
+        <w:spacing w:after="160" w:before="360"/>
+      </w:pPr>
+      <w:r>
+        <w:rPr>
+          <w:rFonts w:ascii="Segoe UI" w:cs="Segoe UI" w:eastAsia="Microsoft JhengHei" w:hAnsi="Segoe UI"/>
+        </w:rPr>
+        <w:t xml:space="preserve">7. 使用範例：預測瀑布表</w:t>
+      </w:r>
+    </w:p>
+    <w:p>
+      <w:pPr>
+        <w:spacing w:after="120" w:line="300"/>
+      </w:pPr>
+      <w:r>
+        <w:rPr>
+          <w:rFonts w:ascii="Segoe UI" w:cs="Segoe UI" w:eastAsia="Microsoft JhengHei" w:hAnsi="Segoe UI"/>
+        </w:rPr>
+        <w:t xml:space="preserve">這一章用一份範例檔，從頭到尾說明程式怎麼轉檔、轉出來的檔案怎麼用。範例檔「範例 FCST Waterfall.xlsx」的內容是隨機產生的測試資料。其他種類的 Excel，例如週報、出貨紀錄、庫存表，也是同樣的流程；差別只在 7.5 節的「版本欄」只有一期一期累積的檔案才會有。</w:t>
+      </w:r>
+    </w:p>
+    <w:p>
+      <w:pPr>
+        <w:pStyle w:val="Heading2"/>
+        <w:spacing w:after="120" w:before="240"/>
+      </w:pPr>
+      <w:r>
+        <w:rPr>
+          <w:rFonts w:ascii="Segoe UI" w:cs="Segoe UI" w:eastAsia="Microsoft JhengHei" w:hAnsi="Segoe UI"/>
+        </w:rPr>
+        <w:t xml:space="preserve">7.1 範例檔長什麼樣子</w:t>
+      </w:r>
+    </w:p>
+    <w:p>
+      <w:pPr>
+        <w:pStyle w:val="ListParagraph"/>
+        <w:numPr>
+          <w:ilvl w:val="0"/>
+          <w:numId w:val="2"/>
+        </w:numPr>
+        <w:spacing w:after="80" w:line="300"/>
+      </w:pPr>
+      <w:r>
+        <w:rPr>
+          <w:rFonts w:ascii="Segoe UI" w:cs="Segoe UI" w:eastAsia="Microsoft JhengHei" w:hAnsi="Segoe UI"/>
+        </w:rPr>
+        <w:t xml:space="preserve">一張工作表「By MPN x Site」，2,240 列 × 31 欄。</w:t>
+      </w:r>
+    </w:p>
+    <w:p>
+      <w:pPr>
+        <w:pStyle w:val="ListParagraph"/>
+        <w:numPr>
+          <w:ilvl w:val="0"/>
+          <w:numId w:val="2"/>
+        </w:numPr>
+        <w:spacing w:after="80" w:line="300"/>
+      </w:pPr>
+      <w:r>
+        <w:rPr>
+          <w:rFonts w:ascii="Segoe UI" w:cs="Segoe UI" w:eastAsia="Microsoft JhengHei" w:hAnsi="Segoe UI"/>
+        </w:rPr>
+        <w:t xml:space="preserve">A～D 欄是料號（MPN）、地點（Site）、品牌（Brand）、預測版本（Version）；E～AD 欄是 26 週的需求數量，AE 欄是合計（TTL）。</w:t>
+      </w:r>
+    </w:p>
+    <w:p>
+      <w:pPr>
+        <w:pStyle w:val="ListParagraph"/>
+        <w:numPr>
+          <w:ilvl w:val="0"/>
+          <w:numId w:val="2"/>
+        </w:numPr>
+        <w:spacing w:after="80" w:line="300"/>
+      </w:pPr>
+      <w:r>
+        <w:rPr>
+          <w:rFonts w:ascii="Segoe UI" w:cs="Segoe UI" w:eastAsia="Microsoft JhengHei" w:hAnsi="Segoe UI"/>
+        </w:rPr>
+        <w:t xml:space="preserve">每週會新增一個預測版本，160 個料號在每一版都各有一列。目前累積了 14 版（2026/07/06 ～ 2026/10/05）。</w:t>
+      </w:r>
+    </w:p>
+    <w:p>
+      <w:pPr>
+        <w:pStyle w:val="Heading2"/>
+        <w:spacing w:after="120" w:before="240"/>
+      </w:pPr>
+      <w:r>
+        <w:rPr>
+          <w:rFonts w:ascii="Segoe UI" w:cs="Segoe UI" w:eastAsia="Microsoft JhengHei" w:hAnsi="Segoe UI"/>
+        </w:rPr>
+        <w:t xml:space="preserve">7.2 拖進面板後，程式做了什麼</w:t>
+      </w:r>
+    </w:p>
+    <w:p>
+      <w:pPr>
+        <w:pStyle w:val="ListParagraph"/>
+        <w:numPr>
+          <w:ilvl w:val="0"/>
+          <w:numId w:val="6"/>
+        </w:numPr>
+        <w:spacing w:after="80" w:line="300"/>
+      </w:pPr>
+      <w:r>
+        <w:rPr>
+          <w:rFonts w:ascii="Segoe UI" w:cs="Segoe UI" w:eastAsia="Microsoft JhengHei" w:hAnsi="Segoe UI"/>
+          <w:b/>
+          <w:bCs/>
+        </w:rPr>
+        <w:t xml:space="preserve">找出表頭</w:t>
+      </w:r>
+      <w:r>
+        <w:rPr>
+          <w:rFonts w:ascii="Segoe UI" w:cs="Segoe UI" w:eastAsia="Microsoft JhengHei" w:hAnsi="Segoe UI"/>
+        </w:rPr>
+        <w:t xml:space="preserve">：第 1 列是欄名（MPN、Site…W01…TTL）。表頭不在第 1 列的檔案，程式會依自動篩選、樞紐分析表或凍結窗格判斷。</w:t>
+      </w:r>
+    </w:p>
+    <w:p>
+      <w:pPr>
+        <w:pStyle w:val="ListParagraph"/>
+        <w:numPr>
+          <w:ilvl w:val="0"/>
+          <w:numId w:val="6"/>
+        </w:numPr>
+        <w:spacing w:after="80" w:line="300"/>
+      </w:pPr>
+      <w:r>
+        <w:rPr>
+          <w:rFonts w:ascii="Segoe UI" w:cs="Segoe UI" w:eastAsia="Microsoft JhengHei" w:hAnsi="Segoe UI"/>
+          <w:b/>
+          <w:bCs/>
+        </w:rPr>
+        <w:t xml:space="preserve">讀出每一格並逐格核對</w:t>
+      </w:r>
+      <w:r>
+        <w:rPr>
+          <w:rFonts w:ascii="Segoe UI" w:cs="Segoe UI" w:eastAsia="Microsoft JhengHei" w:hAnsi="Segoe UI"/>
+        </w:rPr>
+        <w:t xml:space="preserve">：數值保留完整精度、日期寫成完整格式；寫出檔案前把每一格讀回來和 Excel 比對。</w:t>
+      </w:r>
+    </w:p>
+    <w:p>
+      <w:pPr>
+        <w:pStyle w:val="ListParagraph"/>
+        <w:numPr>
+          <w:ilvl w:val="0"/>
+          <w:numId w:val="6"/>
+        </w:numPr>
+        <w:spacing w:after="80" w:line="300"/>
+      </w:pPr>
+      <w:r>
+        <w:rPr>
+          <w:rFonts w:ascii="Segoe UI" w:cs="Segoe UI" w:eastAsia="Microsoft JhengHei" w:hAnsi="Segoe UI"/>
+          <w:b/>
+          <w:bCs/>
+        </w:rPr>
+        <w:t xml:space="preserve">算出每一欄的統計</w:t>
+      </w:r>
+      <w:r>
+        <w:rPr>
+          <w:rFonts w:ascii="Segoe UI" w:cs="Segoe UI" w:eastAsia="Microsoft JhengHei" w:hAnsi="Segoe UI"/>
+        </w:rPr>
+        <w:t xml:space="preserve">：最小值、最大值、合計，以及文字欄最常出現的值，寫進索引。</w:t>
+      </w:r>
+    </w:p>
+    <w:p>
+      <w:pPr>
+        <w:pStyle w:val="ListParagraph"/>
+        <w:numPr>
+          <w:ilvl w:val="0"/>
+          <w:numId w:val="6"/>
+        </w:numPr>
+        <w:spacing w:after="80" w:line="300"/>
+      </w:pPr>
+      <w:r>
+        <w:rPr>
+          <w:rFonts w:ascii="Segoe UI" w:cs="Segoe UI" w:eastAsia="Microsoft JhengHei" w:hAnsi="Segoe UI"/>
+          <w:b/>
+          <w:bCs/>
+        </w:rPr>
+        <w:t xml:space="preserve">決定要不要拆檔</w:t>
+      </w:r>
+      <w:r>
+        <w:rPr>
+          <w:rFonts w:ascii="Segoe UI" w:cs="Segoe UI" w:eastAsia="Microsoft JhengHei" w:hAnsi="Segoe UI"/>
+        </w:rPr>
+        <w:t xml:space="preserve">：全部約 19.5 萬 token，超過 3 萬，所以拆成一個索引和 2 個資料檔（每個 10 萬 token 以內）。</w:t>
+      </w:r>
+    </w:p>
+    <w:p>
+      <w:pPr>
+        <w:pStyle w:val="ListParagraph"/>
+        <w:numPr>
+          <w:ilvl w:val="0"/>
+          <w:numId w:val="6"/>
+        </w:numPr>
+        <w:spacing w:after="80" w:line="300"/>
+      </w:pPr>
+      <w:r>
+        <w:rPr>
+          <w:rFonts w:ascii="Segoe UI" w:cs="Segoe UI" w:eastAsia="Microsoft JhengHei" w:hAnsi="Segoe UI"/>
+          <w:b/>
+          <w:bCs/>
+        </w:rPr>
+        <w:t xml:space="preserve">找出版本欄</w:t>
+      </w:r>
+      <w:r>
+        <w:rPr>
+          <w:rFonts w:ascii="Segoe UI" w:cs="Segoe UI" w:eastAsia="Microsoft JhengHei" w:hAnsi="Segoe UI"/>
+        </w:rPr>
+        <w:t xml:space="preserve">：D 欄的值全是日期，14 個日期各有 160 列，幾乎每一列都有值，判定為版本欄；於是卡片上多了「只轉最新一版 · 約 15,000 token」和「只轉最新 2 版 · 約 28,900 token」。</w:t>
+      </w:r>
+    </w:p>
+    <w:p>
+      <w:pPr>
+        <w:spacing w:after="80" w:before="120"/>
+      </w:pPr>
+      <w:r>
+        <w:rPr>
+          <w:rFonts w:ascii="Segoe UI" w:cs="Segoe UI" w:eastAsia="Microsoft JhengHei" w:hAnsi="Segoe UI"/>
+        </w:rPr>
+        <w:t xml:space="preserve">轉出來的檔案放在原檔旁邊的資料夾「範例 FCST Waterfall_md」：</w:t>
+      </w:r>
+    </w:p>
+    <w:tbl>
+      <w:tblPr>
+        <w:tblW w:type="dxa" w:w="9026"/>
+        <w:tblBorders>
+          <w:top w:val="single" w:color="auto" w:sz="4"/>
+          <w:left w:val="single" w:color="auto" w:sz="4"/>
+          <w:bottom w:val="single" w:color="auto" w:sz="4"/>
+          <w:right w:val="single" w:color="auto" w:sz="4"/>
+          <w:insideH w:val="single" w:color="auto" w:sz="4"/>
+          <w:insideV w:val="single" w:color="auto" w:sz="4"/>
+        </w:tblBorders>
+      </w:tblPr>
+      <w:tblGrid>
+        <w:gridCol w:w="5000"/>
+        <w:gridCol w:w="4026"/>
+      </w:tblGrid>
+      <w:tr>
+        <w:trPr>
+          <w:cantSplit/>
+          <w:tblHeader/>
+        </w:trPr>
+        <w:tc>
+          <w:tcPr>
+            <w:tcW w:type="dxa" w:w="5000"/>
+            <w:tcBorders>
+              <w:top w:val="single" w:color="D0D0D0" w:sz="4"/>
+              <w:left w:val="single" w:color="D0D0D0" w:sz="4"/>
+              <w:bottom w:val="single" w:color="D0D0D0" w:sz="4"/>
+              <w:right w:val="single" w:color="D0D0D0" w:sz="4"/>
+            </w:tcBorders>
+            <w:shd w:fill="EEF3F9" w:color="auto" w:val="clear"/>
+            <w:tcMar>
+              <w:top w:type="dxa" w:w="80"/>
+              <w:left w:type="dxa" w:w="120"/>
+              <w:bottom w:type="dxa" w:w="80"/>
+              <w:right w:type="dxa" w:w="120"/>
+            </w:tcMar>
+          </w:tcPr>
+          <w:p>
+            <w:pPr>
+              <w:spacing w:after="0" w:line="280"/>
+            </w:pPr>
+            <w:r>
+              <w:rPr>
+                <w:rFonts w:ascii="Segoe UI" w:cs="Segoe UI" w:eastAsia="Microsoft JhengHei" w:hAnsi="Segoe UI"/>
+                <w:b/>
+                <w:bCs/>
+                <w:sz w:val="20"/>
+                <w:szCs w:val="20"/>
+              </w:rPr>
+              <w:t xml:space="preserve">檔案</w:t>
+            </w:r>
+          </w:p>
+        </w:tc>
+        <w:tc>
+          <w:tcPr>
+            <w:tcW w:type="dxa" w:w="4026"/>
+            <w:tcBorders>
+              <w:top w:val="single" w:color="D0D0D0" w:sz="4"/>
+              <w:left w:val="single" w:color="D0D0D0" w:sz="4"/>
+              <w:bottom w:val="single" w:color="D0D0D0" w:sz="4"/>
+              <w:right w:val="single" w:color="D0D0D0" w:sz="4"/>
+            </w:tcBorders>
+            <w:shd w:fill="EEF3F9" w:color="auto" w:val="clear"/>
+            <w:tcMar>
+              <w:top w:type="dxa" w:w="80"/>
+              <w:left w:type="dxa" w:w="120"/>
+              <w:bottom w:type="dxa" w:w="80"/>
+              <w:right w:type="dxa" w:w="120"/>
+            </w:tcMar>
+          </w:tcPr>
+          <w:p>
+            <w:pPr>
+              <w:spacing w:after="0" w:line="280"/>
+            </w:pPr>
+            <w:r>
+              <w:rPr>
+                <w:rFonts w:ascii="Segoe UI" w:cs="Segoe UI" w:eastAsia="Microsoft JhengHei" w:hAnsi="Segoe UI"/>
+                <w:b/>
+                <w:bCs/>
+                <w:sz w:val="20"/>
+                <w:szCs w:val="20"/>
+              </w:rPr>
+              <w:t xml:space="preserve">大約 token</w:t>
+            </w:r>
+          </w:p>
+        </w:tc>
+      </w:tr>
+      <w:tr>
+        <w:trPr>
+          <w:cantSplit/>
+          <w:tblHeader w:val="false"/>
+        </w:trPr>
+        <w:tc>
+          <w:tcPr>
+            <w:tcW w:type="dxa" w:w="5000"/>
+            <w:tcBorders>
+              <w:top w:val="single" w:color="D0D0D0" w:sz="4"/>
+              <w:left w:val="single" w:color="D0D0D0" w:sz="4"/>
+              <w:bottom w:val="single" w:color="D0D0D0" w:sz="4"/>
+              <w:right w:val="single" w:color="D0D0D0" w:sz="4"/>
+            </w:tcBorders>
+            <w:tcMar>
+              <w:top w:type="dxa" w:w="80"/>
+              <w:left w:type="dxa" w:w="120"/>
+              <w:bottom w:type="dxa" w:w="80"/>
+              <w:right w:type="dxa" w:w="120"/>
+            </w:tcMar>
+          </w:tcPr>
+          <w:p>
+            <w:pPr>
+              <w:spacing w:after="0" w:line="280"/>
+            </w:pPr>
+            <w:r>
+              <w:rPr>
+                <w:rFonts w:ascii="Segoe UI" w:cs="Segoe UI" w:eastAsia="Microsoft JhengHei" w:hAnsi="Segoe UI"/>
+                <w:b w:val="false"/>
+                <w:bCs w:val="false"/>
+                <w:sz w:val="20"/>
+                <w:szCs w:val="20"/>
+              </w:rPr>
+              <w:t xml:space="preserve">00_索引與邏輯.md（卡片代表的就是這個檔）</w:t>
+            </w:r>
+          </w:p>
+        </w:tc>
+        <w:tc>
+          <w:tcPr>
+            <w:tcW w:type="dxa" w:w="4026"/>
+            <w:tcBorders>
+              <w:top w:val="single" w:color="D0D0D0" w:sz="4"/>
+              <w:left w:val="single" w:color="D0D0D0" w:sz="4"/>
+              <w:bottom w:val="single" w:color="D0D0D0" w:sz="4"/>
+              <w:right w:val="single" w:color="D0D0D0" w:sz="4"/>
+            </w:tcBorders>
+            <w:tcMar>
+              <w:top w:type="dxa" w:w="80"/>
+              <w:left w:type="dxa" w:w="120"/>
+              <w:bottom w:type="dxa" w:w="80"/>
+              <w:right w:type="dxa" w:w="120"/>
+            </w:tcMar>
+          </w:tcPr>
+          <w:p>
+            <w:pPr>
+              <w:spacing w:after="0" w:line="280"/>
+            </w:pPr>
+            <w:r>
+              <w:rPr>
+                <w:rFonts w:ascii="Segoe UI" w:cs="Segoe UI" w:eastAsia="Microsoft JhengHei" w:hAnsi="Segoe UI"/>
+                <w:b w:val="false"/>
+                <w:bCs w:val="false"/>
+                <w:sz w:val="20"/>
+                <w:szCs w:val="20"/>
+              </w:rPr>
+              <w:t xml:space="preserve">1,300</w:t>
+            </w:r>
+          </w:p>
+        </w:tc>
+      </w:tr>
+      <w:tr>
+        <w:trPr>
+          <w:cantSplit/>
+          <w:tblHeader w:val="false"/>
+        </w:trPr>
+        <w:tc>
+          <w:tcPr>
+            <w:tcW w:type="dxa" w:w="5000"/>
+            <w:tcBorders>
+              <w:top w:val="single" w:color="D0D0D0" w:sz="4"/>
+              <w:left w:val="single" w:color="D0D0D0" w:sz="4"/>
+              <w:bottom w:val="single" w:color="D0D0D0" w:sz="4"/>
+              <w:right w:val="single" w:color="D0D0D0" w:sz="4"/>
+            </w:tcBorders>
+            <w:tcMar>
+              <w:top w:type="dxa" w:w="80"/>
+              <w:left w:type="dxa" w:w="120"/>
+              <w:bottom w:type="dxa" w:w="80"/>
+              <w:right w:type="dxa" w:w="120"/>
+            </w:tcMar>
+          </w:tcPr>
+          <w:p>
+            <w:pPr>
+              <w:spacing w:after="0" w:line="280"/>
+            </w:pPr>
+            <w:r>
+              <w:rPr>
+                <w:rFonts w:ascii="Segoe UI" w:cs="Segoe UI" w:eastAsia="Microsoft JhengHei" w:hAnsi="Segoe UI"/>
+                <w:b w:val="false"/>
+                <w:bCs w:val="false"/>
+                <w:sz w:val="20"/>
+                <w:szCs w:val="20"/>
+              </w:rPr>
+              <w:t xml:space="preserve">01_By MPN x Site_第1部分.md（Excel 第 1～1,168 列）</w:t>
+            </w:r>
+          </w:p>
+        </w:tc>
+        <w:tc>
+          <w:tcPr>
+            <w:tcW w:type="dxa" w:w="4026"/>
+            <w:tcBorders>
+              <w:top w:val="single" w:color="D0D0D0" w:sz="4"/>
+              <w:left w:val="single" w:color="D0D0D0" w:sz="4"/>
+              <w:bottom w:val="single" w:color="D0D0D0" w:sz="4"/>
+              <w:right w:val="single" w:color="D0D0D0" w:sz="4"/>
+            </w:tcBorders>
+            <w:tcMar>
+              <w:top w:type="dxa" w:w="80"/>
+              <w:left w:type="dxa" w:w="120"/>
+              <w:bottom w:type="dxa" w:w="80"/>
+              <w:right w:type="dxa" w:w="120"/>
+            </w:tcMar>
+          </w:tcPr>
+          <w:p>
+            <w:pPr>
+              <w:spacing w:after="0" w:line="280"/>
+            </w:pPr>
+            <w:r>
+              <w:rPr>
+                <w:rFonts w:ascii="Segoe UI" w:cs="Segoe UI" w:eastAsia="Microsoft JhengHei" w:hAnsi="Segoe UI"/>
+                <w:b w:val="false"/>
+                <w:bCs w:val="false"/>
+                <w:sz w:val="20"/>
+                <w:szCs w:val="20"/>
+              </w:rPr>
+              <w:t xml:space="preserve">100,000</w:t>
+            </w:r>
+          </w:p>
+        </w:tc>
+      </w:tr>
+      <w:tr>
+        <w:trPr>
+          <w:cantSplit/>
+          <w:tblHeader w:val="false"/>
+        </w:trPr>
+        <w:tc>
+          <w:tcPr>
+            <w:tcW w:type="dxa" w:w="5000"/>
+            <w:tcBorders>
+              <w:top w:val="single" w:color="D0D0D0" w:sz="4"/>
+              <w:left w:val="single" w:color="D0D0D0" w:sz="4"/>
+              <w:bottom w:val="single" w:color="D0D0D0" w:sz="4"/>
+              <w:right w:val="single" w:color="D0D0D0" w:sz="4"/>
+            </w:tcBorders>
+            <w:tcMar>
+              <w:top w:type="dxa" w:w="80"/>
+              <w:left w:type="dxa" w:w="120"/>
+              <w:bottom w:type="dxa" w:w="80"/>
+              <w:right w:type="dxa" w:w="120"/>
+            </w:tcMar>
+          </w:tcPr>
+          <w:p>
+            <w:pPr>
+              <w:spacing w:after="0" w:line="280"/>
+            </w:pPr>
+            <w:r>
+              <w:rPr>
+                <w:rFonts w:ascii="Segoe UI" w:cs="Segoe UI" w:eastAsia="Microsoft JhengHei" w:hAnsi="Segoe UI"/>
+                <w:b w:val="false"/>
+                <w:bCs w:val="false"/>
+                <w:sz w:val="20"/>
+                <w:szCs w:val="20"/>
+              </w:rPr>
+              <w:t xml:space="preserve">01_By MPN x Site_第2部分.md（其餘的列）</w:t>
+            </w:r>
+          </w:p>
+        </w:tc>
+        <w:tc>
+          <w:tcPr>
+            <w:tcW w:type="dxa" w:w="4026"/>
+            <w:tcBorders>
+              <w:top w:val="single" w:color="D0D0D0" w:sz="4"/>
+              <w:left w:val="single" w:color="D0D0D0" w:sz="4"/>
+              <w:bottom w:val="single" w:color="D0D0D0" w:sz="4"/>
+              <w:right w:val="single" w:color="D0D0D0" w:sz="4"/>
+            </w:tcBorders>
+            <w:tcMar>
+              <w:top w:type="dxa" w:w="80"/>
+              <w:left w:type="dxa" w:w="120"/>
+              <w:bottom w:type="dxa" w:w="80"/>
+              <w:right w:type="dxa" w:w="120"/>
+            </w:tcMar>
+          </w:tcPr>
+          <w:p>
+            <w:pPr>
+              <w:spacing w:after="0" w:line="280"/>
+            </w:pPr>
+            <w:r>
+              <w:rPr>
+                <w:rFonts w:ascii="Segoe UI" w:cs="Segoe UI" w:eastAsia="Microsoft JhengHei" w:hAnsi="Segoe UI"/>
+                <w:b w:val="false"/>
+                <w:bCs w:val="false"/>
+                <w:sz w:val="20"/>
+                <w:szCs w:val="20"/>
+              </w:rPr>
+              <w:t xml:space="preserve">93,000</w:t>
+            </w:r>
+          </w:p>
+        </w:tc>
+      </w:tr>
+    </w:tbl>
+    <w:p>
+      <w:pPr>
+        <w:pStyle w:val="Heading2"/>
+        <w:spacing w:after="120" w:before="240"/>
+      </w:pPr>
+      <w:r>
+        <w:rPr>
+          <w:rFonts w:ascii="Segoe UI" w:cs="Segoe UI" w:eastAsia="Microsoft JhengHei" w:hAnsi="Segoe UI"/>
+        </w:rPr>
+        <w:t xml:space="preserve">7.3 索引裡寫了什麼</w:t>
+      </w:r>
+    </w:p>
+    <w:p>
+      <w:pPr>
+        <w:spacing w:after="120" w:line="300"/>
+      </w:pPr>
+      <w:r>
+        <w:rPr>
+          <w:rFonts w:ascii="Segoe UI" w:cs="Segoe UI" w:eastAsia="Microsoft JhengHei" w:hAnsi="Segoe UI"/>
+        </w:rPr>
+        <w:t xml:space="preserve">索引不含明細資料，只有讓 Claude 判斷「需要什麼」的資訊。以下是範例檔索引的一部分：</w:t>
+      </w:r>
+    </w:p>
+    <w:tbl>
+      <w:tblPr>
+        <w:tblW w:type="dxa" w:w="9026"/>
+        <w:tblBorders>
+          <w:top w:val="single" w:color="auto" w:sz="4"/>
+          <w:left w:val="single" w:color="auto" w:sz="4"/>
+          <w:bottom w:val="single" w:color="auto" w:sz="4"/>
+          <w:right w:val="single" w:color="auto" w:sz="4"/>
+          <w:insideH w:val="single" w:color="auto" w:sz="4"/>
+          <w:insideV w:val="single" w:color="auto" w:sz="4"/>
+        </w:tblBorders>
+      </w:tblPr>
+      <w:tblGrid>
+        <w:gridCol w:w="700"/>
+        <w:gridCol w:w="1500"/>
+        <w:gridCol w:w="900"/>
+        <w:gridCol w:w="1000"/>
+        <w:gridCol w:w="4926"/>
+      </w:tblGrid>
+      <w:tr>
+        <w:trPr>
+          <w:cantSplit/>
+          <w:tblHeader/>
+        </w:trPr>
+        <w:tc>
+          <w:tcPr>
+            <w:tcW w:type="dxa" w:w="700"/>
+            <w:tcBorders>
+              <w:top w:val="single" w:color="D0D0D0" w:sz="4"/>
+              <w:left w:val="single" w:color="D0D0D0" w:sz="4"/>
+              <w:bottom w:val="single" w:color="D0D0D0" w:sz="4"/>
+              <w:right w:val="single" w:color="D0D0D0" w:sz="4"/>
+            </w:tcBorders>
+            <w:shd w:fill="EEF3F9" w:color="auto" w:val="clear"/>
+            <w:tcMar>
+              <w:top w:type="dxa" w:w="80"/>
+              <w:left w:type="dxa" w:w="120"/>
+              <w:bottom w:type="dxa" w:w="80"/>
+              <w:right w:type="dxa" w:w="120"/>
+            </w:tcMar>
+          </w:tcPr>
+          <w:p>
+            <w:pPr>
+              <w:spacing w:after="0" w:line="280"/>
+            </w:pPr>
+            <w:r>
+              <w:rPr>
+                <w:rFonts w:ascii="Segoe UI" w:cs="Segoe UI" w:eastAsia="Microsoft JhengHei" w:hAnsi="Segoe UI"/>
+                <w:b/>
+                <w:bCs/>
+                <w:sz w:val="20"/>
+                <w:szCs w:val="20"/>
+              </w:rPr>
+              <w:t xml:space="preserve">欄</w:t>
+            </w:r>
+          </w:p>
+        </w:tc>
+        <w:tc>
+          <w:tcPr>
+            <w:tcW w:type="dxa" w:w="1500"/>
+            <w:tcBorders>
+              <w:top w:val="single" w:color="D0D0D0" w:sz="4"/>
+              <w:left w:val="single" w:color="D0D0D0" w:sz="4"/>
+              <w:bottom w:val="single" w:color="D0D0D0" w:sz="4"/>
+              <w:right w:val="single" w:color="D0D0D0" w:sz="4"/>
+            </w:tcBorders>
+            <w:shd w:fill="EEF3F9" w:color="auto" w:val="clear"/>
+            <w:tcMar>
+              <w:top w:type="dxa" w:w="80"/>
+              <w:left w:type="dxa" w:w="120"/>
+              <w:bottom w:type="dxa" w:w="80"/>
+              <w:right w:type="dxa" w:w="120"/>
+            </w:tcMar>
+          </w:tcPr>
+          <w:p>
+            <w:pPr>
+              <w:spacing w:after="0" w:line="280"/>
+            </w:pPr>
+            <w:r>
+              <w:rPr>
+                <w:rFonts w:ascii="Segoe UI" w:cs="Segoe UI" w:eastAsia="Microsoft JhengHei" w:hAnsi="Segoe UI"/>
+                <w:b/>
+                <w:bCs/>
+                <w:sz w:val="20"/>
+                <w:szCs w:val="20"/>
+              </w:rPr>
+              <w:t xml:space="preserve">名稱</w:t>
+            </w:r>
+          </w:p>
+        </w:tc>
+        <w:tc>
+          <w:tcPr>
+            <w:tcW w:type="dxa" w:w="900"/>
+            <w:tcBorders>
+              <w:top w:val="single" w:color="D0D0D0" w:sz="4"/>
+              <w:left w:val="single" w:color="D0D0D0" w:sz="4"/>
+              <w:bottom w:val="single" w:color="D0D0D0" w:sz="4"/>
+              <w:right w:val="single" w:color="D0D0D0" w:sz="4"/>
+            </w:tcBorders>
+            <w:shd w:fill="EEF3F9" w:color="auto" w:val="clear"/>
+            <w:tcMar>
+              <w:top w:type="dxa" w:w="80"/>
+              <w:left w:type="dxa" w:w="120"/>
+              <w:bottom w:type="dxa" w:w="80"/>
+              <w:right w:type="dxa" w:w="120"/>
+            </w:tcMar>
+          </w:tcPr>
+          <w:p>
+            <w:pPr>
+              <w:spacing w:after="0" w:line="280"/>
+            </w:pPr>
+            <w:r>
+              <w:rPr>
+                <w:rFonts w:ascii="Segoe UI" w:cs="Segoe UI" w:eastAsia="Microsoft JhengHei" w:hAnsi="Segoe UI"/>
+                <w:b/>
+                <w:bCs/>
+                <w:sz w:val="20"/>
+                <w:szCs w:val="20"/>
+              </w:rPr>
+              <w:t xml:space="preserve">類型</w:t>
+            </w:r>
+          </w:p>
+        </w:tc>
+        <w:tc>
+          <w:tcPr>
+            <w:tcW w:type="dxa" w:w="1000"/>
+            <w:tcBorders>
+              <w:top w:val="single" w:color="D0D0D0" w:sz="4"/>
+              <w:left w:val="single" w:color="D0D0D0" w:sz="4"/>
+              <w:bottom w:val="single" w:color="D0D0D0" w:sz="4"/>
+              <w:right w:val="single" w:color="D0D0D0" w:sz="4"/>
+            </w:tcBorders>
+            <w:shd w:fill="EEF3F9" w:color="auto" w:val="clear"/>
+            <w:tcMar>
+              <w:top w:type="dxa" w:w="80"/>
+              <w:left w:type="dxa" w:w="120"/>
+              <w:bottom w:type="dxa" w:w="80"/>
+              <w:right w:type="dxa" w:w="120"/>
+            </w:tcMar>
+          </w:tcPr>
+          <w:p>
+            <w:pPr>
+              <w:spacing w:after="0" w:line="280"/>
+            </w:pPr>
+            <w:r>
+              <w:rPr>
+                <w:rFonts w:ascii="Segoe UI" w:cs="Segoe UI" w:eastAsia="Microsoft JhengHei" w:hAnsi="Segoe UI"/>
+                <w:b/>
+                <w:bCs/>
+                <w:sz w:val="20"/>
+                <w:szCs w:val="20"/>
+              </w:rPr>
+              <w:t xml:space="preserve">非空</w:t>
+            </w:r>
+          </w:p>
+        </w:tc>
+        <w:tc>
+          <w:tcPr>
+            <w:tcW w:type="dxa" w:w="4926"/>
+            <w:tcBorders>
+              <w:top w:val="single" w:color="D0D0D0" w:sz="4"/>
+              <w:left w:val="single" w:color="D0D0D0" w:sz="4"/>
+              <w:bottom w:val="single" w:color="D0D0D0" w:sz="4"/>
+              <w:right w:val="single" w:color="D0D0D0" w:sz="4"/>
+            </w:tcBorders>
+            <w:shd w:fill="EEF3F9" w:color="auto" w:val="clear"/>
+            <w:tcMar>
+              <w:top w:type="dxa" w:w="80"/>
+              <w:left w:type="dxa" w:w="120"/>
+              <w:bottom w:type="dxa" w:w="80"/>
+              <w:right w:type="dxa" w:w="120"/>
+            </w:tcMar>
+          </w:tcPr>
+          <w:p>
+            <w:pPr>
+              <w:spacing w:after="0" w:line="280"/>
+            </w:pPr>
+            <w:r>
+              <w:rPr>
+                <w:rFonts w:ascii="Segoe UI" w:cs="Segoe UI" w:eastAsia="Microsoft JhengHei" w:hAnsi="Segoe UI"/>
+                <w:b/>
+                <w:bCs/>
+                <w:sz w:val="20"/>
+                <w:szCs w:val="20"/>
+              </w:rPr>
+              <w:t xml:space="preserve">統計（程式算好的）</w:t>
+            </w:r>
+          </w:p>
+        </w:tc>
+      </w:tr>
+      <w:tr>
+        <w:trPr>
+          <w:cantSplit/>
+          <w:tblHeader w:val="false"/>
+        </w:trPr>
+        <w:tc>
+          <w:tcPr>
+            <w:tcW w:type="dxa" w:w="700"/>
+            <w:tcBorders>
+              <w:top w:val="single" w:color="D0D0D0" w:sz="4"/>
+              <w:left w:val="single" w:color="D0D0D0" w:sz="4"/>
+              <w:bottom w:val="single" w:color="D0D0D0" w:sz="4"/>
+              <w:right w:val="single" w:color="D0D0D0" w:sz="4"/>
+            </w:tcBorders>
+            <w:tcMar>
+              <w:top w:type="dxa" w:w="80"/>
+              <w:left w:type="dxa" w:w="120"/>
+              <w:bottom w:type="dxa" w:w="80"/>
+              <w:right w:type="dxa" w:w="120"/>
+            </w:tcMar>
+          </w:tcPr>
+          <w:p>
+            <w:pPr>
+              <w:spacing w:after="0" w:line="280"/>
+            </w:pPr>
+            <w:r>
+              <w:rPr>
+                <w:rFonts w:ascii="Segoe UI" w:cs="Segoe UI" w:eastAsia="Microsoft JhengHei" w:hAnsi="Segoe UI"/>
+                <w:b w:val="false"/>
+                <w:bCs w:val="false"/>
+                <w:sz w:val="20"/>
+                <w:szCs w:val="20"/>
+              </w:rPr>
+              <w:t xml:space="preserve">A</w:t>
+            </w:r>
+          </w:p>
+        </w:tc>
+        <w:tc>
+          <w:tcPr>
+            <w:tcW w:type="dxa" w:w="1500"/>
+            <w:tcBorders>
+              <w:top w:val="single" w:color="D0D0D0" w:sz="4"/>
+              <w:left w:val="single" w:color="D0D0D0" w:sz="4"/>
+              <w:bottom w:val="single" w:color="D0D0D0" w:sz="4"/>
+              <w:right w:val="single" w:color="D0D0D0" w:sz="4"/>
+            </w:tcBorders>
+            <w:tcMar>
+              <w:top w:type="dxa" w:w="80"/>
+              <w:left w:type="dxa" w:w="120"/>
+              <w:bottom w:type="dxa" w:w="80"/>
+              <w:right w:type="dxa" w:w="120"/>
+            </w:tcMar>
+          </w:tcPr>
+          <w:p>
+            <w:pPr>
+              <w:spacing w:after="0" w:line="280"/>
+            </w:pPr>
+            <w:r>
+              <w:rPr>
+                <w:rFonts w:ascii="Segoe UI" w:cs="Segoe UI" w:eastAsia="Microsoft JhengHei" w:hAnsi="Segoe UI"/>
+                <w:b w:val="false"/>
+                <w:bCs w:val="false"/>
+                <w:sz w:val="20"/>
+                <w:szCs w:val="20"/>
+              </w:rPr>
+              <w:t xml:space="preserve">MPN</w:t>
+            </w:r>
+          </w:p>
+        </w:tc>
+        <w:tc>
+          <w:tcPr>
+            <w:tcW w:type="dxa" w:w="900"/>
+            <w:tcBorders>
+              <w:top w:val="single" w:color="D0D0D0" w:sz="4"/>
+              <w:left w:val="single" w:color="D0D0D0" w:sz="4"/>
+              <w:bottom w:val="single" w:color="D0D0D0" w:sz="4"/>
+              <w:right w:val="single" w:color="D0D0D0" w:sz="4"/>
+            </w:tcBorders>
+            <w:tcMar>
+              <w:top w:type="dxa" w:w="80"/>
+              <w:left w:type="dxa" w:w="120"/>
+              <w:bottom w:type="dxa" w:w="80"/>
+              <w:right w:type="dxa" w:w="120"/>
+            </w:tcMar>
+          </w:tcPr>
+          <w:p>
+            <w:pPr>
+              <w:spacing w:after="0" w:line="280"/>
+            </w:pPr>
+            <w:r>
+              <w:rPr>
+                <w:rFonts w:ascii="Segoe UI" w:cs="Segoe UI" w:eastAsia="Microsoft JhengHei" w:hAnsi="Segoe UI"/>
+                <w:b w:val="false"/>
+                <w:bCs w:val="false"/>
+                <w:sz w:val="20"/>
+                <w:szCs w:val="20"/>
+              </w:rPr>
+              <w:t xml:space="preserve">文字</w:t>
+            </w:r>
+          </w:p>
+        </w:tc>
+        <w:tc>
+          <w:tcPr>
+            <w:tcW w:type="dxa" w:w="1000"/>
+            <w:tcBorders>
+              <w:top w:val="single" w:color="D0D0D0" w:sz="4"/>
+              <w:left w:val="single" w:color="D0D0D0" w:sz="4"/>
+              <w:bottom w:val="single" w:color="D0D0D0" w:sz="4"/>
+              <w:right w:val="single" w:color="D0D0D0" w:sz="4"/>
+            </w:tcBorders>
+            <w:tcMar>
+              <w:top w:type="dxa" w:w="80"/>
+              <w:left w:type="dxa" w:w="120"/>
+              <w:bottom w:type="dxa" w:w="80"/>
+              <w:right w:type="dxa" w:w="120"/>
+            </w:tcMar>
+          </w:tcPr>
+          <w:p>
+            <w:pPr>
+              <w:spacing w:after="0" w:line="280"/>
+            </w:pPr>
+            <w:r>
+              <w:rPr>
+                <w:rFonts w:ascii="Segoe UI" w:cs="Segoe UI" w:eastAsia="Microsoft JhengHei" w:hAnsi="Segoe UI"/>
+                <w:b w:val="false"/>
+                <w:bCs w:val="false"/>
+                <w:sz w:val="20"/>
+                <w:szCs w:val="20"/>
+              </w:rPr>
+              <w:t xml:space="preserve">2,240</w:t>
+            </w:r>
+          </w:p>
+        </w:tc>
+        <w:tc>
+          <w:tcPr>
+            <w:tcW w:type="dxa" w:w="4926"/>
+            <w:tcBorders>
+              <w:top w:val="single" w:color="D0D0D0" w:sz="4"/>
+              <w:left w:val="single" w:color="D0D0D0" w:sz="4"/>
+              <w:bottom w:val="single" w:color="D0D0D0" w:sz="4"/>
+              <w:right w:val="single" w:color="D0D0D0" w:sz="4"/>
+            </w:tcBorders>
+            <w:tcMar>
+              <w:top w:type="dxa" w:w="80"/>
+              <w:left w:type="dxa" w:w="120"/>
+              <w:bottom w:type="dxa" w:w="80"/>
+              <w:right w:type="dxa" w:w="120"/>
+            </w:tcMar>
+          </w:tcPr>
+          <w:p>
+            <w:pPr>
+              <w:spacing w:after="0" w:line="280"/>
+            </w:pPr>
+            <w:r>
+              <w:rPr>
+                <w:rFonts w:ascii="Segoe UI" w:cs="Segoe UI" w:eastAsia="Microsoft JhengHei" w:hAnsi="Segoe UI"/>
+                <w:b w:val="false"/>
+                <w:bCs w:val="false"/>
+                <w:sz w:val="20"/>
+                <w:szCs w:val="20"/>
+              </w:rPr>
+              <w:t xml:space="preserve">160 個不同值；最多的是 PN-0000×14、PN-0001×14…</w:t>
+            </w:r>
+          </w:p>
+        </w:tc>
+      </w:tr>
+      <w:tr>
+        <w:trPr>
+          <w:cantSplit/>
+          <w:tblHeader w:val="false"/>
+        </w:trPr>
+        <w:tc>
+          <w:tcPr>
+            <w:tcW w:type="dxa" w:w="700"/>
+            <w:tcBorders>
+              <w:top w:val="single" w:color="D0D0D0" w:sz="4"/>
+              <w:left w:val="single" w:color="D0D0D0" w:sz="4"/>
+              <w:bottom w:val="single" w:color="D0D0D0" w:sz="4"/>
+              <w:right w:val="single" w:color="D0D0D0" w:sz="4"/>
+            </w:tcBorders>
+            <w:tcMar>
+              <w:top w:type="dxa" w:w="80"/>
+              <w:left w:type="dxa" w:w="120"/>
+              <w:bottom w:type="dxa" w:w="80"/>
+              <w:right w:type="dxa" w:w="120"/>
+            </w:tcMar>
+          </w:tcPr>
+          <w:p>
+            <w:pPr>
+              <w:spacing w:after="0" w:line="280"/>
+            </w:pPr>
+            <w:r>
+              <w:rPr>
+                <w:rFonts w:ascii="Segoe UI" w:cs="Segoe UI" w:eastAsia="Microsoft JhengHei" w:hAnsi="Segoe UI"/>
+                <w:b w:val="false"/>
+                <w:bCs w:val="false"/>
+                <w:sz w:val="20"/>
+                <w:szCs w:val="20"/>
+              </w:rPr>
+              <w:t xml:space="preserve">B</w:t>
+            </w:r>
+          </w:p>
+        </w:tc>
+        <w:tc>
+          <w:tcPr>
+            <w:tcW w:type="dxa" w:w="1500"/>
+            <w:tcBorders>
+              <w:top w:val="single" w:color="D0D0D0" w:sz="4"/>
+              <w:left w:val="single" w:color="D0D0D0" w:sz="4"/>
+              <w:bottom w:val="single" w:color="D0D0D0" w:sz="4"/>
+              <w:right w:val="single" w:color="D0D0D0" w:sz="4"/>
+            </w:tcBorders>
+            <w:tcMar>
+              <w:top w:type="dxa" w:w="80"/>
+              <w:left w:type="dxa" w:w="120"/>
+              <w:bottom w:type="dxa" w:w="80"/>
+              <w:right w:type="dxa" w:w="120"/>
+            </w:tcMar>
+          </w:tcPr>
+          <w:p>
+            <w:pPr>
+              <w:spacing w:after="0" w:line="280"/>
+            </w:pPr>
+            <w:r>
+              <w:rPr>
+                <w:rFonts w:ascii="Segoe UI" w:cs="Segoe UI" w:eastAsia="Microsoft JhengHei" w:hAnsi="Segoe UI"/>
+                <w:b w:val="false"/>
+                <w:bCs w:val="false"/>
+                <w:sz w:val="20"/>
+                <w:szCs w:val="20"/>
+              </w:rPr>
+              <w:t xml:space="preserve">Site</w:t>
+            </w:r>
+          </w:p>
+        </w:tc>
+        <w:tc>
+          <w:tcPr>
+            <w:tcW w:type="dxa" w:w="900"/>
+            <w:tcBorders>
+              <w:top w:val="single" w:color="D0D0D0" w:sz="4"/>
+              <w:left w:val="single" w:color="D0D0D0" w:sz="4"/>
+              <w:bottom w:val="single" w:color="D0D0D0" w:sz="4"/>
+              <w:right w:val="single" w:color="D0D0D0" w:sz="4"/>
+            </w:tcBorders>
+            <w:tcMar>
+              <w:top w:type="dxa" w:w="80"/>
+              <w:left w:type="dxa" w:w="120"/>
+              <w:bottom w:type="dxa" w:w="80"/>
+              <w:right w:type="dxa" w:w="120"/>
+            </w:tcMar>
+          </w:tcPr>
+          <w:p>
+            <w:pPr>
+              <w:spacing w:after="0" w:line="280"/>
+            </w:pPr>
+            <w:r>
+              <w:rPr>
+                <w:rFonts w:ascii="Segoe UI" w:cs="Segoe UI" w:eastAsia="Microsoft JhengHei" w:hAnsi="Segoe UI"/>
+                <w:b w:val="false"/>
+                <w:bCs w:val="false"/>
+                <w:sz w:val="20"/>
+                <w:szCs w:val="20"/>
+              </w:rPr>
+              <w:t xml:space="preserve">文字</w:t>
+            </w:r>
+          </w:p>
+        </w:tc>
+        <w:tc>
+          <w:tcPr>
+            <w:tcW w:type="dxa" w:w="1000"/>
+            <w:tcBorders>
+              <w:top w:val="single" w:color="D0D0D0" w:sz="4"/>
+              <w:left w:val="single" w:color="D0D0D0" w:sz="4"/>
+              <w:bottom w:val="single" w:color="D0D0D0" w:sz="4"/>
+              <w:right w:val="single" w:color="D0D0D0" w:sz="4"/>
+            </w:tcBorders>
+            <w:tcMar>
+              <w:top w:type="dxa" w:w="80"/>
+              <w:left w:type="dxa" w:w="120"/>
+              <w:bottom w:type="dxa" w:w="80"/>
+              <w:right w:type="dxa" w:w="120"/>
+            </w:tcMar>
+          </w:tcPr>
+          <w:p>
+            <w:pPr>
+              <w:spacing w:after="0" w:line="280"/>
+            </w:pPr>
+            <w:r>
+              <w:rPr>
+                <w:rFonts w:ascii="Segoe UI" w:cs="Segoe UI" w:eastAsia="Microsoft JhengHei" w:hAnsi="Segoe UI"/>
+                <w:b w:val="false"/>
+                <w:bCs w:val="false"/>
+                <w:sz w:val="20"/>
+                <w:szCs w:val="20"/>
+              </w:rPr>
+              <w:t xml:space="preserve">2,240</w:t>
+            </w:r>
+          </w:p>
+        </w:tc>
+        <w:tc>
+          <w:tcPr>
+            <w:tcW w:type="dxa" w:w="4926"/>
+            <w:tcBorders>
+              <w:top w:val="single" w:color="D0D0D0" w:sz="4"/>
+              <w:left w:val="single" w:color="D0D0D0" w:sz="4"/>
+              <w:bottom w:val="single" w:color="D0D0D0" w:sz="4"/>
+              <w:right w:val="single" w:color="D0D0D0" w:sz="4"/>
+            </w:tcBorders>
+            <w:tcMar>
+              <w:top w:type="dxa" w:w="80"/>
+              <w:left w:type="dxa" w:w="120"/>
+              <w:bottom w:type="dxa" w:w="80"/>
+              <w:right w:type="dxa" w:w="120"/>
+            </w:tcMar>
+          </w:tcPr>
+          <w:p>
+            <w:pPr>
+              <w:spacing w:after="0" w:line="280"/>
+            </w:pPr>
+            <w:r>
+              <w:rPr>
+                <w:rFonts w:ascii="Segoe UI" w:cs="Segoe UI" w:eastAsia="Microsoft JhengHei" w:hAnsi="Segoe UI"/>
+                <w:b w:val="false"/>
+                <w:bCs w:val="false"/>
+                <w:sz w:val="20"/>
+                <w:szCs w:val="20"/>
+              </w:rPr>
+              <w:t xml:space="preserve">VN×1260、TW×980</w:t>
+            </w:r>
+          </w:p>
+        </w:tc>
+      </w:tr>
+      <w:tr>
+        <w:trPr>
+          <w:cantSplit/>
+          <w:tblHeader w:val="false"/>
+        </w:trPr>
+        <w:tc>
+          <w:tcPr>
+            <w:tcW w:type="dxa" w:w="700"/>
+            <w:tcBorders>
+              <w:top w:val="single" w:color="D0D0D0" w:sz="4"/>
+              <w:left w:val="single" w:color="D0D0D0" w:sz="4"/>
+              <w:bottom w:val="single" w:color="D0D0D0" w:sz="4"/>
+              <w:right w:val="single" w:color="D0D0D0" w:sz="4"/>
+            </w:tcBorders>
+            <w:tcMar>
+              <w:top w:type="dxa" w:w="80"/>
+              <w:left w:type="dxa" w:w="120"/>
+              <w:bottom w:type="dxa" w:w="80"/>
+              <w:right w:type="dxa" w:w="120"/>
+            </w:tcMar>
+          </w:tcPr>
+          <w:p>
+            <w:pPr>
+              <w:spacing w:after="0" w:line="280"/>
+            </w:pPr>
+            <w:r>
+              <w:rPr>
+                <w:rFonts w:ascii="Segoe UI" w:cs="Segoe UI" w:eastAsia="Microsoft JhengHei" w:hAnsi="Segoe UI"/>
+                <w:b w:val="false"/>
+                <w:bCs w:val="false"/>
+                <w:sz w:val="20"/>
+                <w:szCs w:val="20"/>
+              </w:rPr>
+              <w:t xml:space="preserve">C</w:t>
+            </w:r>
+          </w:p>
+        </w:tc>
+        <w:tc>
+          <w:tcPr>
+            <w:tcW w:type="dxa" w:w="1500"/>
+            <w:tcBorders>
+              <w:top w:val="single" w:color="D0D0D0" w:sz="4"/>
+              <w:left w:val="single" w:color="D0D0D0" w:sz="4"/>
+              <w:bottom w:val="single" w:color="D0D0D0" w:sz="4"/>
+              <w:right w:val="single" w:color="D0D0D0" w:sz="4"/>
+            </w:tcBorders>
+            <w:tcMar>
+              <w:top w:type="dxa" w:w="80"/>
+              <w:left w:type="dxa" w:w="120"/>
+              <w:bottom w:type="dxa" w:w="80"/>
+              <w:right w:type="dxa" w:w="120"/>
+            </w:tcMar>
+          </w:tcPr>
+          <w:p>
+            <w:pPr>
+              <w:spacing w:after="0" w:line="280"/>
+            </w:pPr>
+            <w:r>
+              <w:rPr>
+                <w:rFonts w:ascii="Segoe UI" w:cs="Segoe UI" w:eastAsia="Microsoft JhengHei" w:hAnsi="Segoe UI"/>
+                <w:b w:val="false"/>
+                <w:bCs w:val="false"/>
+                <w:sz w:val="20"/>
+                <w:szCs w:val="20"/>
+              </w:rPr>
+              <w:t xml:space="preserve">Brand</w:t>
+            </w:r>
+          </w:p>
+        </w:tc>
+        <w:tc>
+          <w:tcPr>
+            <w:tcW w:type="dxa" w:w="900"/>
+            <w:tcBorders>
+              <w:top w:val="single" w:color="D0D0D0" w:sz="4"/>
+              <w:left w:val="single" w:color="D0D0D0" w:sz="4"/>
+              <w:bottom w:val="single" w:color="D0D0D0" w:sz="4"/>
+              <w:right w:val="single" w:color="D0D0D0" w:sz="4"/>
+            </w:tcBorders>
+            <w:tcMar>
+              <w:top w:type="dxa" w:w="80"/>
+              <w:left w:type="dxa" w:w="120"/>
+              <w:bottom w:type="dxa" w:w="80"/>
+              <w:right w:type="dxa" w:w="120"/>
+            </w:tcMar>
+          </w:tcPr>
+          <w:p>
+            <w:pPr>
+              <w:spacing w:after="0" w:line="280"/>
+            </w:pPr>
+            <w:r>
+              <w:rPr>
+                <w:rFonts w:ascii="Segoe UI" w:cs="Segoe UI" w:eastAsia="Microsoft JhengHei" w:hAnsi="Segoe UI"/>
+                <w:b w:val="false"/>
+                <w:bCs w:val="false"/>
+                <w:sz w:val="20"/>
+                <w:szCs w:val="20"/>
+              </w:rPr>
+              <w:t xml:space="preserve">文字</w:t>
+            </w:r>
+          </w:p>
+        </w:tc>
+        <w:tc>
+          <w:tcPr>
+            <w:tcW w:type="dxa" w:w="1000"/>
+            <w:tcBorders>
+              <w:top w:val="single" w:color="D0D0D0" w:sz="4"/>
+              <w:left w:val="single" w:color="D0D0D0" w:sz="4"/>
+              <w:bottom w:val="single" w:color="D0D0D0" w:sz="4"/>
+              <w:right w:val="single" w:color="D0D0D0" w:sz="4"/>
+            </w:tcBorders>
+            <w:tcMar>
+              <w:top w:type="dxa" w:w="80"/>
+              <w:left w:type="dxa" w:w="120"/>
+              <w:bottom w:type="dxa" w:w="80"/>
+              <w:right w:type="dxa" w:w="120"/>
+            </w:tcMar>
+          </w:tcPr>
+          <w:p>
+            <w:pPr>
+              <w:spacing w:after="0" w:line="280"/>
+            </w:pPr>
+            <w:r>
+              <w:rPr>
+                <w:rFonts w:ascii="Segoe UI" w:cs="Segoe UI" w:eastAsia="Microsoft JhengHei" w:hAnsi="Segoe UI"/>
+                <w:b w:val="false"/>
+                <w:bCs w:val="false"/>
+                <w:sz w:val="20"/>
+                <w:szCs w:val="20"/>
+              </w:rPr>
+              <w:t xml:space="preserve">2,240</w:t>
+            </w:r>
+          </w:p>
+        </w:tc>
+        <w:tc>
+          <w:tcPr>
+            <w:tcW w:type="dxa" w:w="4926"/>
+            <w:tcBorders>
+              <w:top w:val="single" w:color="D0D0D0" w:sz="4"/>
+              <w:left w:val="single" w:color="D0D0D0" w:sz="4"/>
+              <w:bottom w:val="single" w:color="D0D0D0" w:sz="4"/>
+              <w:right w:val="single" w:color="D0D0D0" w:sz="4"/>
+            </w:tcBorders>
+            <w:tcMar>
+              <w:top w:type="dxa" w:w="80"/>
+              <w:left w:type="dxa" w:w="120"/>
+              <w:bottom w:type="dxa" w:w="80"/>
+              <w:right w:type="dxa" w:w="120"/>
+            </w:tcMar>
+          </w:tcPr>
+          <w:p>
+            <w:pPr>
+              <w:spacing w:after="0" w:line="280"/>
+            </w:pPr>
+            <w:r>
+              <w:rPr>
+                <w:rFonts w:ascii="Segoe UI" w:cs="Segoe UI" w:eastAsia="Microsoft JhengHei" w:hAnsi="Segoe UI"/>
+                <w:b w:val="false"/>
+                <w:bCs w:val="false"/>
+                <w:sz w:val="20"/>
+                <w:szCs w:val="20"/>
+              </w:rPr>
+              <w:t xml:space="preserve">Brand C×826、Brand A×770、Brand B×644</w:t>
+            </w:r>
+          </w:p>
+        </w:tc>
+      </w:tr>
+      <w:tr>
+        <w:trPr>
+          <w:cantSplit/>
+          <w:tblHeader w:val="false"/>
+        </w:trPr>
+        <w:tc>
+          <w:tcPr>
+            <w:tcW w:type="dxa" w:w="700"/>
+            <w:tcBorders>
+              <w:top w:val="single" w:color="D0D0D0" w:sz="4"/>
+              <w:left w:val="single" w:color="D0D0D0" w:sz="4"/>
+              <w:bottom w:val="single" w:color="D0D0D0" w:sz="4"/>
+              <w:right w:val="single" w:color="D0D0D0" w:sz="4"/>
+            </w:tcBorders>
+            <w:tcMar>
+              <w:top w:type="dxa" w:w="80"/>
+              <w:left w:type="dxa" w:w="120"/>
+              <w:bottom w:type="dxa" w:w="80"/>
+              <w:right w:type="dxa" w:w="120"/>
+            </w:tcMar>
+          </w:tcPr>
+          <w:p>
+            <w:pPr>
+              <w:spacing w:after="0" w:line="280"/>
+            </w:pPr>
+            <w:r>
+              <w:rPr>
+                <w:rFonts w:ascii="Segoe UI" w:cs="Segoe UI" w:eastAsia="Microsoft JhengHei" w:hAnsi="Segoe UI"/>
+                <w:b w:val="false"/>
+                <w:bCs w:val="false"/>
+                <w:sz w:val="20"/>
+                <w:szCs w:val="20"/>
+              </w:rPr>
+              <w:t xml:space="preserve">D</w:t>
+            </w:r>
+          </w:p>
+        </w:tc>
+        <w:tc>
+          <w:tcPr>
+            <w:tcW w:type="dxa" w:w="1500"/>
+            <w:tcBorders>
+              <w:top w:val="single" w:color="D0D0D0" w:sz="4"/>
+              <w:left w:val="single" w:color="D0D0D0" w:sz="4"/>
+              <w:bottom w:val="single" w:color="D0D0D0" w:sz="4"/>
+              <w:right w:val="single" w:color="D0D0D0" w:sz="4"/>
+            </w:tcBorders>
+            <w:tcMar>
+              <w:top w:type="dxa" w:w="80"/>
+              <w:left w:type="dxa" w:w="120"/>
+              <w:bottom w:type="dxa" w:w="80"/>
+              <w:right w:type="dxa" w:w="120"/>
+            </w:tcMar>
+          </w:tcPr>
+          <w:p>
+            <w:pPr>
+              <w:spacing w:after="0" w:line="280"/>
+            </w:pPr>
+            <w:r>
+              <w:rPr>
+                <w:rFonts w:ascii="Segoe UI" w:cs="Segoe UI" w:eastAsia="Microsoft JhengHei" w:hAnsi="Segoe UI"/>
+                <w:b w:val="false"/>
+                <w:bCs w:val="false"/>
+                <w:sz w:val="20"/>
+                <w:szCs w:val="20"/>
+              </w:rPr>
+              <w:t xml:space="preserve">Version</w:t>
+            </w:r>
+          </w:p>
+        </w:tc>
+        <w:tc>
+          <w:tcPr>
+            <w:tcW w:type="dxa" w:w="900"/>
+            <w:tcBorders>
+              <w:top w:val="single" w:color="D0D0D0" w:sz="4"/>
+              <w:left w:val="single" w:color="D0D0D0" w:sz="4"/>
+              <w:bottom w:val="single" w:color="D0D0D0" w:sz="4"/>
+              <w:right w:val="single" w:color="D0D0D0" w:sz="4"/>
+            </w:tcBorders>
+            <w:tcMar>
+              <w:top w:type="dxa" w:w="80"/>
+              <w:left w:type="dxa" w:w="120"/>
+              <w:bottom w:type="dxa" w:w="80"/>
+              <w:right w:type="dxa" w:w="120"/>
+            </w:tcMar>
+          </w:tcPr>
+          <w:p>
+            <w:pPr>
+              <w:spacing w:after="0" w:line="280"/>
+            </w:pPr>
+            <w:r>
+              <w:rPr>
+                <w:rFonts w:ascii="Segoe UI" w:cs="Segoe UI" w:eastAsia="Microsoft JhengHei" w:hAnsi="Segoe UI"/>
+                <w:b w:val="false"/>
+                <w:bCs w:val="false"/>
+                <w:sz w:val="20"/>
+                <w:szCs w:val="20"/>
+              </w:rPr>
+              <w:t xml:space="preserve">文字</w:t>
+            </w:r>
+          </w:p>
+        </w:tc>
+        <w:tc>
+          <w:tcPr>
+            <w:tcW w:type="dxa" w:w="1000"/>
+            <w:tcBorders>
+              <w:top w:val="single" w:color="D0D0D0" w:sz="4"/>
+              <w:left w:val="single" w:color="D0D0D0" w:sz="4"/>
+              <w:bottom w:val="single" w:color="D0D0D0" w:sz="4"/>
+              <w:right w:val="single" w:color="D0D0D0" w:sz="4"/>
+            </w:tcBorders>
+            <w:tcMar>
+              <w:top w:type="dxa" w:w="80"/>
+              <w:left w:type="dxa" w:w="120"/>
+              <w:bottom w:type="dxa" w:w="80"/>
+              <w:right w:type="dxa" w:w="120"/>
+            </w:tcMar>
+          </w:tcPr>
+          <w:p>
+            <w:pPr>
+              <w:spacing w:after="0" w:line="280"/>
+            </w:pPr>
+            <w:r>
+              <w:rPr>
+                <w:rFonts w:ascii="Segoe UI" w:cs="Segoe UI" w:eastAsia="Microsoft JhengHei" w:hAnsi="Segoe UI"/>
+                <w:b w:val="false"/>
+                <w:bCs w:val="false"/>
+                <w:sz w:val="20"/>
+                <w:szCs w:val="20"/>
+              </w:rPr>
+              <w:t xml:space="preserve">2,240</w:t>
+            </w:r>
+          </w:p>
+        </w:tc>
+        <w:tc>
+          <w:tcPr>
+            <w:tcW w:type="dxa" w:w="4926"/>
+            <w:tcBorders>
+              <w:top w:val="single" w:color="D0D0D0" w:sz="4"/>
+              <w:left w:val="single" w:color="D0D0D0" w:sz="4"/>
+              <w:bottom w:val="single" w:color="D0D0D0" w:sz="4"/>
+              <w:right w:val="single" w:color="D0D0D0" w:sz="4"/>
+            </w:tcBorders>
+            <w:tcMar>
+              <w:top w:type="dxa" w:w="80"/>
+              <w:left w:type="dxa" w:w="120"/>
+              <w:bottom w:type="dxa" w:w="80"/>
+              <w:right w:type="dxa" w:w="120"/>
+            </w:tcMar>
+          </w:tcPr>
+          <w:p>
+            <w:pPr>
+              <w:spacing w:after="0" w:line="280"/>
+            </w:pPr>
+            <w:r>
+              <w:rPr>
+                <w:rFonts w:ascii="Segoe UI" w:cs="Segoe UI" w:eastAsia="Microsoft JhengHei" w:hAnsi="Segoe UI"/>
+                <w:b w:val="false"/>
+                <w:bCs w:val="false"/>
+                <w:sz w:val="20"/>
+                <w:szCs w:val="20"/>
+              </w:rPr>
+              <w:t xml:space="preserve">14 個不同值；2026/07/06×160、2026/07/13×160…</w:t>
+            </w:r>
+          </w:p>
+        </w:tc>
+      </w:tr>
+      <w:tr>
+        <w:trPr>
+          <w:cantSplit/>
+          <w:tblHeader w:val="false"/>
+        </w:trPr>
+        <w:tc>
+          <w:tcPr>
+            <w:tcW w:type="dxa" w:w="700"/>
+            <w:tcBorders>
+              <w:top w:val="single" w:color="D0D0D0" w:sz="4"/>
+              <w:left w:val="single" w:color="D0D0D0" w:sz="4"/>
+              <w:bottom w:val="single" w:color="D0D0D0" w:sz="4"/>
+              <w:right w:val="single" w:color="D0D0D0" w:sz="4"/>
+            </w:tcBorders>
+            <w:tcMar>
+              <w:top w:type="dxa" w:w="80"/>
+              <w:left w:type="dxa" w:w="120"/>
+              <w:bottom w:type="dxa" w:w="80"/>
+              <w:right w:type="dxa" w:w="120"/>
+            </w:tcMar>
+          </w:tcPr>
+          <w:p>
+            <w:pPr>
+              <w:spacing w:after="0" w:line="280"/>
+            </w:pPr>
+            <w:r>
+              <w:rPr>
+                <w:rFonts w:ascii="Segoe UI" w:cs="Segoe UI" w:eastAsia="Microsoft JhengHei" w:hAnsi="Segoe UI"/>
+                <w:b w:val="false"/>
+                <w:bCs w:val="false"/>
+                <w:sz w:val="20"/>
+                <w:szCs w:val="20"/>
+              </w:rPr>
+              <w:t xml:space="preserve">E:AE</w:t>
+            </w:r>
+          </w:p>
+        </w:tc>
+        <w:tc>
+          <w:tcPr>
+            <w:tcW w:type="dxa" w:w="1500"/>
+            <w:tcBorders>
+              <w:top w:val="single" w:color="D0D0D0" w:sz="4"/>
+              <w:left w:val="single" w:color="D0D0D0" w:sz="4"/>
+              <w:bottom w:val="single" w:color="D0D0D0" w:sz="4"/>
+              <w:right w:val="single" w:color="D0D0D0" w:sz="4"/>
+            </w:tcBorders>
+            <w:tcMar>
+              <w:top w:type="dxa" w:w="80"/>
+              <w:left w:type="dxa" w:w="120"/>
+              <w:bottom w:type="dxa" w:w="80"/>
+              <w:right w:type="dxa" w:w="120"/>
+            </w:tcMar>
+          </w:tcPr>
+          <w:p>
+            <w:pPr>
+              <w:spacing w:after="0" w:line="280"/>
+            </w:pPr>
+            <w:r>
+              <w:rPr>
+                <w:rFonts w:ascii="Segoe UI" w:cs="Segoe UI" w:eastAsia="Microsoft JhengHei" w:hAnsi="Segoe UI"/>
+                <w:b w:val="false"/>
+                <w:bCs w:val="false"/>
+                <w:sz w:val="20"/>
+                <w:szCs w:val="20"/>
+              </w:rPr>
+              <w:t xml:space="preserve">W01 … TTL（27 欄）</w:t>
+            </w:r>
+          </w:p>
+        </w:tc>
+        <w:tc>
+          <w:tcPr>
+            <w:tcW w:type="dxa" w:w="900"/>
+            <w:tcBorders>
+              <w:top w:val="single" w:color="D0D0D0" w:sz="4"/>
+              <w:left w:val="single" w:color="D0D0D0" w:sz="4"/>
+              <w:bottom w:val="single" w:color="D0D0D0" w:sz="4"/>
+              <w:right w:val="single" w:color="D0D0D0" w:sz="4"/>
+            </w:tcBorders>
+            <w:tcMar>
+              <w:top w:type="dxa" w:w="80"/>
+              <w:left w:type="dxa" w:w="120"/>
+              <w:bottom w:type="dxa" w:w="80"/>
+              <w:right w:type="dxa" w:w="120"/>
+            </w:tcMar>
+          </w:tcPr>
+          <w:p>
+            <w:pPr>
+              <w:spacing w:after="0" w:line="280"/>
+            </w:pPr>
+            <w:r>
+              <w:rPr>
+                <w:rFonts w:ascii="Segoe UI" w:cs="Segoe UI" w:eastAsia="Microsoft JhengHei" w:hAnsi="Segoe UI"/>
+                <w:b w:val="false"/>
+                <w:bCs w:val="false"/>
+                <w:sz w:val="20"/>
+                <w:szCs w:val="20"/>
+              </w:rPr>
+              <w:t xml:space="preserve">數值</w:t>
+            </w:r>
+          </w:p>
+        </w:tc>
+        <w:tc>
+          <w:tcPr>
+            <w:tcW w:type="dxa" w:w="1000"/>
+            <w:tcBorders>
+              <w:top w:val="single" w:color="D0D0D0" w:sz="4"/>
+              <w:left w:val="single" w:color="D0D0D0" w:sz="4"/>
+              <w:bottom w:val="single" w:color="D0D0D0" w:sz="4"/>
+              <w:right w:val="single" w:color="D0D0D0" w:sz="4"/>
+            </w:tcBorders>
+            <w:tcMar>
+              <w:top w:type="dxa" w:w="80"/>
+              <w:left w:type="dxa" w:w="120"/>
+              <w:bottom w:type="dxa" w:w="80"/>
+              <w:right w:type="dxa" w:w="120"/>
+            </w:tcMar>
+          </w:tcPr>
+          <w:p>
+            <w:pPr>
+              <w:spacing w:after="0" w:line="280"/>
+            </w:pPr>
+            <w:r>
+              <w:rPr>
+                <w:rFonts w:ascii="Segoe UI" w:cs="Segoe UI" w:eastAsia="Microsoft JhengHei" w:hAnsi="Segoe UI"/>
+                <w:b w:val="false"/>
+                <w:bCs w:val="false"/>
+                <w:sz w:val="20"/>
+                <w:szCs w:val="20"/>
+              </w:rPr>
+              <w:t xml:space="preserve">60,480</w:t>
+            </w:r>
+          </w:p>
+        </w:tc>
+        <w:tc>
+          <w:tcPr>
+            <w:tcW w:type="dxa" w:w="4926"/>
+            <w:tcBorders>
+              <w:top w:val="single" w:color="D0D0D0" w:sz="4"/>
+              <w:left w:val="single" w:color="D0D0D0" w:sz="4"/>
+              <w:bottom w:val="single" w:color="D0D0D0" w:sz="4"/>
+              <w:right w:val="single" w:color="D0D0D0" w:sz="4"/>
+            </w:tcBorders>
+            <w:tcMar>
+              <w:top w:type="dxa" w:w="80"/>
+              <w:left w:type="dxa" w:w="120"/>
+              <w:bottom w:type="dxa" w:w="80"/>
+              <w:right w:type="dxa" w:w="120"/>
+            </w:tcMar>
+          </w:tcPr>
+          <w:p>
+            <w:pPr>
+              <w:spacing w:after="0" w:line="280"/>
+            </w:pPr>
+            <w:r>
+              <w:rPr>
+                <w:rFonts w:ascii="Segoe UI" w:cs="Segoe UI" w:eastAsia="Microsoft JhengHei" w:hAnsi="Segoe UI"/>
+                <w:b w:val="false"/>
+                <w:bCs w:val="false"/>
+                <w:sz w:val="20"/>
+                <w:szCs w:val="20"/>
+              </w:rPr>
+              <w:t xml:space="preserve">整段最小 0，最大 887361；各欄合計：E 33384853、F 32885195…</w:t>
+            </w:r>
+          </w:p>
+        </w:tc>
+      </w:tr>
+    </w:tbl>
+    <w:p>
+      <w:pPr>
+        <w:spacing w:after="120" w:line="300"/>
+      </w:pPr>
+      <w:r>
+        <w:rPr>
+          <w:rFonts w:ascii="Segoe UI" w:cs="Segoe UI" w:eastAsia="Microsoft JhengHei" w:hAnsi="Segoe UI"/>
+        </w:rPr>
+        <w:t xml:space="preserve">同一頁還會寫出：</w:t>
+      </w:r>
+    </w:p>
+    <w:p>
+      <w:pPr>
+        <w:pBdr>
+          <w:left w:val="single" w:color="005FB8" w:sz="18" w:space="8"/>
+        </w:pBdr>
+        <w:shd w:fill="F4F7FB" w:color="auto" w:val="clear"/>
+        <w:spacing w:after="0" w:line="300"/>
+        <w:ind w:left="160" w:right="160"/>
+      </w:pPr>
+      <w:r>
+        <w:rPr>
+          <w:rFonts w:ascii="Segoe UI" w:cs="Segoe UI" w:eastAsia="Microsoft JhengHei" w:hAnsi="Segoe UI"/>
+        </w:rPr>
+        <w:t xml:space="preserve">版本欄：D 欄（Version），14 個版本（2026/07/06 ～ 2026/10/05），每版 160 列。同一個項目在每一版都有一列，跨版本相加沒有意義；只需要最新資料時，轉換器可以只轉最新一版或兩版。</w:t>
+      </w:r>
+    </w:p>
+    <w:p>
+      <w:pPr>
+        <w:spacing w:after="120"/>
+      </w:pPr>
+    </w:p>
+    <w:p>
+      <w:pPr>
+        <w:spacing w:after="120" w:line="300"/>
+      </w:pPr>
+      <w:r>
+        <w:rPr>
+          <w:rFonts w:ascii="Segoe UI" w:cs="Segoe UI" w:eastAsia="Microsoft JhengHei" w:hAnsi="Segoe UI"/>
+        </w:rPr>
+        <w:t xml:space="preserve">所以光看索引，Claude 就知道這份檔案有哪些料號、品牌和地點的分布、有幾個版本，也知道不能把不同版本的數字加在一起。</w:t>
+      </w:r>
+    </w:p>
+    <w:p>
+      <w:pPr>
+        <w:pStyle w:val="Heading2"/>
+        <w:spacing w:after="120" w:before="240"/>
+      </w:pPr>
+      <w:r>
+        <w:rPr>
+          <w:rFonts w:ascii="Segoe UI" w:cs="Segoe UI" w:eastAsia="Microsoft JhengHei" w:hAnsi="Segoe UI"/>
+        </w:rPr>
+        <w:t xml:space="preserve">7.4 資料檔裡寫了什麼</w:t>
+      </w:r>
+    </w:p>
+    <w:p>
+      <w:pPr>
+        <w:spacing w:after="120" w:line="300"/>
+      </w:pPr>
+      <w:r>
+        <w:rPr>
+          <w:rFonts w:ascii="Segoe UI" w:cs="Segoe UI" w:eastAsia="Microsoft JhengHei" w:hAnsi="Segoe UI"/>
+        </w:rPr>
+        <w:t xml:space="preserve">資料檔是 Tab 分隔的完整資料。以下是第 1 部分開頭的幾行（實際檔案裡是 Tab 字元，這裡用 │ 表示，只列前幾欄）：</w:t>
+      </w:r>
+    </w:p>
+    <w:p>
+      <w:pPr>
+        <w:shd w:fill="F5F5F5" w:color="auto" w:val="clear"/>
+        <w:spacing w:after="0" w:before="80" w:line="260"/>
+        <w:ind w:left="160" w:right="160"/>
+      </w:pPr>
+      <w:r>
+        <w:rPr>
+          <w:rFonts w:ascii="Consolas" w:cs="Consolas" w:eastAsia="Microsoft JhengHei" w:hAnsi="Consolas"/>
+          <w:sz w:val="17"/>
+          <w:szCs w:val="17"/>
+        </w:rPr>
+        <w:t xml:space="preserve">列│A      │B   │C      │D         │E    │F    │…│AE</w:t>
+      </w:r>
+    </w:p>
+    <w:p>
+      <w:pPr>
+        <w:shd w:fill="F5F5F5" w:color="auto" w:val="clear"/>
+        <w:spacing w:after="0" w:before="0" w:line="260"/>
+        <w:ind w:left="160" w:right="160"/>
+      </w:pPr>
+      <w:r>
+        <w:rPr>
+          <w:rFonts w:ascii="Consolas" w:cs="Consolas" w:eastAsia="Microsoft JhengHei" w:hAnsi="Consolas"/>
+          <w:sz w:val="17"/>
+          <w:szCs w:val="17"/>
+        </w:rPr>
+        <w:t xml:space="preserve">1 │MPN    │Site│Brand  │Version   │W01  │W02  │…│TTL</w:t>
+      </w:r>
+    </w:p>
+    <w:p>
+      <w:pPr>
+        <w:shd w:fill="F5F5F5" w:color="auto" w:val="clear"/>
+        <w:spacing w:after="0" w:before="0" w:line="260"/>
+        <w:ind w:left="160" w:right="160"/>
+      </w:pPr>
+      <w:r>
+        <w:rPr>
+          <w:rFonts w:ascii="Consolas" w:cs="Consolas" w:eastAsia="Microsoft JhengHei" w:hAnsi="Consolas"/>
+          <w:sz w:val="17"/>
+          <w:szCs w:val="17"/>
+        </w:rPr>
+        <w:t xml:space="preserve">2 │PN-0000│TW  │Brand C│2026/07/06│0    │79324│…│539564</w:t>
+      </w:r>
+    </w:p>
+    <w:p>
+      <w:pPr>
+        <w:shd w:fill="F5F5F5" w:color="auto" w:val="clear"/>
+        <w:spacing w:after="0" w:before="0" w:line="260"/>
+        <w:ind w:left="160" w:right="160"/>
+      </w:pPr>
+      <w:r>
+        <w:rPr>
+          <w:rFonts w:ascii="Consolas" w:cs="Consolas" w:eastAsia="Microsoft JhengHei" w:hAnsi="Consolas"/>
+          <w:sz w:val="17"/>
+          <w:szCs w:val="17"/>
+        </w:rPr>
+        <w:t xml:space="preserve">3 │PN-0001│TW  │Brand B│2026/07/06│0    │0    │…│353933</w:t>
+      </w:r>
+    </w:p>
+    <w:p>
+      <w:pPr>
+        <w:spacing w:after="160" w:before="60"/>
+      </w:pPr>
+      <w:r>
+        <w:rPr>
+          <w:rFonts w:ascii="Segoe UI" w:cs="Segoe UI" w:eastAsia="Microsoft JhengHei" w:hAnsi="Segoe UI"/>
+          <w:color w:val="5D5D5D"/>
+          <w:sz w:val="18"/>
+          <w:szCs w:val="18"/>
+        </w:rPr>
+        <w:t xml:space="preserve">每一行開頭是 Excel 列號，所以 Claude 可以指出「By MPN x Site!F2 是 79324」這樣的確切位置。</w:t>
+      </w:r>
+    </w:p>
+    <w:p>
+      <w:pPr>
+        <w:pStyle w:val="Heading2"/>
+        <w:spacing w:after="120" w:before="240"/>
+      </w:pPr>
+      <w:r>
+        <w:rPr>
+          <w:rFonts w:ascii="Segoe UI" w:cs="Segoe UI" w:eastAsia="Microsoft JhengHei" w:hAnsi="Segoe UI"/>
+        </w:rPr>
+        <w:t xml:space="preserve">7.5 版本欄與「只轉最新一版」</w:t>
+      </w:r>
+    </w:p>
+    <w:p>
+      <w:pPr>
+        <w:spacing w:after="120" w:line="300"/>
+      </w:pPr>
+      <w:r>
+        <w:rPr>
+          <w:rFonts w:ascii="Segoe UI" w:cs="Segoe UI" w:eastAsia="Microsoft JhengHei" w:hAnsi="Segoe UI"/>
+        </w:rPr>
+        <w:t xml:space="preserve">程式判斷一欄是不是版本欄，要同時符合三個條件：</w:t>
+      </w:r>
+    </w:p>
+    <w:p>
+      <w:pPr>
+        <w:pStyle w:val="ListParagraph"/>
+        <w:numPr>
+          <w:ilvl w:val="0"/>
+          <w:numId w:val="2"/>
+        </w:numPr>
+        <w:spacing w:after="80" w:line="300"/>
+      </w:pPr>
+      <w:r>
+        <w:rPr>
+          <w:rFonts w:ascii="Segoe UI" w:cs="Segoe UI" w:eastAsia="Microsoft JhengHei" w:hAnsi="Segoe UI"/>
+        </w:rPr>
+        <w:t xml:space="preserve">這一欄的值都是日期（例如 2026/10/05、2026-10-05 或 2026/10）。</w:t>
+      </w:r>
+    </w:p>
+    <w:p>
+      <w:pPr>
+        <w:pStyle w:val="ListParagraph"/>
+        <w:numPr>
+          <w:ilvl w:val="0"/>
+          <w:numId w:val="2"/>
+        </w:numPr>
+        <w:spacing w:after="80" w:line="300"/>
+      </w:pPr>
+      <w:r>
+        <w:rPr>
+          <w:rFonts w:ascii="Segoe UI" w:cs="Segoe UI" w:eastAsia="Microsoft JhengHei" w:hAnsi="Segoe UI"/>
+        </w:rPr>
+        <w:t xml:space="preserve">每個日期的列數差不多（每一版都包含同一批項目）。訂單日期、出貨日期每天筆數差很多，所以不會被選上。</w:t>
+      </w:r>
+    </w:p>
+    <w:p>
+      <w:pPr>
+        <w:pStyle w:val="ListParagraph"/>
+        <w:numPr>
+          <w:ilvl w:val="0"/>
+          <w:numId w:val="2"/>
+        </w:numPr>
+        <w:spacing w:after="80" w:line="300"/>
+      </w:pPr>
+      <w:r>
+        <w:rPr>
+          <w:rFonts w:ascii="Segoe UI" w:cs="Segoe UI" w:eastAsia="Microsoft JhengHei" w:hAnsi="Segoe UI"/>
+        </w:rPr>
+        <w:t xml:space="preserve">幾乎每一列都有值，而且至少有 3 個不同日期。</w:t>
+      </w:r>
+    </w:p>
+    <w:p>
+      <w:pPr>
+        <w:spacing w:after="120" w:line="300"/>
+      </w:pPr>
+      <w:r>
+        <w:rPr>
+          <w:rFonts w:ascii="Segoe UI" w:cs="Segoe UI" w:eastAsia="Microsoft JhengHei" w:hAnsi="Segoe UI"/>
+        </w:rPr>
+        <w:t xml:space="preserve">在卡片上按「只轉最新一版」，就會產生「範例 FCST Waterfall_最新1版.md」：只保留表頭和 2026/10/05 這一版的 160 列，約 15,400 token，而且是單一檔案，可以直接整個拖進 Claude。索引開頭會註明「只保留最新 1 版的列」，各欄的統計仍是整張工作表的結果。</w:t>
       </w:r>
     </w:p>
     <w:p>
@@ -1489,17 +4661,6 @@
     </w:p>
     <w:p>
       <w:pPr>
-        <w:spacing w:after="120" w:line="300"/>
-      </w:pPr>
-      <w:r>
-        <w:rPr>
-          <w:rFonts w:ascii="Segoe UI" w:cs="Segoe UI" w:eastAsia="Microsoft JhengHei" w:hAnsi="Segoe UI"/>
-        </w:rPr>
-        <w:t xml:space="preserve">說明：PO 日期、出貨日期這類每天筆數不一樣的日期欄，不會被當成版本欄。只有大檔案（全部超過約 3 萬 token）才會出現這兩個連結。</w:t>
-      </w:r>
-    </w:p>
-    <w:p>
-      <w:pPr>
         <w:pStyle w:val="Heading2"/>
         <w:spacing w:after="120" w:before="240"/>
       </w:pPr>
@@ -1507,91 +4668,7 @@
         <w:rPr>
           <w:rFonts w:ascii="Segoe UI" w:cs="Segoe UI" w:eastAsia="Microsoft JhengHei" w:hAnsi="Segoe UI"/>
         </w:rPr>
-        <w:t xml:space="preserve">3.6 面板底部</w:t>
-      </w:r>
-    </w:p>
-    <w:p>
-      <w:pPr>
-        <w:pStyle w:val="ListParagraph"/>
-        <w:numPr>
-          <w:ilvl w:val="0"/>
-          <w:numId w:val="2"/>
-        </w:numPr>
-        <w:spacing w:after="80" w:line="300"/>
-      </w:pPr>
-      <w:r>
-        <w:rPr>
-          <w:rFonts w:ascii="Segoe UI" w:cs="Segoe UI" w:eastAsia="Microsoft JhengHei" w:hAnsi="Segoe UI"/>
-          <w:b/>
-          <w:bCs/>
-        </w:rPr>
-        <w:t xml:space="preserve">設定說明</w:t>
-      </w:r>
-      <w:r>
-        <w:rPr>
-          <w:rFonts w:ascii="Segoe UI" w:cs="Segoe UI" w:eastAsia="Microsoft JhengHei" w:hAnsi="Segoe UI"/>
-        </w:rPr>
-        <w:t xml:space="preserve">：目前的 Excel 輸出方式和儲存位置。</w:t>
-      </w:r>
-    </w:p>
-    <w:p>
-      <w:pPr>
-        <w:pStyle w:val="ListParagraph"/>
-        <w:numPr>
-          <w:ilvl w:val="0"/>
-          <w:numId w:val="2"/>
-        </w:numPr>
-        <w:spacing w:after="80" w:line="300"/>
-      </w:pPr>
-      <w:r>
-        <w:rPr>
-          <w:rFonts w:ascii="Segoe UI" w:cs="Segoe UI" w:eastAsia="Microsoft JhengHei" w:hAnsi="Segoe UI"/>
-          <w:b/>
-          <w:bCs/>
-        </w:rPr>
-        <w:t xml:space="preserve">浮在其他視窗上方</w:t>
-      </w:r>
-      <w:r>
-        <w:rPr>
-          <w:rFonts w:ascii="Segoe UI" w:cs="Segoe UI" w:eastAsia="Microsoft JhengHei" w:hAnsi="Segoe UI"/>
-        </w:rPr>
-        <w:t xml:space="preserve">：預設開啟，方便把卡片拖到 Claude；不需要時可以關掉。</w:t>
-      </w:r>
-    </w:p>
-    <w:p>
-      <w:pPr>
-        <w:pStyle w:val="ListParagraph"/>
-        <w:numPr>
-          <w:ilvl w:val="0"/>
-          <w:numId w:val="2"/>
-        </w:numPr>
-        <w:spacing w:after="80" w:line="300"/>
-      </w:pPr>
-      <w:r>
-        <w:rPr>
-          <w:rFonts w:ascii="Segoe UI" w:cs="Segoe UI" w:eastAsia="Microsoft JhengHei" w:hAnsi="Segoe UI"/>
-          <w:b/>
-          <w:bCs/>
-        </w:rPr>
-        <w:t xml:space="preserve">更多</w:t>
-      </w:r>
-      <w:r>
-        <w:rPr>
-          <w:rFonts w:ascii="Segoe UI" w:cs="Segoe UI" w:eastAsia="Microsoft JhengHei" w:hAnsi="Segoe UI"/>
-        </w:rPr>
-        <w:t xml:space="preserve">：「轉換選項…」會打開主視窗調整選項；「複製 Claude 專案指示」見第 5 章。</w:t>
-      </w:r>
-    </w:p>
-    <w:p>
-      <w:pPr>
-        <w:pStyle w:val="Heading1"/>
-        <w:spacing w:after="160" w:before="360"/>
-      </w:pPr>
-      <w:r>
-        <w:rPr>
-          <w:rFonts w:ascii="Segoe UI" w:cs="Segoe UI" w:eastAsia="Microsoft JhengHei" w:hAnsi="Segoe UI"/>
-        </w:rPr>
-        <w:t xml:space="preserve">4. 怎麼上傳給 Claude 最省 token</w:t>
+        <w:t xml:space="preserve">7.6 依問題決定要給 Claude 什麼</w:t>
       </w:r>
     </w:p>
     <w:tbl>
@@ -1607,9 +4684,9 @@
         </w:tblBorders>
       </w:tblPr>
       <w:tblGrid>
-        <w:gridCol w:w="3000"/>
+        <w:gridCol w:w="3400"/>
         <w:gridCol w:w="3626"/>
-        <w:gridCol w:w="2400"/>
+        <w:gridCol w:w="2000"/>
       </w:tblGrid>
       <w:tr>
         <w:trPr>
@@ -1618,7 +4695,7 @@
         </w:trPr>
         <w:tc>
           <w:tcPr>
-            <w:tcW w:type="dxa" w:w="3000"/>
+            <w:tcW w:type="dxa" w:w="3400"/>
             <w:tcBorders>
               <w:top w:val="single" w:color="D0D0D0" w:sz="4"/>
               <w:left w:val="single" w:color="D0D0D0" w:sz="4"/>
@@ -1645,7 +4722,7 @@
                 <w:sz w:val="20"/>
                 <w:szCs w:val="20"/>
               </w:rPr>
-              <w:t xml:space="preserve">你的狀況</w:t>
+              <w:t xml:space="preserve">想問 Claude 的問題</w:t>
             </w:r>
           </w:p>
         </w:tc>
@@ -1678,13 +4755,13 @@
                 <w:sz w:val="20"/>
                 <w:szCs w:val="20"/>
               </w:rPr>
-              <w:t xml:space="preserve">怎麼做</w:t>
-            </w:r>
-          </w:p>
-        </w:tc>
-        <w:tc>
-          <w:tcPr>
-            <w:tcW w:type="dxa" w:w="2400"/>
+              <w:t xml:space="preserve">要給什麼</w:t>
+            </w:r>
+          </w:p>
+        </w:tc>
+        <w:tc>
+          <w:tcPr>
+            <w:tcW w:type="dxa" w:w="2000"/>
             <w:tcBorders>
               <w:top w:val="single" w:color="D0D0D0" w:sz="4"/>
               <w:left w:val="single" w:color="D0D0D0" w:sz="4"/>
@@ -1711,7 +4788,7 @@
                 <w:sz w:val="20"/>
                 <w:szCs w:val="20"/>
               </w:rPr>
-              <w:t xml:space="preserve">大約上傳量</w:t>
+              <w:t xml:space="preserve">大約 token</w:t>
             </w:r>
           </w:p>
         </w:tc>
@@ -1723,33 +4800,33 @@
         </w:trPr>
         <w:tc>
           <w:tcPr>
-            <w:tcW w:type="dxa" w:w="3000"/>
-            <w:tcBorders>
-              <w:top w:val="single" w:color="D0D0D0" w:sz="4"/>
-              <w:left w:val="single" w:color="D0D0D0" w:sz="4"/>
-              <w:bottom w:val="single" w:color="D0D0D0" w:sz="4"/>
-              <w:right w:val="single" w:color="D0D0D0" w:sz="4"/>
-            </w:tcBorders>
-            <w:tcMar>
-              <w:top w:type="dxa" w:w="80"/>
-              <w:left w:type="dxa" w:w="120"/>
-              <w:bottom w:type="dxa" w:w="80"/>
-              <w:right w:type="dxa" w:w="120"/>
-            </w:tcMar>
-          </w:tcPr>
-          <w:p>
-            <w:pPr>
-              <w:spacing w:after="0" w:line="280"/>
-            </w:pPr>
-            <w:r>
-              <w:rPr>
-                <w:rFonts w:ascii="Segoe UI" w:cs="Segoe UI" w:eastAsia="Microsoft JhengHei" w:hAnsi="Segoe UI"/>
-                <w:b w:val="false"/>
-                <w:bCs w:val="false"/>
-                <w:sz w:val="20"/>
-                <w:szCs w:val="20"/>
-              </w:rPr>
-              <w:t xml:space="preserve">小檔案（卡片上沒有「先拖這張就好」）</w:t>
+            <w:tcW w:type="dxa" w:w="3400"/>
+            <w:tcBorders>
+              <w:top w:val="single" w:color="D0D0D0" w:sz="4"/>
+              <w:left w:val="single" w:color="D0D0D0" w:sz="4"/>
+              <w:bottom w:val="single" w:color="D0D0D0" w:sz="4"/>
+              <w:right w:val="single" w:color="D0D0D0" w:sz="4"/>
+            </w:tcBorders>
+            <w:tcMar>
+              <w:top w:type="dxa" w:w="80"/>
+              <w:left w:type="dxa" w:w="120"/>
+              <w:bottom w:type="dxa" w:w="80"/>
+              <w:right w:type="dxa" w:w="120"/>
+            </w:tcMar>
+          </w:tcPr>
+          <w:p>
+            <w:pPr>
+              <w:spacing w:after="0" w:line="280"/>
+            </w:pPr>
+            <w:r>
+              <w:rPr>
+                <w:rFonts w:ascii="Segoe UI" w:cs="Segoe UI" w:eastAsia="Microsoft JhengHei" w:hAnsi="Segoe UI"/>
+                <w:b w:val="false"/>
+                <w:bCs w:val="false"/>
+                <w:sz w:val="20"/>
+                <w:szCs w:val="20"/>
+              </w:rPr>
+              <w:t xml:space="preserve">有哪些料號、品牌？各週需求合計是多少？</w:t>
             </w:r>
           </w:p>
         </w:tc>
@@ -1781,39 +4858,39 @@
                 <w:sz w:val="20"/>
                 <w:szCs w:val="20"/>
               </w:rPr>
-              <w:t xml:space="preserve">直接拖卡片進 Claude</w:t>
-            </w:r>
-          </w:p>
-        </w:tc>
-        <w:tc>
-          <w:tcPr>
-            <w:tcW w:type="dxa" w:w="2400"/>
-            <w:tcBorders>
-              <w:top w:val="single" w:color="D0D0D0" w:sz="4"/>
-              <w:left w:val="single" w:color="D0D0D0" w:sz="4"/>
-              <w:bottom w:val="single" w:color="D0D0D0" w:sz="4"/>
-              <w:right w:val="single" w:color="D0D0D0" w:sz="4"/>
-            </w:tcBorders>
-            <w:tcMar>
-              <w:top w:type="dxa" w:w="80"/>
-              <w:left w:type="dxa" w:w="120"/>
-              <w:bottom w:type="dxa" w:w="80"/>
-              <w:right w:type="dxa" w:w="120"/>
-            </w:tcMar>
-          </w:tcPr>
-          <w:p>
-            <w:pPr>
-              <w:spacing w:after="0" w:line="280"/>
-            </w:pPr>
-            <w:r>
-              <w:rPr>
-                <w:rFonts w:ascii="Segoe UI" w:cs="Segoe UI" w:eastAsia="Microsoft JhengHei" w:hAnsi="Segoe UI"/>
-                <w:b w:val="false"/>
-                <w:bCs w:val="false"/>
-                <w:sz w:val="20"/>
-                <w:szCs w:val="20"/>
-              </w:rPr>
-              <w:t xml:space="preserve">就是卡片上的 token 數</w:t>
+              <w:t xml:space="preserve">只給索引卡片</w:t>
+            </w:r>
+          </w:p>
+        </w:tc>
+        <w:tc>
+          <w:tcPr>
+            <w:tcW w:type="dxa" w:w="2000"/>
+            <w:tcBorders>
+              <w:top w:val="single" w:color="D0D0D0" w:sz="4"/>
+              <w:left w:val="single" w:color="D0D0D0" w:sz="4"/>
+              <w:bottom w:val="single" w:color="D0D0D0" w:sz="4"/>
+              <w:right w:val="single" w:color="D0D0D0" w:sz="4"/>
+            </w:tcBorders>
+            <w:tcMar>
+              <w:top w:type="dxa" w:w="80"/>
+              <w:left w:type="dxa" w:w="120"/>
+              <w:bottom w:type="dxa" w:w="80"/>
+              <w:right w:type="dxa" w:w="120"/>
+            </w:tcMar>
+          </w:tcPr>
+          <w:p>
+            <w:pPr>
+              <w:spacing w:after="0" w:line="280"/>
+            </w:pPr>
+            <w:r>
+              <w:rPr>
+                <w:rFonts w:ascii="Segoe UI" w:cs="Segoe UI" w:eastAsia="Microsoft JhengHei" w:hAnsi="Segoe UI"/>
+                <w:b w:val="false"/>
+                <w:bCs w:val="false"/>
+                <w:sz w:val="20"/>
+                <w:szCs w:val="20"/>
+              </w:rPr>
+              <w:t xml:space="preserve">1,300</w:t>
             </w:r>
           </w:p>
         </w:tc>
@@ -1825,33 +4902,33 @@
         </w:trPr>
         <w:tc>
           <w:tcPr>
-            <w:tcW w:type="dxa" w:w="3000"/>
-            <w:tcBorders>
-              <w:top w:val="single" w:color="D0D0D0" w:sz="4"/>
-              <w:left w:val="single" w:color="D0D0D0" w:sz="4"/>
-              <w:bottom w:val="single" w:color="D0D0D0" w:sz="4"/>
-              <w:right w:val="single" w:color="D0D0D0" w:sz="4"/>
-            </w:tcBorders>
-            <w:tcMar>
-              <w:top w:type="dxa" w:w="80"/>
-              <w:left w:type="dxa" w:w="120"/>
-              <w:bottom w:type="dxa" w:w="80"/>
-              <w:right w:type="dxa" w:w="120"/>
-            </w:tcMar>
-          </w:tcPr>
-          <w:p>
-            <w:pPr>
-              <w:spacing w:after="0" w:line="280"/>
-            </w:pPr>
-            <w:r>
-              <w:rPr>
-                <w:rFonts w:ascii="Segoe UI" w:cs="Segoe UI" w:eastAsia="Microsoft JhengHei" w:hAnsi="Segoe UI"/>
-                <w:b w:val="false"/>
-                <w:bCs w:val="false"/>
-                <w:sz w:val="20"/>
-                <w:szCs w:val="20"/>
-              </w:rPr>
-              <w:t xml:space="preserve">大檔案，問整體狀況、合計、有哪些欄位</w:t>
+            <w:tcW w:type="dxa" w:w="3400"/>
+            <w:tcBorders>
+              <w:top w:val="single" w:color="D0D0D0" w:sz="4"/>
+              <w:left w:val="single" w:color="D0D0D0" w:sz="4"/>
+              <w:bottom w:val="single" w:color="D0D0D0" w:sz="4"/>
+              <w:right w:val="single" w:color="D0D0D0" w:sz="4"/>
+            </w:tcBorders>
+            <w:tcMar>
+              <w:top w:type="dxa" w:w="80"/>
+              <w:left w:type="dxa" w:w="120"/>
+              <w:bottom w:type="dxa" w:w="80"/>
+              <w:right w:type="dxa" w:w="120"/>
+            </w:tcMar>
+          </w:tcPr>
+          <w:p>
+            <w:pPr>
+              <w:spacing w:after="0" w:line="280"/>
+            </w:pPr>
+            <w:r>
+              <w:rPr>
+                <w:rFonts w:ascii="Segoe UI" w:cs="Segoe UI" w:eastAsia="Microsoft JhengHei" w:hAnsi="Segoe UI"/>
+                <w:b w:val="false"/>
+                <w:bCs w:val="false"/>
+                <w:sz w:val="20"/>
+                <w:szCs w:val="20"/>
+              </w:rPr>
+              <w:t xml:space="preserve">PN-0012 這 14 版的預測怎麼變化？</w:t>
             </w:r>
           </w:p>
         </w:tc>
@@ -1883,39 +4960,39 @@
                 <w:sz w:val="20"/>
                 <w:szCs w:val="20"/>
               </w:rPr>
-              <w:t xml:space="preserve">只拖索引卡片</w:t>
-            </w:r>
-          </w:p>
-        </w:tc>
-        <w:tc>
-          <w:tcPr>
-            <w:tcW w:type="dxa" w:w="2400"/>
-            <w:tcBorders>
-              <w:top w:val="single" w:color="D0D0D0" w:sz="4"/>
-              <w:left w:val="single" w:color="D0D0D0" w:sz="4"/>
-              <w:bottom w:val="single" w:color="D0D0D0" w:sz="4"/>
-              <w:right w:val="single" w:color="D0D0D0" w:sz="4"/>
-            </w:tcBorders>
-            <w:tcMar>
-              <w:top w:type="dxa" w:w="80"/>
-              <w:left w:type="dxa" w:w="120"/>
-              <w:bottom w:type="dxa" w:w="80"/>
-              <w:right w:type="dxa" w:w="120"/>
-            </w:tcMar>
-          </w:tcPr>
-          <w:p>
-            <w:pPr>
-              <w:spacing w:after="0" w:line="280"/>
-            </w:pPr>
-            <w:r>
-              <w:rPr>
-                <w:rFonts w:ascii="Segoe UI" w:cs="Segoe UI" w:eastAsia="Microsoft JhengHei" w:hAnsi="Segoe UI"/>
-                <w:b w:val="false"/>
-                <w:bCs w:val="false"/>
-                <w:sz w:val="20"/>
-                <w:szCs w:val="20"/>
-              </w:rPr>
-              <w:t xml:space="preserve">幾千 token</w:t>
+              <w:t xml:space="preserve">用關鍵字「PN-0012」篩選後轉檔</w:t>
+            </w:r>
+          </w:p>
+        </w:tc>
+        <w:tc>
+          <w:tcPr>
+            <w:tcW w:type="dxa" w:w="2000"/>
+            <w:tcBorders>
+              <w:top w:val="single" w:color="D0D0D0" w:sz="4"/>
+              <w:left w:val="single" w:color="D0D0D0" w:sz="4"/>
+              <w:bottom w:val="single" w:color="D0D0D0" w:sz="4"/>
+              <w:right w:val="single" w:color="D0D0D0" w:sz="4"/>
+            </w:tcBorders>
+            <w:tcMar>
+              <w:top w:type="dxa" w:w="80"/>
+              <w:left w:type="dxa" w:w="120"/>
+              <w:bottom w:type="dxa" w:w="80"/>
+              <w:right w:type="dxa" w:w="120"/>
+            </w:tcMar>
+          </w:tcPr>
+          <w:p>
+            <w:pPr>
+              <w:spacing w:after="0" w:line="280"/>
+            </w:pPr>
+            <w:r>
+              <w:rPr>
+                <w:rFonts w:ascii="Segoe UI" w:cs="Segoe UI" w:eastAsia="Microsoft JhengHei" w:hAnsi="Segoe UI"/>
+                <w:b w:val="false"/>
+                <w:bCs w:val="false"/>
+                <w:sz w:val="20"/>
+                <w:szCs w:val="20"/>
+              </w:rPr>
+              <w:t xml:space="preserve">2,700</w:t>
             </w:r>
           </w:p>
         </w:tc>
@@ -1927,33 +5004,33 @@
         </w:trPr>
         <w:tc>
           <w:tcPr>
-            <w:tcW w:type="dxa" w:w="3000"/>
-            <w:tcBorders>
-              <w:top w:val="single" w:color="D0D0D0" w:sz="4"/>
-              <w:left w:val="single" w:color="D0D0D0" w:sz="4"/>
-              <w:bottom w:val="single" w:color="D0D0D0" w:sz="4"/>
-              <w:right w:val="single" w:color="D0D0D0" w:sz="4"/>
-            </w:tcBorders>
-            <w:tcMar>
-              <w:top w:type="dxa" w:w="80"/>
-              <w:left w:type="dxa" w:w="120"/>
-              <w:bottom w:type="dxa" w:w="80"/>
-              <w:right w:type="dxa" w:w="120"/>
-            </w:tcMar>
-          </w:tcPr>
-          <w:p>
-            <w:pPr>
-              <w:spacing w:after="0" w:line="280"/>
-            </w:pPr>
-            <w:r>
-              <w:rPr>
-                <w:rFonts w:ascii="Segoe UI" w:cs="Segoe UI" w:eastAsia="Microsoft JhengHei" w:hAnsi="Segoe UI"/>
-                <w:b w:val="false"/>
-                <w:bCs w:val="false"/>
-                <w:sz w:val="20"/>
-                <w:szCs w:val="20"/>
-              </w:rPr>
-              <w:t xml:space="preserve">大檔案，需要某張工作表的明細</w:t>
+            <w:tcW w:type="dxa" w:w="3400"/>
+            <w:tcBorders>
+              <w:top w:val="single" w:color="D0D0D0" w:sz="4"/>
+              <w:left w:val="single" w:color="D0D0D0" w:sz="4"/>
+              <w:bottom w:val="single" w:color="D0D0D0" w:sz="4"/>
+              <w:right w:val="single" w:color="D0D0D0" w:sz="4"/>
+            </w:tcBorders>
+            <w:tcMar>
+              <w:top w:type="dxa" w:w="80"/>
+              <w:left w:type="dxa" w:w="120"/>
+              <w:bottom w:type="dxa" w:w="80"/>
+              <w:right w:type="dxa" w:w="120"/>
+            </w:tcMar>
+          </w:tcPr>
+          <w:p>
+            <w:pPr>
+              <w:spacing w:after="0" w:line="280"/>
+            </w:pPr>
+            <w:r>
+              <w:rPr>
+                <w:rFonts w:ascii="Segoe UI" w:cs="Segoe UI" w:eastAsia="Microsoft JhengHei" w:hAnsi="Segoe UI"/>
+                <w:b w:val="false"/>
+                <w:bCs w:val="false"/>
+                <w:sz w:val="20"/>
+                <w:szCs w:val="20"/>
+              </w:rPr>
+              <w:t xml:space="preserve">這週（最新一版）的預測是多少？</w:t>
             </w:r>
           </w:p>
         </w:tc>
@@ -1985,39 +5062,39 @@
                 <w:sz w:val="20"/>
                 <w:szCs w:val="20"/>
               </w:rPr>
-              <w:t xml:space="preserve">先給索引；Claude 說要哪個檔，再從 _md 資料夾上傳那一個</w:t>
-            </w:r>
-          </w:p>
-        </w:tc>
-        <w:tc>
-          <w:tcPr>
-            <w:tcW w:type="dxa" w:w="2400"/>
-            <w:tcBorders>
-              <w:top w:val="single" w:color="D0D0D0" w:sz="4"/>
-              <w:left w:val="single" w:color="D0D0D0" w:sz="4"/>
-              <w:bottom w:val="single" w:color="D0D0D0" w:sz="4"/>
-              <w:right w:val="single" w:color="D0D0D0" w:sz="4"/>
-            </w:tcBorders>
-            <w:tcMar>
-              <w:top w:type="dxa" w:w="80"/>
-              <w:left w:type="dxa" w:w="120"/>
-              <w:bottom w:type="dxa" w:w="80"/>
-              <w:right w:type="dxa" w:w="120"/>
-            </w:tcMar>
-          </w:tcPr>
-          <w:p>
-            <w:pPr>
-              <w:spacing w:after="0" w:line="280"/>
-            </w:pPr>
-            <w:r>
-              <w:rPr>
-                <w:rFonts w:ascii="Segoe UI" w:cs="Segoe UI" w:eastAsia="Microsoft JhengHei" w:hAnsi="Segoe UI"/>
-                <w:b w:val="false"/>
-                <w:bCs w:val="false"/>
-                <w:sz w:val="20"/>
-                <w:szCs w:val="20"/>
-              </w:rPr>
-              <w:t xml:space="preserve">每個資料檔最多約 10 萬</w:t>
+              <w:t xml:space="preserve">按「只轉最新一版」</w:t>
+            </w:r>
+          </w:p>
+        </w:tc>
+        <w:tc>
+          <w:tcPr>
+            <w:tcW w:type="dxa" w:w="2000"/>
+            <w:tcBorders>
+              <w:top w:val="single" w:color="D0D0D0" w:sz="4"/>
+              <w:left w:val="single" w:color="D0D0D0" w:sz="4"/>
+              <w:bottom w:val="single" w:color="D0D0D0" w:sz="4"/>
+              <w:right w:val="single" w:color="D0D0D0" w:sz="4"/>
+            </w:tcBorders>
+            <w:tcMar>
+              <w:top w:type="dxa" w:w="80"/>
+              <w:left w:type="dxa" w:w="120"/>
+              <w:bottom w:type="dxa" w:w="80"/>
+              <w:right w:type="dxa" w:w="120"/>
+            </w:tcMar>
+          </w:tcPr>
+          <w:p>
+            <w:pPr>
+              <w:spacing w:after="0" w:line="280"/>
+            </w:pPr>
+            <w:r>
+              <w:rPr>
+                <w:rFonts w:ascii="Segoe UI" w:cs="Segoe UI" w:eastAsia="Microsoft JhengHei" w:hAnsi="Segoe UI"/>
+                <w:b w:val="false"/>
+                <w:bCs w:val="false"/>
+                <w:sz w:val="20"/>
+                <w:szCs w:val="20"/>
+              </w:rPr>
+              <w:t xml:space="preserve">15,400</w:t>
             </w:r>
           </w:p>
         </w:tc>
@@ -2029,33 +5106,33 @@
         </w:trPr>
         <w:tc>
           <w:tcPr>
-            <w:tcW w:type="dxa" w:w="3000"/>
-            <w:tcBorders>
-              <w:top w:val="single" w:color="D0D0D0" w:sz="4"/>
-              <w:left w:val="single" w:color="D0D0D0" w:sz="4"/>
-              <w:bottom w:val="single" w:color="D0D0D0" w:sz="4"/>
-              <w:right w:val="single" w:color="D0D0D0" w:sz="4"/>
-            </w:tcBorders>
-            <w:tcMar>
-              <w:top w:type="dxa" w:w="80"/>
-              <w:left w:type="dxa" w:w="120"/>
-              <w:bottom w:type="dxa" w:w="80"/>
-              <w:right w:type="dxa" w:w="120"/>
-            </w:tcMar>
-          </w:tcPr>
-          <w:p>
-            <w:pPr>
-              <w:spacing w:after="0" w:line="280"/>
-            </w:pPr>
-            <w:r>
-              <w:rPr>
-                <w:rFonts w:ascii="Segoe UI" w:cs="Segoe UI" w:eastAsia="Microsoft JhengHei" w:hAnsi="Segoe UI"/>
-                <w:b w:val="false"/>
-                <w:bCs w:val="false"/>
-                <w:sz w:val="20"/>
-                <w:szCs w:val="20"/>
-              </w:rPr>
-              <w:t xml:space="preserve">預測瀑布表，問這週或這週和上週</w:t>
+            <w:tcW w:type="dxa" w:w="3400"/>
+            <w:tcBorders>
+              <w:top w:val="single" w:color="D0D0D0" w:sz="4"/>
+              <w:left w:val="single" w:color="D0D0D0" w:sz="4"/>
+              <w:bottom w:val="single" w:color="D0D0D0" w:sz="4"/>
+              <w:right w:val="single" w:color="D0D0D0" w:sz="4"/>
+            </w:tcBorders>
+            <w:tcMar>
+              <w:top w:type="dxa" w:w="80"/>
+              <w:left w:type="dxa" w:w="120"/>
+              <w:bottom w:type="dxa" w:w="80"/>
+              <w:right w:type="dxa" w:w="120"/>
+            </w:tcMar>
+          </w:tcPr>
+          <w:p>
+            <w:pPr>
+              <w:spacing w:after="0" w:line="280"/>
+            </w:pPr>
+            <w:r>
+              <w:rPr>
+                <w:rFonts w:ascii="Segoe UI" w:cs="Segoe UI" w:eastAsia="Microsoft JhengHei" w:hAnsi="Segoe UI"/>
+                <w:b w:val="false"/>
+                <w:bCs w:val="false"/>
+                <w:sz w:val="20"/>
+                <w:szCs w:val="20"/>
+              </w:rPr>
+              <w:t xml:space="preserve">這週和上週比，哪些料號變化最大？</w:t>
             </w:r>
           </w:p>
         </w:tc>
@@ -2087,39 +5164,39 @@
                 <w:sz w:val="20"/>
                 <w:szCs w:val="20"/>
               </w:rPr>
-              <w:t xml:space="preserve">按「只轉最新一版」或「只轉最新 2 版」</w:t>
-            </w:r>
-          </w:p>
-        </w:tc>
-        <w:tc>
-          <w:tcPr>
-            <w:tcW w:type="dxa" w:w="2400"/>
-            <w:tcBorders>
-              <w:top w:val="single" w:color="D0D0D0" w:sz="4"/>
-              <w:left w:val="single" w:color="D0D0D0" w:sz="4"/>
-              <w:bottom w:val="single" w:color="D0D0D0" w:sz="4"/>
-              <w:right w:val="single" w:color="D0D0D0" w:sz="4"/>
-            </w:tcBorders>
-            <w:tcMar>
-              <w:top w:type="dxa" w:w="80"/>
-              <w:left w:type="dxa" w:w="120"/>
-              <w:bottom w:type="dxa" w:w="80"/>
-              <w:right w:type="dxa" w:w="120"/>
-            </w:tcMar>
-          </w:tcPr>
-          <w:p>
-            <w:pPr>
-              <w:spacing w:after="0" w:line="280"/>
-            </w:pPr>
-            <w:r>
-              <w:rPr>
-                <w:rFonts w:ascii="Segoe UI" w:cs="Segoe UI" w:eastAsia="Microsoft JhengHei" w:hAnsi="Segoe UI"/>
-                <w:b w:val="false"/>
-                <w:bCs w:val="false"/>
-                <w:sz w:val="20"/>
-                <w:szCs w:val="20"/>
-              </w:rPr>
-              <w:t xml:space="preserve">通常是全部的 1/10 以下</w:t>
+              <w:t xml:space="preserve">按「只轉最新 2 版」</w:t>
+            </w:r>
+          </w:p>
+        </w:tc>
+        <w:tc>
+          <w:tcPr>
+            <w:tcW w:type="dxa" w:w="2000"/>
+            <w:tcBorders>
+              <w:top w:val="single" w:color="D0D0D0" w:sz="4"/>
+              <w:left w:val="single" w:color="D0D0D0" w:sz="4"/>
+              <w:bottom w:val="single" w:color="D0D0D0" w:sz="4"/>
+              <w:right w:val="single" w:color="D0D0D0" w:sz="4"/>
+            </w:tcBorders>
+            <w:tcMar>
+              <w:top w:type="dxa" w:w="80"/>
+              <w:left w:type="dxa" w:w="120"/>
+              <w:bottom w:type="dxa" w:w="80"/>
+              <w:right w:type="dxa" w:w="120"/>
+            </w:tcMar>
+          </w:tcPr>
+          <w:p>
+            <w:pPr>
+              <w:spacing w:after="0" w:line="280"/>
+            </w:pPr>
+            <w:r>
+              <w:rPr>
+                <w:rFonts w:ascii="Segoe UI" w:cs="Segoe UI" w:eastAsia="Microsoft JhengHei" w:hAnsi="Segoe UI"/>
+                <w:b w:val="false"/>
+                <w:bCs w:val="false"/>
+                <w:sz w:val="20"/>
+                <w:szCs w:val="20"/>
+              </w:rPr>
+              <w:t xml:space="preserve">29,300</w:t>
             </w:r>
           </w:p>
         </w:tc>
@@ -2131,33 +5208,33 @@
         </w:trPr>
         <w:tc>
           <w:tcPr>
-            <w:tcW w:type="dxa" w:w="3000"/>
-            <w:tcBorders>
-              <w:top w:val="single" w:color="D0D0D0" w:sz="4"/>
-              <w:left w:val="single" w:color="D0D0D0" w:sz="4"/>
-              <w:bottom w:val="single" w:color="D0D0D0" w:sz="4"/>
-              <w:right w:val="single" w:color="D0D0D0" w:sz="4"/>
-            </w:tcBorders>
-            <w:tcMar>
-              <w:top w:type="dxa" w:w="80"/>
-              <w:left w:type="dxa" w:w="120"/>
-              <w:bottom w:type="dxa" w:w="80"/>
-              <w:right w:type="dxa" w:w="120"/>
-            </w:tcMar>
-          </w:tcPr>
-          <w:p>
-            <w:pPr>
-              <w:spacing w:after="0" w:line="280"/>
-            </w:pPr>
-            <w:r>
-              <w:rPr>
-                <w:rFonts w:ascii="Segoe UI" w:cs="Segoe UI" w:eastAsia="Microsoft JhengHei" w:hAnsi="Segoe UI"/>
-                <w:b w:val="false"/>
-                <w:bCs w:val="false"/>
-                <w:sz w:val="20"/>
-                <w:szCs w:val="20"/>
-              </w:rPr>
-              <w:t xml:space="preserve">只問某個料號或客戶</w:t>
+            <w:tcW w:type="dxa" w:w="3400"/>
+            <w:tcBorders>
+              <w:top w:val="single" w:color="D0D0D0" w:sz="4"/>
+              <w:left w:val="single" w:color="D0D0D0" w:sz="4"/>
+              <w:bottom w:val="single" w:color="D0D0D0" w:sz="4"/>
+              <w:right w:val="single" w:color="D0D0D0" w:sz="4"/>
+            </w:tcBorders>
+            <w:tcMar>
+              <w:top w:type="dxa" w:w="80"/>
+              <w:left w:type="dxa" w:w="120"/>
+              <w:bottom w:type="dxa" w:w="80"/>
+              <w:right w:type="dxa" w:w="120"/>
+            </w:tcMar>
+          </w:tcPr>
+          <w:p>
+            <w:pPr>
+              <w:spacing w:after="0" w:line="280"/>
+            </w:pPr>
+            <w:r>
+              <w:rPr>
+                <w:rFonts w:ascii="Segoe UI" w:cs="Segoe UI" w:eastAsia="Microsoft JhengHei" w:hAnsi="Segoe UI"/>
+                <w:b w:val="false"/>
+                <w:bCs w:val="false"/>
+                <w:sz w:val="20"/>
+                <w:szCs w:val="20"/>
+              </w:rPr>
+              <w:t xml:space="preserve">全部 14 版的完整趨勢分析</w:t>
             </w:r>
           </w:p>
         </w:tc>
@@ -2189,39 +5266,39 @@
                 <w:sz w:val="20"/>
                 <w:szCs w:val="20"/>
               </w:rPr>
-              <w:t xml:space="preserve">在「轉換選項…」設定關鍵字篩選後重新轉</w:t>
-            </w:r>
-          </w:p>
-        </w:tc>
-        <w:tc>
-          <w:tcPr>
-            <w:tcW w:type="dxa" w:w="2400"/>
-            <w:tcBorders>
-              <w:top w:val="single" w:color="D0D0D0" w:sz="4"/>
-              <w:left w:val="single" w:color="D0D0D0" w:sz="4"/>
-              <w:bottom w:val="single" w:color="D0D0D0" w:sz="4"/>
-              <w:right w:val="single" w:color="D0D0D0" w:sz="4"/>
-            </w:tcBorders>
-            <w:tcMar>
-              <w:top w:type="dxa" w:w="80"/>
-              <w:left w:type="dxa" w:w="120"/>
-              <w:bottom w:type="dxa" w:w="80"/>
-              <w:right w:type="dxa" w:w="120"/>
-            </w:tcMar>
-          </w:tcPr>
-          <w:p>
-            <w:pPr>
-              <w:spacing w:after="0" w:line="280"/>
-            </w:pPr>
-            <w:r>
-              <w:rPr>
-                <w:rFonts w:ascii="Segoe UI" w:cs="Segoe UI" w:eastAsia="Microsoft JhengHei" w:hAnsi="Segoe UI"/>
-                <w:b w:val="false"/>
-                <w:bCs w:val="false"/>
-                <w:sz w:val="20"/>
-                <w:szCs w:val="20"/>
-              </w:rPr>
-              <w:t xml:space="preserve">通常幾千到幾萬</w:t>
+              <w:t xml:space="preserve">先給索引，再依 Claude 指示分次上傳 2 個資料檔</w:t>
+            </w:r>
+          </w:p>
+        </w:tc>
+        <w:tc>
+          <w:tcPr>
+            <w:tcW w:type="dxa" w:w="2000"/>
+            <w:tcBorders>
+              <w:top w:val="single" w:color="D0D0D0" w:sz="4"/>
+              <w:left w:val="single" w:color="D0D0D0" w:sz="4"/>
+              <w:bottom w:val="single" w:color="D0D0D0" w:sz="4"/>
+              <w:right w:val="single" w:color="D0D0D0" w:sz="4"/>
+            </w:tcBorders>
+            <w:tcMar>
+              <w:top w:type="dxa" w:w="80"/>
+              <w:left w:type="dxa" w:w="120"/>
+              <w:bottom w:type="dxa" w:w="80"/>
+              <w:right w:type="dxa" w:w="120"/>
+            </w:tcMar>
+          </w:tcPr>
+          <w:p>
+            <w:pPr>
+              <w:spacing w:after="0" w:line="280"/>
+            </w:pPr>
+            <w:r>
+              <w:rPr>
+                <w:rFonts w:ascii="Segoe UI" w:cs="Segoe UI" w:eastAsia="Microsoft JhengHei" w:hAnsi="Segoe UI"/>
+                <w:b w:val="false"/>
+                <w:bCs w:val="false"/>
+                <w:sz w:val="20"/>
+                <w:szCs w:val="20"/>
+              </w:rPr>
+              <w:t xml:space="preserve">195,000（分兩次）</w:t>
             </w:r>
           </w:p>
         </w:tc>
@@ -2229,197 +5306,14 @@
     </w:tbl>
     <w:p>
       <w:pPr>
-        <w:spacing w:after="160"/>
-      </w:pPr>
-      <w:r>
-        <w:rPr>
-          <w:rFonts w:ascii="Segoe UI" w:cs="Segoe UI" w:eastAsia="Microsoft JhengHei" w:hAnsi="Segoe UI"/>
-        </w:rPr>
-        <w:t xml:space="preserve"/>
-      </w:r>
-    </w:p>
-    <w:p>
-      <w:pPr>
-        <w:spacing w:after="120" w:line="300"/>
-      </w:pPr>
-      <w:r>
-        <w:rPr>
-          <w:rFonts w:ascii="Segoe UI" w:cs="Segoe UI" w:eastAsia="Microsoft JhengHei" w:hAnsi="Segoe UI"/>
-          <w:b/>
-          <w:bCs/>
-        </w:rPr>
-        <w:t xml:space="preserve">五個原則</w:t>
-      </w:r>
-    </w:p>
-    <w:p>
-      <w:pPr>
-        <w:pStyle w:val="ListParagraph"/>
-        <w:numPr>
-          <w:ilvl w:val="0"/>
-          <w:numId w:val="4"/>
-        </w:numPr>
-        <w:spacing w:after="80" w:line="300"/>
-      </w:pPr>
-      <w:r>
-        <w:rPr>
-          <w:rFonts w:ascii="Segoe UI" w:cs="Segoe UI" w:eastAsia="Microsoft JhengHei" w:hAnsi="Segoe UI"/>
-          <w:b/>
-          <w:bCs/>
-        </w:rPr>
-        <w:t xml:space="preserve">不要把整個資料夾打包上傳。</w:t>
-      </w:r>
-      <w:r>
-        <w:rPr>
-          <w:rFonts w:ascii="Segoe UI" w:cs="Segoe UI" w:eastAsia="Microsoft JhengHei" w:hAnsi="Segoe UI"/>
-        </w:rPr>
-        <w:t xml:space="preserve">這樣花的 token 跟直接丟 Excel 差不多。</w:t>
-      </w:r>
-    </w:p>
-    <w:p>
-      <w:pPr>
-        <w:pStyle w:val="ListParagraph"/>
-        <w:numPr>
-          <w:ilvl w:val="0"/>
-          <w:numId w:val="4"/>
-        </w:numPr>
-        <w:spacing w:after="80" w:line="300"/>
-      </w:pPr>
-      <w:r>
-        <w:rPr>
-          <w:rFonts w:ascii="Segoe UI" w:cs="Segoe UI" w:eastAsia="Microsoft JhengHei" w:hAnsi="Segoe UI"/>
-          <w:b/>
-          <w:bCs/>
-        </w:rPr>
-        <w:t xml:space="preserve">不要叫 Claude「全部讀完再回答」。</w:t>
-      </w:r>
-      <w:r>
-        <w:rPr>
-          <w:rFonts w:ascii="Segoe UI" w:cs="Segoe UI" w:eastAsia="Microsoft JhengHei" w:hAnsi="Segoe UI"/>
-        </w:rPr>
-        <w:t xml:space="preserve">請它先看索引。</w:t>
-      </w:r>
-    </w:p>
-    <w:p>
-      <w:pPr>
-        <w:pStyle w:val="ListParagraph"/>
-        <w:numPr>
-          <w:ilvl w:val="0"/>
-          <w:numId w:val="4"/>
-        </w:numPr>
-        <w:spacing w:after="80" w:line="300"/>
-      </w:pPr>
-      <w:r>
-        <w:rPr>
-          <w:rFonts w:ascii="Segoe UI" w:cs="Segoe UI" w:eastAsia="Microsoft JhengHei" w:hAnsi="Segoe UI"/>
-          <w:b/>
-          <w:bCs/>
-        </w:rPr>
-        <w:t xml:space="preserve">先給索引，需要時再補檔。</w:t>
-      </w:r>
-      <w:r>
-        <w:rPr>
-          <w:rFonts w:ascii="Segoe UI" w:cs="Segoe UI" w:eastAsia="Microsoft JhengHei" w:hAnsi="Segoe UI"/>
-        </w:rPr>
-        <w:t xml:space="preserve">索引最後的「資料檔」表列出每個檔大約多少 token。</w:t>
-      </w:r>
-    </w:p>
-    <w:p>
-      <w:pPr>
-        <w:pStyle w:val="ListParagraph"/>
-        <w:numPr>
-          <w:ilvl w:val="0"/>
-          <w:numId w:val="4"/>
-        </w:numPr>
-        <w:spacing w:after="80" w:line="300"/>
-      </w:pPr>
-      <w:r>
-        <w:rPr>
-          <w:rFonts w:ascii="Segoe UI" w:cs="Segoe UI" w:eastAsia="Microsoft JhengHei" w:hAnsi="Segoe UI"/>
-          <w:b/>
-          <w:bCs/>
-        </w:rPr>
-        <w:t xml:space="preserve">能篩選就先篩選。</w:t>
-      </w:r>
-      <w:r>
-        <w:rPr>
-          <w:rFonts w:ascii="Segoe UI" w:cs="Segoe UI" w:eastAsia="Microsoft JhengHei" w:hAnsi="Segoe UI"/>
-        </w:rPr>
-        <w:t xml:space="preserve">只轉最新版本、只保留含關鍵字的列。</w:t>
-      </w:r>
-    </w:p>
-    <w:p>
-      <w:pPr>
-        <w:pStyle w:val="ListParagraph"/>
-        <w:numPr>
-          <w:ilvl w:val="0"/>
-          <w:numId w:val="4"/>
-        </w:numPr>
-        <w:spacing w:after="80" w:line="300"/>
-      </w:pPr>
-      <w:r>
-        <w:rPr>
-          <w:rFonts w:ascii="Segoe UI" w:cs="Segoe UI" w:eastAsia="Microsoft JhengHei" w:hAnsi="Segoe UI"/>
-          <w:b/>
-          <w:bCs/>
-        </w:rPr>
-        <w:t xml:space="preserve">換主題就開新對話。</w:t>
-      </w:r>
-      <w:r>
-        <w:rPr>
-          <w:rFonts w:ascii="Segoe UI" w:cs="Segoe UI" w:eastAsia="Microsoft JhengHei" w:hAnsi="Segoe UI"/>
-        </w:rPr>
-        <w:t xml:space="preserve">同一個對話每問一次，前面的檔案都會重新算 token。</w:t>
-      </w:r>
-    </w:p>
-    <w:p>
-      <w:pPr>
-        <w:spacing w:after="80" w:before="200"/>
-      </w:pPr>
-      <w:r>
-        <w:rPr>
-          <w:rFonts w:ascii="Segoe UI" w:cs="Segoe UI" w:eastAsia="Microsoft JhengHei" w:hAnsi="Segoe UI"/>
-          <w:b/>
-          <w:bCs/>
-        </w:rPr>
-        <w:t xml:space="preserve">可以直接貼給 Claude 的開頭</w:t>
-      </w:r>
-    </w:p>
-    <w:p>
-      <w:pPr>
-        <w:pBdr>
-          <w:left w:val="single" w:color="005FB8" w:sz="18" w:space="8"/>
-        </w:pBdr>
-        <w:shd w:fill="F4F7FB" w:color="auto" w:val="clear"/>
-        <w:spacing w:after="0" w:line="300"/>
-        <w:ind w:left="160" w:right="160"/>
-      </w:pPr>
-      <w:r>
-        <w:rPr>
-          <w:rFonts w:ascii="Segoe UI" w:cs="Segoe UI" w:eastAsia="Microsoft JhengHei" w:hAnsi="Segoe UI"/>
-        </w:rPr>
-        <w:t xml:space="preserve">附件是 Excel 轉出的索引（00_索引與邏輯.md）。請先只根據索引回答；索引裡的合計和最大最小值是程式精確算好的，可以直接引用。如果需要明細，請告訴我要上傳哪一個資料檔（檔名和大約 token 數在索引最後），不要猜。</w:t>
-      </w:r>
-    </w:p>
-    <w:p>
-      <w:pPr>
-        <w:pBdr>
-          <w:left w:val="single" w:color="005FB8" w:sz="18" w:space="8"/>
-        </w:pBdr>
-        <w:shd w:fill="F4F7FB" w:color="auto" w:val="clear"/>
-        <w:spacing w:after="0" w:line="300"/>
-        <w:ind w:left="160" w:right="160"/>
-      </w:pPr>
-      <w:r>
-        <w:rPr>
-          <w:rFonts w:ascii="Segoe UI" w:cs="Segoe UI" w:eastAsia="Microsoft JhengHei" w:hAnsi="Segoe UI"/>
-        </w:rPr>
-        <w:t xml:space="preserve">我的問題是：……</w:t>
-      </w:r>
-    </w:p>
-    <w:p>
-      <w:pPr>
-        <w:spacing w:after="120"/>
-      </w:pPr>
+        <w:spacing w:before="120"/>
+      </w:pPr>
+      <w:r>
+        <w:rPr>
+          <w:rFonts w:ascii="Segoe UI" w:cs="Segoe UI" w:eastAsia="Microsoft JhengHei" w:hAnsi="Segoe UI"/>
+        </w:rPr>
+        <w:t xml:space="preserve">同一份檔案，依問題不同，交給 Claude 的量可以從 19.5 萬 token 降到幾千 token。其他種類的檔案也一樣：先給索引，再依問題用關鍵字篩選，或只上傳需要的工作表。</w:t>
+      </w:r>
     </w:p>
     <w:p>
       <w:pPr>
@@ -2430,454 +5324,7 @@
         <w:rPr>
           <w:rFonts w:ascii="Segoe UI" w:cs="Segoe UI" w:eastAsia="Microsoft JhengHei" w:hAnsi="Segoe UI"/>
         </w:rPr>
-        <w:t xml:space="preserve">5. 設定 Claude 專案指示（做一次就好）</w:t>
-      </w:r>
-    </w:p>
-    <w:p>
-      <w:pPr>
-        <w:spacing w:after="120" w:line="300"/>
-      </w:pPr>
-      <w:r>
-        <w:rPr>
-          <w:rFonts w:ascii="Segoe UI" w:cs="Segoe UI" w:eastAsia="Microsoft JhengHei" w:hAnsi="Segoe UI"/>
-        </w:rPr>
-        <w:t xml:space="preserve">如果你常在同一個 Claude 專案（Project）裡處理 Excel，可以把固定指示貼到專案裡。之後在這個專案的每一次對話，Claude 都會先看索引、需要明細時才開口要檔案，也會提醒你用篩選。</w:t>
-      </w:r>
-    </w:p>
-    <w:p>
-      <w:pPr>
-        <w:pStyle w:val="ListParagraph"/>
-        <w:numPr>
-          <w:ilvl w:val="0"/>
-          <w:numId w:val="5"/>
-        </w:numPr>
-        <w:spacing w:after="80" w:line="300"/>
-      </w:pPr>
-      <w:r>
-        <w:rPr>
-          <w:rFonts w:ascii="Segoe UI" w:cs="Segoe UI" w:eastAsia="Microsoft JhengHei" w:hAnsi="Segoe UI"/>
-        </w:rPr>
-        <w:t xml:space="preserve">在面板按「</w:t>
-      </w:r>
-      <w:r>
-        <w:rPr>
-          <w:rFonts w:ascii="Segoe UI" w:cs="Segoe UI" w:eastAsia="Microsoft JhengHei" w:hAnsi="Segoe UI"/>
-          <w:b/>
-          <w:bCs/>
-        </w:rPr>
-        <w:t xml:space="preserve">更多 › 複製 Claude 專案指示</w:t>
-      </w:r>
-      <w:r>
-        <w:rPr>
-          <w:rFonts w:ascii="Segoe UI" w:cs="Segoe UI" w:eastAsia="Microsoft JhengHei" w:hAnsi="Segoe UI"/>
-        </w:rPr>
-        <w:t xml:space="preserve">」。面板底部會顯示「✓ 已複製」。</w:t>
-      </w:r>
-    </w:p>
-    <w:p>
-      <w:pPr>
-        <w:pStyle w:val="ListParagraph"/>
-        <w:numPr>
-          <w:ilvl w:val="0"/>
-          <w:numId w:val="5"/>
-        </w:numPr>
-        <w:spacing w:after="80" w:line="300"/>
-      </w:pPr>
-      <w:r>
-        <w:rPr>
-          <w:rFonts w:ascii="Segoe UI" w:cs="Segoe UI" w:eastAsia="Microsoft JhengHei" w:hAnsi="Segoe UI"/>
-        </w:rPr>
-        <w:t xml:space="preserve">在 Claude 建立一個專案（或打開現有的專案）。</w:t>
-      </w:r>
-    </w:p>
-    <w:p>
-      <w:pPr>
-        <w:pStyle w:val="ListParagraph"/>
-        <w:numPr>
-          <w:ilvl w:val="0"/>
-          <w:numId w:val="5"/>
-        </w:numPr>
-        <w:spacing w:after="80" w:line="300"/>
-      </w:pPr>
-      <w:r>
-        <w:rPr>
-          <w:rFonts w:ascii="Segoe UI" w:cs="Segoe UI" w:eastAsia="Microsoft JhengHei" w:hAnsi="Segoe UI"/>
-        </w:rPr>
-        <w:t xml:space="preserve">打開專案的「指示」（Instructions）設定，貼上剛剛複製的內容，儲存。</w:t>
-      </w:r>
-    </w:p>
-    <w:p>
-      <w:pPr>
-        <w:pStyle w:val="ListParagraph"/>
-        <w:numPr>
-          <w:ilvl w:val="0"/>
-          <w:numId w:val="5"/>
-        </w:numPr>
-        <w:spacing w:after="80" w:line="300"/>
-      </w:pPr>
-      <w:r>
-        <w:rPr>
-          <w:rFonts w:ascii="Segoe UI" w:cs="Segoe UI" w:eastAsia="Microsoft JhengHei" w:hAnsi="Segoe UI"/>
-        </w:rPr>
-        <w:t xml:space="preserve">之後在這個專案裡開對話，上傳索引卡片即可。</w:t>
-      </w:r>
-    </w:p>
-    <w:p>
-      <w:pPr>
-        <w:spacing w:after="80" w:before="160"/>
-      </w:pPr>
-      <w:r>
-        <w:rPr>
-          <w:rFonts w:ascii="Segoe UI" w:cs="Segoe UI" w:eastAsia="Microsoft JhengHei" w:hAnsi="Segoe UI"/>
-          <w:b/>
-          <w:bCs/>
-        </w:rPr>
-        <w:t xml:space="preserve">複製出來的指示內容如下：</w:t>
-      </w:r>
-    </w:p>
-    <w:p>
-      <w:pPr>
-        <w:pBdr>
-          <w:left w:val="single" w:color="005FB8" w:sz="18" w:space="8"/>
-        </w:pBdr>
-        <w:shd w:fill="F4F7FB" w:color="auto" w:val="clear"/>
-        <w:spacing w:after="0" w:line="300"/>
-        <w:ind w:left="160" w:right="160"/>
-      </w:pPr>
-      <w:r>
-        <w:rPr>
-          <w:rFonts w:ascii="Segoe UI" w:cs="Segoe UI" w:eastAsia="Microsoft JhengHei" w:hAnsi="Segoe UI"/>
-        </w:rPr>
-        <w:t xml:space="preserve">我會上傳用「MarkItDown 轉換器」從 Excel 轉出的檔案。請照這個方式處理：</w:t>
-      </w:r>
-    </w:p>
-    <w:p>
-      <w:pPr>
-        <w:pBdr>
-          <w:left w:val="single" w:color="005FB8" w:sz="18" w:space="8"/>
-        </w:pBdr>
-        <w:shd w:fill="F4F7FB" w:color="auto" w:val="clear"/>
-        <w:spacing w:after="0" w:line="300"/>
-        <w:ind w:left="160" w:right="160"/>
-      </w:pPr>
-      <w:r>
-        <w:rPr>
-          <w:rFonts w:ascii="Segoe UI" w:cs="Segoe UI" w:eastAsia="Microsoft JhengHei" w:hAnsi="Segoe UI"/>
-        </w:rPr>
-        <w:t xml:space="preserve">1. 先只讀「00_索引與邏輯.md」。它列出每張工作表、每一欄的類型，以及程式精確算好的合計、最大值、最小值和公式邏輯；這些數字可以直接引用，不要自己加總大量數字。</w:t>
-      </w:r>
-    </w:p>
-    <w:p>
-      <w:pPr>
-        <w:pBdr>
-          <w:left w:val="single" w:color="005FB8" w:sz="18" w:space="8"/>
-        </w:pBdr>
-        <w:shd w:fill="F4F7FB" w:color="auto" w:val="clear"/>
-        <w:spacing w:after="0" w:line="300"/>
-        <w:ind w:left="160" w:right="160"/>
-      </w:pPr>
-      <w:r>
-        <w:rPr>
-          <w:rFonts w:ascii="Segoe UI" w:cs="Segoe UI" w:eastAsia="Microsoft JhengHei" w:hAnsi="Segoe UI"/>
-        </w:rPr>
-        <w:t xml:space="preserve">2. 能用索引回答就直接回答。需要明細時，告訴我要上傳哪一個資料檔（檔名和大約 token 數在索引最後的「資料檔」表），一次只要需要的那幾個，不要要求整包。</w:t>
-      </w:r>
-    </w:p>
-    <w:p>
-      <w:pPr>
-        <w:pBdr>
-          <w:left w:val="single" w:color="005FB8" w:sz="18" w:space="8"/>
-        </w:pBdr>
-        <w:shd w:fill="F4F7FB" w:color="auto" w:val="clear"/>
-        <w:spacing w:after="0" w:line="300"/>
-        <w:ind w:left="160" w:right="160"/>
-      </w:pPr>
-      <w:r>
-        <w:rPr>
-          <w:rFonts w:ascii="Segoe UI" w:cs="Segoe UI" w:eastAsia="Microsoft JhengHei" w:hAnsi="Segoe UI"/>
-        </w:rPr>
-        <w:t xml:space="preserve">3. 問題只跟某個料號、客戶，或只跟最新的預測版本有關時，提醒我用轉換器的關鍵字篩選或「只轉最新一版」重新轉一次，檔案會小很多。</w:t>
-      </w:r>
-    </w:p>
-    <w:p>
-      <w:pPr>
-        <w:pBdr>
-          <w:left w:val="single" w:color="005FB8" w:sz="18" w:space="8"/>
-        </w:pBdr>
-        <w:shd w:fill="F4F7FB" w:color="auto" w:val="clear"/>
-        <w:spacing w:after="0" w:line="300"/>
-        <w:ind w:left="160" w:right="160"/>
-      </w:pPr>
-      <w:r>
-        <w:rPr>
-          <w:rFonts w:ascii="Segoe UI" w:cs="Segoe UI" w:eastAsia="Microsoft JhengHei" w:hAnsi="Segoe UI"/>
-        </w:rPr>
-        <w:t xml:space="preserve">4. 資料是 Tab 分隔，第一欄是 Excel 列號（後面有 h 表示該列在 Excel 中隱藏），數值是完整精度。引用數字時請註明工作表和儲存格位置（例如 Summary!F12）。</w:t>
-      </w:r>
-    </w:p>
-    <w:p>
-      <w:pPr>
-        <w:spacing w:after="120"/>
-      </w:pPr>
-    </w:p>
-    <w:p>
-      <w:pPr>
-        <w:pStyle w:val="Heading1"/>
-        <w:spacing w:after="160" w:before="360"/>
-      </w:pPr>
-      <w:r>
-        <w:rPr>
-          <w:rFonts w:ascii="Segoe UI" w:cs="Segoe UI" w:eastAsia="Microsoft JhengHei" w:hAnsi="Segoe UI"/>
-        </w:rPr>
-        <w:t xml:space="preserve">6. 看懂轉出來的檔案</w:t>
-      </w:r>
-    </w:p>
-    <w:p>
-      <w:pPr>
-        <w:pStyle w:val="Heading2"/>
-        <w:spacing w:after="120" w:before="240"/>
-      </w:pPr>
-      <w:r>
-        <w:rPr>
-          <w:rFonts w:ascii="Segoe UI" w:cs="Segoe UI" w:eastAsia="Microsoft JhengHei" w:hAnsi="Segoe UI"/>
-        </w:rPr>
-        <w:t xml:space="preserve">6.1 檔案放在哪裡</w:t>
-      </w:r>
-    </w:p>
-    <w:p>
-      <w:pPr>
-        <w:pStyle w:val="ListParagraph"/>
-        <w:numPr>
-          <w:ilvl w:val="0"/>
-          <w:numId w:val="2"/>
-        </w:numPr>
-        <w:spacing w:after="80" w:line="300"/>
-      </w:pPr>
-      <w:r>
-        <w:rPr>
-          <w:rFonts w:ascii="Segoe UI" w:cs="Segoe UI" w:eastAsia="Microsoft JhengHei" w:hAnsi="Segoe UI"/>
-          <w:b/>
-          <w:bCs/>
-        </w:rPr>
-        <w:t xml:space="preserve">小檔案</w:t>
-      </w:r>
-      <w:r>
-        <w:rPr>
-          <w:rFonts w:ascii="Segoe UI" w:cs="Segoe UI" w:eastAsia="Microsoft JhengHei" w:hAnsi="Segoe UI"/>
-        </w:rPr>
-        <w:t xml:space="preserve">：在原始檔旁邊產生一個同名的 .md。</w:t>
-      </w:r>
-    </w:p>
-    <w:p>
-      <w:pPr>
-        <w:pStyle w:val="ListParagraph"/>
-        <w:numPr>
-          <w:ilvl w:val="0"/>
-          <w:numId w:val="2"/>
-        </w:numPr>
-        <w:spacing w:after="80" w:line="300"/>
-      </w:pPr>
-      <w:r>
-        <w:rPr>
-          <w:rFonts w:ascii="Segoe UI" w:cs="Segoe UI" w:eastAsia="Microsoft JhengHei" w:hAnsi="Segoe UI"/>
-          <w:b/>
-          <w:bCs/>
-        </w:rPr>
-        <w:t xml:space="preserve">大檔案</w:t>
-      </w:r>
-      <w:r>
-        <w:rPr>
-          <w:rFonts w:ascii="Segoe UI" w:cs="Segoe UI" w:eastAsia="Microsoft JhengHei" w:hAnsi="Segoe UI"/>
-        </w:rPr>
-        <w:t xml:space="preserve">：在原始檔旁邊產生資料夾「&lt;檔名&gt;_md」，裡面有 00_索引與邏輯.md 和 01_、02_… 開頭的資料檔；太大的工作表會再分成「_第1部分」、「_第2部分」。</w:t>
-      </w:r>
-    </w:p>
-    <w:p>
-      <w:pPr>
-        <w:pStyle w:val="ListParagraph"/>
-        <w:numPr>
-          <w:ilvl w:val="0"/>
-          <w:numId w:val="2"/>
-        </w:numPr>
-        <w:spacing w:after="80" w:line="300"/>
-      </w:pPr>
-      <w:r>
-        <w:rPr>
-          <w:rFonts w:ascii="Segoe UI" w:cs="Segoe UI" w:eastAsia="Microsoft JhengHei" w:hAnsi="Segoe UI"/>
-          <w:b/>
-          <w:bCs/>
-        </w:rPr>
-        <w:t xml:space="preserve">篩選出來的小檔</w:t>
-      </w:r>
-      <w:r>
-        <w:rPr>
-          <w:rFonts w:ascii="Segoe UI" w:cs="Segoe UI" w:eastAsia="Microsoft JhengHei" w:hAnsi="Segoe UI"/>
-        </w:rPr>
-        <w:t xml:space="preserve">：檔名後面加「_最新1版」等，不會覆蓋完整版。</w:t>
-      </w:r>
-    </w:p>
-    <w:p>
-      <w:pPr>
-        <w:pStyle w:val="ListParagraph"/>
-        <w:numPr>
-          <w:ilvl w:val="0"/>
-          <w:numId w:val="2"/>
-        </w:numPr>
-        <w:spacing w:after="80" w:line="300"/>
-      </w:pPr>
-      <w:r>
-        <w:rPr>
-          <w:rFonts w:ascii="Segoe UI" w:cs="Segoe UI" w:eastAsia="Microsoft JhengHei" w:hAnsi="Segoe UI"/>
-        </w:rPr>
-        <w:t xml:space="preserve">重新轉換同一個檔案時會更新原本的輸出；舊的分割檔會自動清掉，資料夾裡你自己放的其他檔案不會被動到。</w:t>
-      </w:r>
-    </w:p>
-    <w:p>
-      <w:pPr>
-        <w:pStyle w:val="Heading2"/>
-        <w:spacing w:after="120" w:before="240"/>
-      </w:pPr>
-      <w:r>
-        <w:rPr>
-          <w:rFonts w:ascii="Segoe UI" w:cs="Segoe UI" w:eastAsia="Microsoft JhengHei" w:hAnsi="Segoe UI"/>
-        </w:rPr>
-        <w:t xml:space="preserve">6.2 索引裡有什麼</w:t>
-      </w:r>
-    </w:p>
-    <w:p>
-      <w:pPr>
-        <w:pStyle w:val="ListParagraph"/>
-        <w:numPr>
-          <w:ilvl w:val="0"/>
-          <w:numId w:val="2"/>
-        </w:numPr>
-        <w:spacing w:after="80" w:line="300"/>
-      </w:pPr>
-      <w:r>
-        <w:rPr>
-          <w:rFonts w:ascii="Segoe UI" w:cs="Segoe UI" w:eastAsia="Microsoft JhengHei" w:hAnsi="Segoe UI"/>
-        </w:rPr>
-        <w:t xml:space="preserve">每張工作表的狀態（顯示／隱藏）、列數、欄數、表頭在第幾列、公式數量、資料大約多少 token。</w:t>
-      </w:r>
-    </w:p>
-    <w:p>
-      <w:pPr>
-        <w:pStyle w:val="ListParagraph"/>
-        <w:numPr>
-          <w:ilvl w:val="0"/>
-          <w:numId w:val="2"/>
-        </w:numPr>
-        <w:spacing w:after="80" w:line="300"/>
-      </w:pPr>
-      <w:r>
-        <w:rPr>
-          <w:rFonts w:ascii="Segoe UI" w:cs="Segoe UI" w:eastAsia="Microsoft JhengHei" w:hAnsi="Segoe UI"/>
-        </w:rPr>
-        <w:t xml:space="preserve">每一欄的名稱、類型、非空格數，以及程式算好的最小值、最大值、合計。有「分類欄」（例如 Demand／ETD／Balance）時，合計會依分類分開算。</w:t>
-      </w:r>
-    </w:p>
-    <w:p>
-      <w:pPr>
-        <w:pStyle w:val="ListParagraph"/>
-        <w:numPr>
-          <w:ilvl w:val="0"/>
-          <w:numId w:val="2"/>
-        </w:numPr>
-        <w:spacing w:after="80" w:line="300"/>
-      </w:pPr>
-      <w:r>
-        <w:rPr>
-          <w:rFonts w:ascii="Segoe UI" w:cs="Segoe UI" w:eastAsia="Microsoft JhengHei" w:hAnsi="Segoe UI"/>
-        </w:rPr>
-        <w:t xml:space="preserve">每一欄的公式寫法、工作表之間的資料流向、自動篩選、隱藏的列和欄、資料驗證、樞紐分析表、版本欄。</w:t>
-      </w:r>
-    </w:p>
-    <w:p>
-      <w:pPr>
-        <w:pStyle w:val="ListParagraph"/>
-        <w:numPr>
-          <w:ilvl w:val="0"/>
-          <w:numId w:val="2"/>
-        </w:numPr>
-        <w:spacing w:after="80" w:line="300"/>
-      </w:pPr>
-      <w:r>
-        <w:rPr>
-          <w:rFonts w:ascii="Segoe UI" w:cs="Segoe UI" w:eastAsia="Microsoft JhengHei" w:hAnsi="Segoe UI"/>
-        </w:rPr>
-        <w:t xml:space="preserve">最後的「資料檔」表：每個資料檔的檔名和大約 token 數。</w:t>
-      </w:r>
-    </w:p>
-    <w:p>
-      <w:pPr>
-        <w:pStyle w:val="Heading2"/>
-        <w:spacing w:after="120" w:before="240"/>
-      </w:pPr>
-      <w:r>
-        <w:rPr>
-          <w:rFonts w:ascii="Segoe UI" w:cs="Segoe UI" w:eastAsia="Microsoft JhengHei" w:hAnsi="Segoe UI"/>
-        </w:rPr>
-        <w:t xml:space="preserve">6.3 資料檔的格式</w:t>
-      </w:r>
-    </w:p>
-    <w:p>
-      <w:pPr>
-        <w:pStyle w:val="ListParagraph"/>
-        <w:numPr>
-          <w:ilvl w:val="0"/>
-          <w:numId w:val="2"/>
-        </w:numPr>
-        <w:spacing w:after="80" w:line="300"/>
-      </w:pPr>
-      <w:r>
-        <w:rPr>
-          <w:rFonts w:ascii="Segoe UI" w:cs="Segoe UI" w:eastAsia="Microsoft JhengHei" w:hAnsi="Segoe UI"/>
-        </w:rPr>
-        <w:t xml:space="preserve">Tab 分隔。第一行是 Excel 欄字母，之後每一行的第一欄是 Excel 列號；列號後面有 h 表示該列在 Excel 中是隱藏的（常見原因是被篩選掉）。</w:t>
-      </w:r>
-    </w:p>
-    <w:p>
-      <w:pPr>
-        <w:pStyle w:val="ListParagraph"/>
-        <w:numPr>
-          <w:ilvl w:val="0"/>
-          <w:numId w:val="2"/>
-        </w:numPr>
-        <w:spacing w:after="80" w:line="300"/>
-      </w:pPr>
-      <w:r>
-        <w:rPr>
-          <w:rFonts w:ascii="Segoe UI" w:cs="Segoe UI" w:eastAsia="Microsoft JhengHei" w:hAnsi="Segoe UI"/>
-        </w:rPr>
-        <w:t xml:space="preserve">數值是完整精度，沒有千分位；百分比用小數表示（0.25 = 25%）；日期寫成 YYYY-MM-DD，格式藏住的時間也會寫出來。</w:t>
-      </w:r>
-    </w:p>
-    <w:p>
-      <w:pPr>
-        <w:pStyle w:val="ListParagraph"/>
-        <w:numPr>
-          <w:ilvl w:val="0"/>
-          <w:numId w:val="2"/>
-        </w:numPr>
-        <w:spacing w:after="80" w:line="300"/>
-      </w:pPr>
-      <w:r>
-        <w:rPr>
-          <w:rFonts w:ascii="Segoe UI" w:cs="Segoe UI" w:eastAsia="Microsoft JhengHei" w:hAnsi="Segoe UI"/>
-        </w:rPr>
-        <w:t xml:space="preserve">儲存格的註解附在該工作表資料的最後面。</w:t>
-      </w:r>
-    </w:p>
-    <w:p>
-      <w:pPr>
-        <w:pStyle w:val="Heading1"/>
-        <w:spacing w:after="160" w:before="360"/>
-      </w:pPr>
-      <w:r>
-        <w:rPr>
-          <w:rFonts w:ascii="Segoe UI" w:cs="Segoe UI" w:eastAsia="Microsoft JhengHei" w:hAnsi="Segoe UI"/>
-        </w:rPr>
-        <w:t xml:space="preserve">7. 主視窗與選項</w:t>
+        <w:t xml:space="preserve">8. 主視窗與選項</w:t>
       </w:r>
     </w:p>
     <w:p>
@@ -3646,7 +6093,7 @@
         <w:rPr>
           <w:rFonts w:ascii="Segoe UI" w:cs="Segoe UI" w:eastAsia="Microsoft JhengHei" w:hAnsi="Segoe UI"/>
         </w:rPr>
-        <w:t xml:space="preserve">8. 常見問題</w:t>
+        <w:t xml:space="preserve">9. 常見問題</w:t>
       </w:r>
     </w:p>
     <w:p>
@@ -3858,7 +6305,7 @@
         <w:rPr>
           <w:rFonts w:ascii="Segoe UI" w:cs="Segoe UI" w:eastAsia="Microsoft JhengHei" w:hAnsi="Segoe UI"/>
         </w:rPr>
-        <w:t xml:space="preserve">9. 進階：命令列</w:t>
+        <w:t xml:space="preserve">10. 進階：命令列</w:t>
       </w:r>
     </w:p>
     <w:p>
@@ -4091,7 +6538,7 @@
                 <w:sz w:val="20"/>
                 <w:szCs w:val="20"/>
               </w:rPr>
-              <w:t xml:space="preserve">只保留最新一版（預測瀑布表）</w:t>
+              <w:t xml:space="preserve">只保留最新一版（有版本欄的檔案）</w:t>
             </w:r>
           </w:p>
         </w:tc>
@@ -4632,6 +7079,18 @@
       </w:pPr>
     </w:lvl>
   </w:abstractNum>
+  <w:abstractNum w:abstractNumId="6" w15:restartNumberingAfterBreak="0">
+    <w:multiLevelType w:val="hybridMultilevel"/>
+    <w:lvl w:ilvl="0" w15:tentative="1">
+      <w:start w:val="1"/>
+      <w:numFmt w:val="decimal"/>
+      <w:lvlText w:val="%1."/>
+      <w:lvlJc w:val="left"/>
+      <w:pPr>
+        <w:ind w:left="480" w:hanging="360"/>
+      </w:pPr>
+    </w:lvl>
+  </w:abstractNum>
   <w:num w:numId="1">
     <w:abstractNumId w:val="1"/>
     <w:lvlOverride w:ilvl="0">
@@ -4658,6 +7117,12 @@
   </w:num>
   <w:num w:numId="5">
     <w:abstractNumId w:val="5"/>
+    <w:lvlOverride w:ilvl="0">
+      <w:startOverride w:val="1"/>
+    </w:lvlOverride>
+  </w:num>
+  <w:num w:numId="6">
+    <w:abstractNumId w:val="6"/>
     <w:lvlOverride w:ilvl="0">
       <w:startOverride w:val="1"/>
     </w:lvlOverride>

</xml_diff>

<commit_message>
Add an English user guide; share layout between languages
docs/manual/build.js now only lays the guide out; the text lives in
content.zh.js and content.en.js (`node build.js zh|en ...`). The refactor
reproduces the Chinese guide exactly (same paragraphs, tables and
images). The English guide quotes the app's Chinese labels with English
translations, shows the Claude Project instructions in Chinese (what the
panel copies) and in English. FAQ questions now stay on the same page as
their answers. Both guides ship with each release.

Co-Authored-By: Claude Opus 5.5 <noreply@anthropic.com>
Claude-Session: https://claude.ai/code/session_01KhQt6DAWzFQD8wwDFofesM
</commit_message>
<xml_diff>
--- a/docs/MarkItDown-Guide-zh-TW.docx
+++ b/docs/MarkItDown-Guide-zh-TW.docx
@@ -6098,6 +6098,7 @@
     </w:p>
     <w:p>
       <w:pPr>
+        <w:keepNext/>
         <w:spacing w:after="40" w:before="160"/>
       </w:pPr>
       <w:r>
@@ -6123,6 +6124,7 @@
     </w:p>
     <w:p>
       <w:pPr>
+        <w:keepNext/>
         <w:spacing w:after="40" w:before="160"/>
       </w:pPr>
       <w:r>
@@ -6148,6 +6150,7 @@
     </w:p>
     <w:p>
       <w:pPr>
+        <w:keepNext/>
         <w:spacing w:after="40" w:before="160"/>
       </w:pPr>
       <w:r>
@@ -6173,6 +6176,7 @@
     </w:p>
     <w:p>
       <w:pPr>
+        <w:keepNext/>
         <w:spacing w:after="40" w:before="160"/>
       </w:pPr>
       <w:r>
@@ -6198,6 +6202,7 @@
     </w:p>
     <w:p>
       <w:pPr>
+        <w:keepNext/>
         <w:spacing w:after="40" w:before="160"/>
       </w:pPr>
       <w:r>
@@ -6223,6 +6228,7 @@
     </w:p>
     <w:p>
       <w:pPr>
+        <w:keepNext/>
         <w:spacing w:after="40" w:before="160"/>
       </w:pPr>
       <w:r>
@@ -6248,6 +6254,7 @@
     </w:p>
     <w:p>
       <w:pPr>
+        <w:keepNext/>
         <w:spacing w:after="40" w:before="160"/>
       </w:pPr>
       <w:r>
@@ -6273,6 +6280,7 @@
     </w:p>
     <w:p>
       <w:pPr>
+        <w:keepNext/>
         <w:spacing w:after="40" w:before="160"/>
       </w:pPr>
       <w:r>

</xml_diff>